<commit_message>
Añadidas las pruebas de interfaz de los casos 00 y 01 de Ver detalles de estacion, modificado plan de pruebas
</commit_message>
<xml_diff>
--- a/Docs/Test Plans/US532236-VerDetallesDeEstacion-TestPlan.docx
+++ b/Docs/Test Plans/US532236-VerDetallesDeEstacion-TestPlan.docx
@@ -1922,6 +1922,42 @@
           <w:bCs/>
           <w:u w:val="single"/>
         </w:rPr>
+        <w:t>RESULTADOS DE LAS PRUEBAS</w:t>
+      </w:r>
+    </w:p>
+    <w:p>
+      <w:pPr>
+        <w:spacing w:after="120"/>
+        <w:jc w:val="both"/>
+      </w:pPr>
+      <w:r>
+        <w:t xml:space="preserve">Los resultados de las pruebas de integración nos han dado a conocer que había un error en los tipos de datos, los tipos de datos que teníamos no aceptaban nulos al ser primitivos por ello debimos de cambiar aquellos tipos de datos como los </w:t>
+      </w:r>
+      <w:proofErr w:type="spellStart"/>
+      <w:r>
+        <w:t>double</w:t>
+      </w:r>
+      <w:proofErr w:type="spellEnd"/>
+      <w:r>
+        <w:t xml:space="preserve"> a Double para que pudiesen aceptar nulos.</w:t>
+      </w:r>
+    </w:p>
+    <w:p>
+      <w:pPr>
+        <w:spacing w:after="120"/>
+        <w:jc w:val="both"/>
+        <w:rPr>
+          <w:b/>
+          <w:bCs/>
+          <w:u w:val="single"/>
+        </w:rPr>
+      </w:pPr>
+      <w:r>
+        <w:rPr>
+          <w:b/>
+          <w:bCs/>
+          <w:u w:val="single"/>
+        </w:rPr>
         <w:t xml:space="preserve">ANEXO: </w:t>
       </w:r>
       <w:r>
@@ -2432,6 +2468,7 @@
           <w:b/>
           <w:bCs/>
         </w:rPr>
+        <w:lastRenderedPageBreak/>
         <w:t>CE12 (Inválida - Anómala negativa):</w:t>
       </w:r>
       <w:r>
@@ -2518,7 +2555,6 @@
           <w:b/>
           <w:bCs/>
         </w:rPr>
-        <w:lastRenderedPageBreak/>
         <w:t>CE14 (Válida):</w:t>
       </w:r>
       <w:r>
@@ -6754,6 +6790,7 @@
   <w:style w:type="character" w:default="1" w:styleId="Fuentedeprrafopredeter">
     <w:name w:val="Default Paragraph Font"/>
     <w:uiPriority w:val="1"/>
+    <w:semiHidden/>
     <w:unhideWhenUsed/>
   </w:style>
   <w:style w:type="table" w:default="1" w:styleId="Tablanormal">
@@ -7402,10 +7439,23 @@
 </file>
 
 <file path=customXml/item1.xml><?xml version="1.0" encoding="utf-8"?>
-<b:Sources xmlns:b="http://schemas.openxmlformats.org/officeDocument/2006/bibliography" xmlns="http://schemas.openxmlformats.org/officeDocument/2006/bibliography" SelectedStyle="\APA.XSL" StyleName="APA"/>
+<p:properties xmlns:p="http://schemas.microsoft.com/office/2006/metadata/properties" xmlns:xsi="http://www.w3.org/2001/XMLSchema-instance" xmlns:pc="http://schemas.microsoft.com/office/infopath/2007/PartnerControls">
+  <documentManagement>
+    <_activity xmlns="30c7f0a5-0460-48b3-ae5a-8da933a9cabc" xsi:nil="true"/>
+  </documentManagement>
+</p:properties>
 </file>
 
 <file path=customXml/item2.xml><?xml version="1.0" encoding="utf-8"?>
+<?mso-contentType ?>
+<FormTemplates xmlns="http://schemas.microsoft.com/sharepoint/v3/contenttype/forms">
+  <Display>DocumentLibraryForm</Display>
+  <Edit>DocumentLibraryForm</Edit>
+  <New>DocumentLibraryForm</New>
+</FormTemplates>
+</file>
+
+<file path=customXml/item3.xml><?xml version="1.0" encoding="utf-8"?>
 <ct:contentTypeSchema xmlns:ct="http://schemas.microsoft.com/office/2006/metadata/contentType" xmlns:ma="http://schemas.microsoft.com/office/2006/metadata/properties/metaAttributes" ct:_="" ma:_="" ma:contentTypeName="Documento" ma:contentTypeID="0x0101008A2DA2A88A7CD04691DDBB156CC2F629" ma:contentTypeVersion="14" ma:contentTypeDescription="Crear nuevo documento." ma:contentTypeScope="" ma:versionID="fa623cfde9ee52739a10639550e20630">
   <xsd:schema xmlns:xsd="http://www.w3.org/2001/XMLSchema" xmlns:xs="http://www.w3.org/2001/XMLSchema" xmlns:p="http://schemas.microsoft.com/office/2006/metadata/properties" xmlns:ns3="30c7f0a5-0460-48b3-ae5a-8da933a9cabc" xmlns:ns4="39664786-3c2d-494e-ba5d-eb5dc194af34" targetNamespace="http://schemas.microsoft.com/office/2006/metadata/properties" ma:root="true" ma:fieldsID="c8c51738a68246b2391ceec60ea14cb1" ns3:_="" ns4:_="">
     <xsd:import namespace="30c7f0a5-0460-48b3-ae5a-8da933a9cabc"/>
@@ -7632,32 +7682,29 @@
 </ct:contentTypeSchema>
 </file>
 
-<file path=customXml/item3.xml><?xml version="1.0" encoding="utf-8"?>
-<?mso-contentType ?>
-<FormTemplates xmlns="http://schemas.microsoft.com/sharepoint/v3/contenttype/forms">
-  <Display>DocumentLibraryForm</Display>
-  <Edit>DocumentLibraryForm</Edit>
-  <New>DocumentLibraryForm</New>
-</FormTemplates>
-</file>
-
 <file path=customXml/item4.xml><?xml version="1.0" encoding="utf-8"?>
-<p:properties xmlns:p="http://schemas.microsoft.com/office/2006/metadata/properties" xmlns:xsi="http://www.w3.org/2001/XMLSchema-instance" xmlns:pc="http://schemas.microsoft.com/office/infopath/2007/PartnerControls">
-  <documentManagement>
-    <_activity xmlns="30c7f0a5-0460-48b3-ae5a-8da933a9cabc" xsi:nil="true"/>
-  </documentManagement>
-</p:properties>
+<b:Sources xmlns:b="http://schemas.openxmlformats.org/officeDocument/2006/bibliography" xmlns="http://schemas.openxmlformats.org/officeDocument/2006/bibliography" SelectedStyle="\APA.XSL" StyleName="APA"/>
 </file>
 
 <file path=customXml/itemProps1.xml><?xml version="1.0" encoding="utf-8"?>
-<ds:datastoreItem xmlns:ds="http://schemas.openxmlformats.org/officeDocument/2006/customXml" ds:itemID="{77A3A6AA-CDB9-49FB-87E4-79E2EC2B1332}">
+<ds:datastoreItem xmlns:ds="http://schemas.openxmlformats.org/officeDocument/2006/customXml" ds:itemID="{0AEF3F1B-7B5E-4948-945B-936A86A38E7B}">
   <ds:schemaRefs>
-    <ds:schemaRef ds:uri="http://schemas.openxmlformats.org/officeDocument/2006/bibliography"/>
+    <ds:schemaRef ds:uri="http://schemas.microsoft.com/office/2006/metadata/properties"/>
+    <ds:schemaRef ds:uri="http://schemas.microsoft.com/office/infopath/2007/PartnerControls"/>
+    <ds:schemaRef ds:uri="30c7f0a5-0460-48b3-ae5a-8da933a9cabc"/>
   </ds:schemaRefs>
 </ds:datastoreItem>
 </file>
 
 <file path=customXml/itemProps2.xml><?xml version="1.0" encoding="utf-8"?>
+<ds:datastoreItem xmlns:ds="http://schemas.openxmlformats.org/officeDocument/2006/customXml" ds:itemID="{695A9024-BD60-4F4D-91DC-4B272A3D739F}">
+  <ds:schemaRefs>
+    <ds:schemaRef ds:uri="http://schemas.microsoft.com/sharepoint/v3/contenttype/forms"/>
+  </ds:schemaRefs>
+</ds:datastoreItem>
+</file>
+
+<file path=customXml/itemProps3.xml><?xml version="1.0" encoding="utf-8"?>
 <ds:datastoreItem xmlns:ds="http://schemas.openxmlformats.org/officeDocument/2006/customXml" ds:itemID="{21CE6CD8-F626-4B53-A0C7-27C8F699CD0D}">
   <ds:schemaRefs>
     <ds:schemaRef ds:uri="http://schemas.microsoft.com/office/2006/metadata/contentType"/>
@@ -7676,20 +7723,10 @@
 </ds:datastoreItem>
 </file>
 
-<file path=customXml/itemProps3.xml><?xml version="1.0" encoding="utf-8"?>
-<ds:datastoreItem xmlns:ds="http://schemas.openxmlformats.org/officeDocument/2006/customXml" ds:itemID="{695A9024-BD60-4F4D-91DC-4B272A3D739F}">
+<file path=customXml/itemProps4.xml><?xml version="1.0" encoding="utf-8"?>
+<ds:datastoreItem xmlns:ds="http://schemas.openxmlformats.org/officeDocument/2006/customXml" ds:itemID="{77A3A6AA-CDB9-49FB-87E4-79E2EC2B1332}">
   <ds:schemaRefs>
-    <ds:schemaRef ds:uri="http://schemas.microsoft.com/sharepoint/v3/contenttype/forms"/>
-  </ds:schemaRefs>
-</ds:datastoreItem>
-</file>
-
-<file path=customXml/itemProps4.xml><?xml version="1.0" encoding="utf-8"?>
-<ds:datastoreItem xmlns:ds="http://schemas.openxmlformats.org/officeDocument/2006/customXml" ds:itemID="{0AEF3F1B-7B5E-4948-945B-936A86A38E7B}">
-  <ds:schemaRefs>
-    <ds:schemaRef ds:uri="http://schemas.microsoft.com/office/2006/metadata/properties"/>
-    <ds:schemaRef ds:uri="http://schemas.microsoft.com/office/infopath/2007/PartnerControls"/>
-    <ds:schemaRef ds:uri="30c7f0a5-0460-48b3-ae5a-8da933a9cabc"/>
+    <ds:schemaRef ds:uri="http://schemas.openxmlformats.org/officeDocument/2006/bibliography"/>
   </ds:schemaRefs>
 </ds:datastoreItem>
 </file>
</xml_diff>

<commit_message>
Modificado plan de pruebas
</commit_message>
<xml_diff>
--- a/Docs/Test Plans/US532236-VerDetallesDeEstacion-TestPlan.docx
+++ b/Docs/Test Plans/US532236-VerDetallesDeEstacion-TestPlan.docx
@@ -870,7 +870,19 @@
         <w:jc w:val="both"/>
       </w:pPr>
       <w:r>
-        <w:t>Latitud y longitud con “-, -”</w:t>
+        <w:t>Latitud y longitud con “</w:t>
+      </w:r>
+      <w:r>
+        <w:t>40.38091762</w:t>
+      </w:r>
+      <w:r>
+        <w:t xml:space="preserve">, </w:t>
+      </w:r>
+      <w:r>
+        <w:t>-3.72783615</w:t>
+      </w:r>
+      <w:r>
+        <w:t>”</w:t>
       </w:r>
     </w:p>
     <w:p>
@@ -969,15 +981,7 @@
         <w:jc w:val="both"/>
       </w:pPr>
       <w:r>
-        <w:t xml:space="preserve">El técnico selecciona la estación "377 - Metro Abrantes" de la lista de estaciones de la red </w:t>
-      </w:r>
-      <w:proofErr w:type="spellStart"/>
-      <w:r>
-        <w:t>BiciMAD</w:t>
-      </w:r>
-      <w:proofErr w:type="spellEnd"/>
-      <w:r>
-        <w:t xml:space="preserve"> </w:t>
+        <w:t xml:space="preserve">El técnico selecciona la estación "377 - Metro Abrantes" de la lista de estaciones de la red BiciMAD </w:t>
       </w:r>
       <w:r>
         <w:t>teniendo datos anómalos</w:t>
@@ -1042,7 +1046,7 @@
         <w:t>El nombre es “</w:t>
       </w:r>
       <w:r>
-        <w:t>377 - Metro Abrantes</w:t>
+        <w:t>390 - Estacion datos ausentes</w:t>
       </w:r>
       <w:r>
         <w:t>”</w:t>
@@ -1323,21 +1327,12 @@
         </w:rPr>
         <w:t xml:space="preserve">1. </w:t>
       </w:r>
-      <w:proofErr w:type="spellStart"/>
       <w:r>
         <w:rPr>
           <w:b/>
           <w:bCs/>
         </w:rPr>
-        <w:t>onCreate</w:t>
-      </w:r>
-      <w:proofErr w:type="spellEnd"/>
-      <w:r>
-        <w:rPr>
-          <w:b/>
-          <w:bCs/>
-        </w:rPr>
-        <w:t>():</w:t>
+        <w:t>onCreate():</w:t>
       </w:r>
       <w:r>
         <w:t xml:space="preserve"> Método encargado de solicitar los detalles de la estación seleccionada a la capa de negocio/persistencia, validar que los datos estén disponibles y dentro de los rangos válidos (latitud en (-90, 90), longitud en (-180, 180), bicicletas disponibles &gt;= 0 y huecos libres &gt;= 0), sustituir por un guion ("-") aquellos datos ausentes o anómalos, y ordenar a la vista mostrar la información o notificar un error interno.</w:t>
@@ -1355,21 +1350,12 @@
         </w:rPr>
         <w:t xml:space="preserve">2. </w:t>
       </w:r>
-      <w:proofErr w:type="spellStart"/>
       <w:r>
         <w:rPr>
           <w:b/>
           <w:bCs/>
         </w:rPr>
-        <w:t>Presenter.init</w:t>
-      </w:r>
-      <w:proofErr w:type="spellEnd"/>
-      <w:r>
-        <w:rPr>
-          <w:b/>
-          <w:bCs/>
-        </w:rPr>
-        <w:t>() (Ver Anexo):</w:t>
+        <w:t>Presenter.init() (Ver Anexo):</w:t>
       </w:r>
       <w:r>
         <w:t xml:space="preserve"> Método genérico de lógica de presentación encargado de validar los datos del modelo y ordenar a la vista mostrarlos o sustituirlos por guiones. Susceptible de </w:t>
@@ -1382,15 +1368,7 @@
         <w:t>prueba unitaria</w:t>
       </w:r>
       <w:r>
-        <w:t xml:space="preserve"> mediante </w:t>
-      </w:r>
-      <w:proofErr w:type="spellStart"/>
-      <w:r>
-        <w:t>Mocks</w:t>
-      </w:r>
-      <w:proofErr w:type="spellEnd"/>
-      <w:r>
-        <w:t xml:space="preserve"> aislados.</w:t>
+        <w:t xml:space="preserve"> mediante Mocks aislados.</w:t>
       </w:r>
     </w:p>
     <w:p>
@@ -1532,17 +1510,8 @@
               <w:jc w:val="both"/>
             </w:pPr>
             <w:r>
-              <w:t xml:space="preserve">Se crea un Mock de Station con </w:t>
+              <w:t xml:space="preserve">Se crea un Mock de Station con Mockito que, al invocar sus </w:t>
             </w:r>
-            <w:proofErr w:type="spellStart"/>
-            <w:r>
-              <w:t>Mockito</w:t>
-            </w:r>
-            <w:proofErr w:type="spellEnd"/>
-            <w:r>
-              <w:t xml:space="preserve"> que, al invocar sus </w:t>
-            </w:r>
-            <w:proofErr w:type="spellStart"/>
             <w:r>
               <w:rPr>
                 <w:i/>
@@ -1550,57 +1519,8 @@
               </w:rPr>
               <w:t>getters</w:t>
             </w:r>
-            <w:proofErr w:type="spellEnd"/>
             <w:r>
-              <w:t xml:space="preserve">, devuelve los datos de la estación "377 - Metro Abrantes" (id = "01f5011f76069b1e81a11d4d51dd9d1d", </w:t>
-            </w:r>
-            <w:proofErr w:type="spellStart"/>
-            <w:r>
-              <w:t>latitude</w:t>
-            </w:r>
-            <w:proofErr w:type="spellEnd"/>
-            <w:r>
-              <w:t xml:space="preserve"> = 40.38091762, </w:t>
-            </w:r>
-            <w:proofErr w:type="spellStart"/>
-            <w:r>
-              <w:t>longitude</w:t>
-            </w:r>
-            <w:proofErr w:type="spellEnd"/>
-            <w:r>
-              <w:t xml:space="preserve"> = -3.72783615, </w:t>
-            </w:r>
-            <w:proofErr w:type="spellStart"/>
-            <w:r>
-              <w:t>timestamp</w:t>
-            </w:r>
-            <w:proofErr w:type="spellEnd"/>
-            <w:r>
-              <w:t xml:space="preserve"> = "2026-09-24T11:11:40.490774+00:00Z", </w:t>
-            </w:r>
-            <w:proofErr w:type="spellStart"/>
-            <w:r>
-              <w:t>freeBikes</w:t>
-            </w:r>
-            <w:proofErr w:type="spellEnd"/>
-            <w:r>
-              <w:t xml:space="preserve"> = 0, </w:t>
-            </w:r>
-            <w:proofErr w:type="spellStart"/>
-            <w:r>
-              <w:t>emptySlots</w:t>
-            </w:r>
-            <w:proofErr w:type="spellEnd"/>
-            <w:r>
-              <w:t xml:space="preserve"> = 18). El Mock se empaqueta en el </w:t>
-            </w:r>
-            <w:proofErr w:type="spellStart"/>
-            <w:r>
-              <w:t>Intent</w:t>
-            </w:r>
-            <w:proofErr w:type="spellEnd"/>
-            <w:r>
-              <w:t xml:space="preserve"> de inicio.</w:t>
+              <w:t>, devuelve los datos de la estación "377 - Metro Abrantes" (id = "01f5011f76069b1e81a11d4d51dd9d1d", latitude = 40.38091762, longitude = -3.72783615, timestamp = "2026-09-24T11:11:40.490774+00:00Z", freeBikes = 0, emptySlots = 18). El Mock se empaqueta en el Intent de inicio.</w:t>
             </w:r>
           </w:p>
         </w:tc>
@@ -1617,23 +1537,7 @@
               </w:rPr>
             </w:pPr>
             <w:r>
-              <w:t xml:space="preserve">La Actividad extrae correctamente el Mock del </w:t>
-            </w:r>
-            <w:proofErr w:type="spellStart"/>
-            <w:r>
-              <w:t>Intent</w:t>
-            </w:r>
-            <w:proofErr w:type="spellEnd"/>
-            <w:r>
-              <w:t xml:space="preserve">. La aserción verifica que el </w:t>
-            </w:r>
-            <w:proofErr w:type="spellStart"/>
-            <w:r>
-              <w:t>TextView</w:t>
-            </w:r>
-            <w:proofErr w:type="spellEnd"/>
-            <w:r>
-              <w:t xml:space="preserve"> de bicicletas disponibles muestra "0" y los demás campos muestran sus valores exactos, sin invocar el mensaje de error interno.</w:t>
+              <w:t>La Actividad extrae correctamente el Mock del Intent. La aserción verifica que el TextView de bicicletas disponibles muestra "0" y los demás campos muestran sus valores exactos, sin invocar el mensaje de error interno.</w:t>
             </w:r>
           </w:p>
         </w:tc>
@@ -1666,15 +1570,7 @@
               <w:jc w:val="both"/>
             </w:pPr>
             <w:r>
-              <w:t xml:space="preserve">Se configura un Mock de Station que devuelve </w:t>
-            </w:r>
-            <w:proofErr w:type="spellStart"/>
-            <w:r>
-              <w:t>null</w:t>
-            </w:r>
-            <w:proofErr w:type="spellEnd"/>
-            <w:r>
-              <w:t xml:space="preserve"> al consultar la latitud, longitud, hora de actualización, bicicletas y huecos.</w:t>
+              <w:t>Se configura un Mock de Station que devuelve null al consultar la latitud, longitud, hora de actualización, bicicletas y huecos.</w:t>
             </w:r>
           </w:p>
         </w:tc>
@@ -1688,31 +1584,7 @@
               <w:jc w:val="both"/>
             </w:pPr>
             <w:r>
-              <w:t xml:space="preserve">La lógica del </w:t>
-            </w:r>
-            <w:proofErr w:type="spellStart"/>
-            <w:r>
-              <w:t>onCreate</w:t>
-            </w:r>
-            <w:proofErr w:type="spellEnd"/>
-            <w:r>
-              <w:t xml:space="preserve"> evalúa correctamente los nulos provenientes del Mock y asigna la cadena de recurso </w:t>
-            </w:r>
-            <w:proofErr w:type="spellStart"/>
-            <w:r>
-              <w:t>R.string.noData</w:t>
-            </w:r>
-            <w:proofErr w:type="spellEnd"/>
-            <w:r>
-              <w:t xml:space="preserve"> ("-") a los </w:t>
-            </w:r>
-            <w:proofErr w:type="spellStart"/>
-            <w:r>
-              <w:t>TextView</w:t>
-            </w:r>
-            <w:proofErr w:type="spellEnd"/>
-            <w:r>
-              <w:t xml:space="preserve"> correspondientes, validando la integración del manejo de ausencia de datos.</w:t>
+              <w:t>La lógica del onCreate evalúa correctamente los nulos provenientes del Mock y asigna la cadena de recurso R.string.noData ("-") a los TextView correspondientes, validando la integración del manejo de ausencia de datos.</w:t>
             </w:r>
           </w:p>
         </w:tc>
@@ -1745,31 +1617,7 @@
               <w:jc w:val="both"/>
             </w:pPr>
             <w:r>
-              <w:t xml:space="preserve">Se configura un Mock de Station que devuelve valores fuera del rango geográfico y lógico: </w:t>
-            </w:r>
-            <w:proofErr w:type="spellStart"/>
-            <w:r>
-              <w:t>latitude</w:t>
-            </w:r>
-            <w:proofErr w:type="spellEnd"/>
-            <w:r>
-              <w:t xml:space="preserve"> = 95.0, </w:t>
-            </w:r>
-            <w:proofErr w:type="spellStart"/>
-            <w:r>
-              <w:t>longitude</w:t>
-            </w:r>
-            <w:proofErr w:type="spellEnd"/>
-            <w:r>
-              <w:t xml:space="preserve"> = -185.0, </w:t>
-            </w:r>
-            <w:proofErr w:type="spellStart"/>
-            <w:r>
-              <w:t>freeBikes</w:t>
-            </w:r>
-            <w:proofErr w:type="spellEnd"/>
-            <w:r>
-              <w:t xml:space="preserve"> = -1.</w:t>
+              <w:t>Se configura un Mock de Station que devuelve valores fuera del rango geográfico y lógico: latitude = 95.0, longitude = -185.0, freeBikes = -1.</w:t>
             </w:r>
           </w:p>
         </w:tc>
@@ -1783,23 +1631,7 @@
               <w:jc w:val="both"/>
             </w:pPr>
             <w:r>
-              <w:t xml:space="preserve">El </w:t>
-            </w:r>
-            <w:proofErr w:type="spellStart"/>
-            <w:r>
-              <w:t>onCreate</w:t>
-            </w:r>
-            <w:proofErr w:type="spellEnd"/>
-            <w:r>
-              <w:t xml:space="preserve"> integra los datos del Mock, las validaciones lógicas detectan los valores anómalos (&gt; 90, &lt; -180, &lt; 0) y la vista asigna </w:t>
-            </w:r>
-            <w:proofErr w:type="spellStart"/>
-            <w:r>
-              <w:t>R.string.noData</w:t>
-            </w:r>
-            <w:proofErr w:type="spellEnd"/>
-            <w:r>
-              <w:t xml:space="preserve"> ("-") exclusivamente a esos campos, </w:t>
+              <w:t xml:space="preserve">El onCreate integra los datos del Mock, las validaciones lógicas detectan los valores anómalos (&gt; 90, &lt; -180, &lt; 0) y la vista asigna R.string.noData ("-") exclusivamente a esos campos, </w:t>
             </w:r>
             <w:r>
               <w:lastRenderedPageBreak/>
@@ -1837,15 +1669,7 @@
               <w:jc w:val="both"/>
             </w:pPr>
             <w:r>
-              <w:t xml:space="preserve">Se lanza la Actividad con un </w:t>
-            </w:r>
-            <w:proofErr w:type="spellStart"/>
-            <w:r>
-              <w:t>Intent</w:t>
-            </w:r>
-            <w:proofErr w:type="spellEnd"/>
-            <w:r>
-              <w:t xml:space="preserve"> que no contiene ningún extra INTENT_STATION (simulando un fallo previo en la red).</w:t>
+              <w:t>Se lanza la Actividad con un Intent que no contiene ningún extra INTENT_STATION (simulando un fallo previo en la red).</w:t>
             </w:r>
           </w:p>
         </w:tc>
@@ -1862,39 +1686,7 @@
               </w:rPr>
             </w:pPr>
             <w:r>
-              <w:t xml:space="preserve">El </w:t>
-            </w:r>
-            <w:proofErr w:type="spellStart"/>
-            <w:r>
-              <w:t>onCreate</w:t>
-            </w:r>
-            <w:proofErr w:type="spellEnd"/>
-            <w:r>
-              <w:t xml:space="preserve"> detecta que el objeto extraído es </w:t>
-            </w:r>
-            <w:proofErr w:type="spellStart"/>
-            <w:r>
-              <w:t>null</w:t>
-            </w:r>
-            <w:proofErr w:type="spellEnd"/>
-            <w:r>
-              <w:t xml:space="preserve"> y ejecuta la rama de error, mostrando el </w:t>
-            </w:r>
-            <w:proofErr w:type="spellStart"/>
-            <w:r>
-              <w:t>Toast</w:t>
-            </w:r>
-            <w:proofErr w:type="spellEnd"/>
-            <w:r>
-              <w:t xml:space="preserve"> con el mensaje </w:t>
-            </w:r>
-            <w:proofErr w:type="spellStart"/>
-            <w:r>
-              <w:t>R.string.loadErrorStation</w:t>
-            </w:r>
-            <w:proofErr w:type="spellEnd"/>
-            <w:r>
-              <w:t>.</w:t>
+              <w:t>El onCreate detecta que el objeto extraído es null y ejecuta la rama de error, mostrando el Toast con el mensaje R.string.loadErrorStation.</w:t>
             </w:r>
           </w:p>
         </w:tc>
@@ -1931,15 +1723,7 @@
         <w:jc w:val="both"/>
       </w:pPr>
       <w:r>
-        <w:t xml:space="preserve">Los resultados de las pruebas de integración nos han dado a conocer que había un error en los tipos de datos, los tipos de datos que teníamos no aceptaban nulos al ser primitivos por ello debimos de cambiar aquellos tipos de datos como los </w:t>
-      </w:r>
-      <w:proofErr w:type="spellStart"/>
-      <w:r>
-        <w:t>double</w:t>
-      </w:r>
-      <w:proofErr w:type="spellEnd"/>
-      <w:r>
-        <w:t xml:space="preserve"> a Double para que pudiesen aceptar nulos.</w:t>
+        <w:t>Los resultados de las pruebas de integración nos han dado a conocer que había un error en los tipos de datos, los tipos de datos que teníamos no aceptaban nulos al ser primitivos por ello debimos de cambiar aquellos tipos de datos como los double a Double para que pudiesen aceptar nulos.</w:t>
       </w:r>
     </w:p>
     <w:p>
@@ -2689,15 +2473,7 @@
               <w:jc w:val="both"/>
             </w:pPr>
             <w:r>
-              <w:t xml:space="preserve">Se pasa a </w:t>
-            </w:r>
-            <w:proofErr w:type="spellStart"/>
-            <w:r>
-              <w:t>init</w:t>
-            </w:r>
-            <w:proofErr w:type="spellEnd"/>
-            <w:r>
-              <w:t>() un objeto Station real con latitud 40.3809, longitud -3.7278 y bicicletas = 0.</w:t>
+              <w:t>Se pasa a init() un objeto Station real con latitud 40.3809, longitud -3.7278 y bicicletas = 0.</w:t>
             </w:r>
           </w:p>
         </w:tc>
@@ -2711,23 +2487,7 @@
               <w:jc w:val="both"/>
             </w:pPr>
             <w:r>
-              <w:t xml:space="preserve">Se verifica que se invoca </w:t>
-            </w:r>
-            <w:proofErr w:type="spellStart"/>
-            <w:r>
-              <w:t>mockView.showLatitude</w:t>
-            </w:r>
-            <w:proofErr w:type="spellEnd"/>
-            <w:r>
-              <w:t xml:space="preserve">("40.3809") y </w:t>
-            </w:r>
-            <w:proofErr w:type="spellStart"/>
-            <w:r>
-              <w:t>mockView.showFreeBikes</w:t>
-            </w:r>
-            <w:proofErr w:type="spellEnd"/>
-            <w:r>
-              <w:t>("0").</w:t>
+              <w:t>Se verifica que se invoca mockView.showLatitude("40.3809") y mockView.showFreeBikes("0").</w:t>
             </w:r>
           </w:p>
         </w:tc>
@@ -2760,15 +2520,7 @@
               <w:jc w:val="both"/>
             </w:pPr>
             <w:r>
-              <w:t xml:space="preserve">Se pasa un objeto Station donde todos los atributos evaluables son </w:t>
-            </w:r>
-            <w:proofErr w:type="spellStart"/>
-            <w:r>
-              <w:t>null</w:t>
-            </w:r>
-            <w:proofErr w:type="spellEnd"/>
-            <w:r>
-              <w:t>.</w:t>
+              <w:t>Se pasa un objeto Station donde todos los atributos evaluables son null.</w:t>
             </w:r>
           </w:p>
         </w:tc>
@@ -2782,23 +2534,7 @@
               <w:jc w:val="both"/>
             </w:pPr>
             <w:r>
-              <w:t xml:space="preserve">Se verifica que se invoca </w:t>
-            </w:r>
-            <w:proofErr w:type="spellStart"/>
-            <w:r>
-              <w:t>mockView.showLatitude</w:t>
-            </w:r>
-            <w:proofErr w:type="spellEnd"/>
-            <w:r>
-              <w:t xml:space="preserve">("-") y </w:t>
-            </w:r>
-            <w:proofErr w:type="spellStart"/>
-            <w:r>
-              <w:t>mockView.showFreeBikes</w:t>
-            </w:r>
-            <w:proofErr w:type="spellEnd"/>
-            <w:r>
-              <w:t>("-").</w:t>
+              <w:t>Se verifica que se invoca mockView.showLatitude("-") y mockView.showFreeBikes("-").</w:t>
             </w:r>
           </w:p>
         </w:tc>
@@ -2916,23 +2652,7 @@
               <w:jc w:val="both"/>
             </w:pPr>
             <w:r>
-              <w:t xml:space="preserve">Se verifica que la lógica detecta el AVL superior e invoca </w:t>
-            </w:r>
-            <w:proofErr w:type="spellStart"/>
-            <w:r>
-              <w:t>mockView.showLatitude</w:t>
-            </w:r>
-            <w:proofErr w:type="spellEnd"/>
-            <w:r>
-              <w:t xml:space="preserve">("-") y </w:t>
-            </w:r>
-            <w:proofErr w:type="spellStart"/>
-            <w:r>
-              <w:t>mockView.showLongitude</w:t>
-            </w:r>
-            <w:proofErr w:type="spellEnd"/>
-            <w:r>
-              <w:t>("-"), manteniendo intactos los datos como el nombre.</w:t>
+              <w:t>Se verifica que la lógica detecta el AVL superior e invoca mockView.showLatitude("-") y mockView.showLongitude("-"), manteniendo intactos los datos como el nombre.</w:t>
             </w:r>
           </w:p>
         </w:tc>
@@ -2965,23 +2685,7 @@
               <w:jc w:val="both"/>
             </w:pPr>
             <w:r>
-              <w:t xml:space="preserve">Se invoca </w:t>
-            </w:r>
-            <w:proofErr w:type="spellStart"/>
-            <w:r>
-              <w:t>init</w:t>
-            </w:r>
-            <w:proofErr w:type="spellEnd"/>
-            <w:r>
-              <w:t>(</w:t>
-            </w:r>
-            <w:proofErr w:type="spellStart"/>
-            <w:r>
-              <w:t>null</w:t>
-            </w:r>
-            <w:proofErr w:type="spellEnd"/>
-            <w:r>
-              <w:t>).</w:t>
+              <w:t>Se invoca init(null).</w:t>
             </w:r>
           </w:p>
         </w:tc>
@@ -2995,15 +2699,7 @@
               <w:jc w:val="both"/>
             </w:pPr>
             <w:r>
-              <w:t xml:space="preserve">Se verifica que el presentador invoca </w:t>
-            </w:r>
-            <w:proofErr w:type="spellStart"/>
-            <w:r>
-              <w:t>mockView.showInternalError</w:t>
-            </w:r>
-            <w:proofErr w:type="spellEnd"/>
-            <w:r>
-              <w:t>().</w:t>
+              <w:t>Se verifica que el presentador invoca mockView.showInternalError().</w:t>
             </w:r>
           </w:p>
         </w:tc>
@@ -6790,7 +6486,6 @@
   <w:style w:type="character" w:default="1" w:styleId="Fuentedeprrafopredeter">
     <w:name w:val="Default Paragraph Font"/>
     <w:uiPriority w:val="1"/>
-    <w:semiHidden/>
     <w:unhideWhenUsed/>
   </w:style>
   <w:style w:type="table" w:default="1" w:styleId="Tablanormal">
@@ -7439,23 +7134,10 @@
 </file>
 
 <file path=customXml/item1.xml><?xml version="1.0" encoding="utf-8"?>
-<p:properties xmlns:p="http://schemas.microsoft.com/office/2006/metadata/properties" xmlns:xsi="http://www.w3.org/2001/XMLSchema-instance" xmlns:pc="http://schemas.microsoft.com/office/infopath/2007/PartnerControls">
-  <documentManagement>
-    <_activity xmlns="30c7f0a5-0460-48b3-ae5a-8da933a9cabc" xsi:nil="true"/>
-  </documentManagement>
-</p:properties>
+<b:Sources xmlns:b="http://schemas.openxmlformats.org/officeDocument/2006/bibliography" xmlns="http://schemas.openxmlformats.org/officeDocument/2006/bibliography" SelectedStyle="\APA.XSL" StyleName="APA"/>
 </file>
 
 <file path=customXml/item2.xml><?xml version="1.0" encoding="utf-8"?>
-<?mso-contentType ?>
-<FormTemplates xmlns="http://schemas.microsoft.com/sharepoint/v3/contenttype/forms">
-  <Display>DocumentLibraryForm</Display>
-  <Edit>DocumentLibraryForm</Edit>
-  <New>DocumentLibraryForm</New>
-</FormTemplates>
-</file>
-
-<file path=customXml/item3.xml><?xml version="1.0" encoding="utf-8"?>
 <ct:contentTypeSchema xmlns:ct="http://schemas.microsoft.com/office/2006/metadata/contentType" xmlns:ma="http://schemas.microsoft.com/office/2006/metadata/properties/metaAttributes" ct:_="" ma:_="" ma:contentTypeName="Documento" ma:contentTypeID="0x0101008A2DA2A88A7CD04691DDBB156CC2F629" ma:contentTypeVersion="14" ma:contentTypeDescription="Crear nuevo documento." ma:contentTypeScope="" ma:versionID="fa623cfde9ee52739a10639550e20630">
   <xsd:schema xmlns:xsd="http://www.w3.org/2001/XMLSchema" xmlns:xs="http://www.w3.org/2001/XMLSchema" xmlns:p="http://schemas.microsoft.com/office/2006/metadata/properties" xmlns:ns3="30c7f0a5-0460-48b3-ae5a-8da933a9cabc" xmlns:ns4="39664786-3c2d-494e-ba5d-eb5dc194af34" targetNamespace="http://schemas.microsoft.com/office/2006/metadata/properties" ma:root="true" ma:fieldsID="c8c51738a68246b2391ceec60ea14cb1" ns3:_="" ns4:_="">
     <xsd:import namespace="30c7f0a5-0460-48b3-ae5a-8da933a9cabc"/>
@@ -7682,29 +7364,32 @@
 </ct:contentTypeSchema>
 </file>
 
+<file path=customXml/item3.xml><?xml version="1.0" encoding="utf-8"?>
+<?mso-contentType ?>
+<FormTemplates xmlns="http://schemas.microsoft.com/sharepoint/v3/contenttype/forms">
+  <Display>DocumentLibraryForm</Display>
+  <Edit>DocumentLibraryForm</Edit>
+  <New>DocumentLibraryForm</New>
+</FormTemplates>
+</file>
+
 <file path=customXml/item4.xml><?xml version="1.0" encoding="utf-8"?>
-<b:Sources xmlns:b="http://schemas.openxmlformats.org/officeDocument/2006/bibliography" xmlns="http://schemas.openxmlformats.org/officeDocument/2006/bibliography" SelectedStyle="\APA.XSL" StyleName="APA"/>
+<p:properties xmlns:p="http://schemas.microsoft.com/office/2006/metadata/properties" xmlns:xsi="http://www.w3.org/2001/XMLSchema-instance" xmlns:pc="http://schemas.microsoft.com/office/infopath/2007/PartnerControls">
+  <documentManagement>
+    <_activity xmlns="30c7f0a5-0460-48b3-ae5a-8da933a9cabc" xsi:nil="true"/>
+  </documentManagement>
+</p:properties>
 </file>
 
 <file path=customXml/itemProps1.xml><?xml version="1.0" encoding="utf-8"?>
-<ds:datastoreItem xmlns:ds="http://schemas.openxmlformats.org/officeDocument/2006/customXml" ds:itemID="{0AEF3F1B-7B5E-4948-945B-936A86A38E7B}">
+<ds:datastoreItem xmlns:ds="http://schemas.openxmlformats.org/officeDocument/2006/customXml" ds:itemID="{77A3A6AA-CDB9-49FB-87E4-79E2EC2B1332}">
   <ds:schemaRefs>
-    <ds:schemaRef ds:uri="http://schemas.microsoft.com/office/2006/metadata/properties"/>
-    <ds:schemaRef ds:uri="http://schemas.microsoft.com/office/infopath/2007/PartnerControls"/>
-    <ds:schemaRef ds:uri="30c7f0a5-0460-48b3-ae5a-8da933a9cabc"/>
+    <ds:schemaRef ds:uri="http://schemas.openxmlformats.org/officeDocument/2006/bibliography"/>
   </ds:schemaRefs>
 </ds:datastoreItem>
 </file>
 
 <file path=customXml/itemProps2.xml><?xml version="1.0" encoding="utf-8"?>
-<ds:datastoreItem xmlns:ds="http://schemas.openxmlformats.org/officeDocument/2006/customXml" ds:itemID="{695A9024-BD60-4F4D-91DC-4B272A3D739F}">
-  <ds:schemaRefs>
-    <ds:schemaRef ds:uri="http://schemas.microsoft.com/sharepoint/v3/contenttype/forms"/>
-  </ds:schemaRefs>
-</ds:datastoreItem>
-</file>
-
-<file path=customXml/itemProps3.xml><?xml version="1.0" encoding="utf-8"?>
 <ds:datastoreItem xmlns:ds="http://schemas.openxmlformats.org/officeDocument/2006/customXml" ds:itemID="{21CE6CD8-F626-4B53-A0C7-27C8F699CD0D}">
   <ds:schemaRefs>
     <ds:schemaRef ds:uri="http://schemas.microsoft.com/office/2006/metadata/contentType"/>
@@ -7723,10 +7408,20 @@
 </ds:datastoreItem>
 </file>
 
+<file path=customXml/itemProps3.xml><?xml version="1.0" encoding="utf-8"?>
+<ds:datastoreItem xmlns:ds="http://schemas.openxmlformats.org/officeDocument/2006/customXml" ds:itemID="{695A9024-BD60-4F4D-91DC-4B272A3D739F}">
+  <ds:schemaRefs>
+    <ds:schemaRef ds:uri="http://schemas.microsoft.com/sharepoint/v3/contenttype/forms"/>
+  </ds:schemaRefs>
+</ds:datastoreItem>
+</file>
+
 <file path=customXml/itemProps4.xml><?xml version="1.0" encoding="utf-8"?>
-<ds:datastoreItem xmlns:ds="http://schemas.openxmlformats.org/officeDocument/2006/customXml" ds:itemID="{77A3A6AA-CDB9-49FB-87E4-79E2EC2B1332}">
+<ds:datastoreItem xmlns:ds="http://schemas.openxmlformats.org/officeDocument/2006/customXml" ds:itemID="{0AEF3F1B-7B5E-4948-945B-936A86A38E7B}">
   <ds:schemaRefs>
-    <ds:schemaRef ds:uri="http://schemas.openxmlformats.org/officeDocument/2006/bibliography"/>
+    <ds:schemaRef ds:uri="http://schemas.microsoft.com/office/2006/metadata/properties"/>
+    <ds:schemaRef ds:uri="http://schemas.microsoft.com/office/infopath/2007/PartnerControls"/>
+    <ds:schemaRef ds:uri="30c7f0a5-0460-48b3-ae5a-8da933a9cabc"/>
   </ds:schemaRefs>
 </ds:datastoreItem>
 </file>
</xml_diff>

<commit_message>
Modificada el plan de pruebas y añadido el test unitario de RedDetailsPresenterInitTest
</commit_message>
<xml_diff>
--- a/Docs/Test Plans/US532236-VerDetallesDeEstacion-TestPlan.docx
+++ b/Docs/Test Plans/US532236-VerDetallesDeEstacion-TestPlan.docx
@@ -546,8 +546,13 @@
         <w:t xml:space="preserve">e la lista de estaciones de </w:t>
       </w:r>
       <w:r>
-        <w:t>la red BiciMAD</w:t>
-      </w:r>
+        <w:t xml:space="preserve">la red </w:t>
+      </w:r>
+      <w:proofErr w:type="spellStart"/>
+      <w:r>
+        <w:t>BiciMAD</w:t>
+      </w:r>
+      <w:proofErr w:type="spellEnd"/>
       <w:r>
         <w:t>.</w:t>
       </w:r>
@@ -799,8 +804,13 @@
         <w:t xml:space="preserve">e la lista de estaciones de </w:t>
       </w:r>
       <w:r>
-        <w:t>la red BiciMAD</w:t>
-      </w:r>
+        <w:t xml:space="preserve">la red </w:t>
+      </w:r>
+      <w:proofErr w:type="spellStart"/>
+      <w:r>
+        <w:t>BiciMAD</w:t>
+      </w:r>
+      <w:proofErr w:type="spellEnd"/>
       <w:r>
         <w:t>.</w:t>
       </w:r>
@@ -981,7 +991,15 @@
         <w:jc w:val="both"/>
       </w:pPr>
       <w:r>
-        <w:t xml:space="preserve">El técnico selecciona la estación "377 - Metro Abrantes" de la lista de estaciones de la red BiciMAD </w:t>
+        <w:t xml:space="preserve">El técnico selecciona la estación "377 - Metro Abrantes" de la lista de estaciones de la red </w:t>
+      </w:r>
+      <w:proofErr w:type="spellStart"/>
+      <w:r>
+        <w:t>BiciMAD</w:t>
+      </w:r>
+      <w:proofErr w:type="spellEnd"/>
+      <w:r>
+        <w:t xml:space="preserve"> </w:t>
       </w:r>
       <w:r>
         <w:t>teniendo datos anómalos</w:t>
@@ -1143,7 +1161,15 @@
         <w:jc w:val="both"/>
       </w:pPr>
       <w:r>
-        <w:t>El técnico selecciona la estación "377 - Metro Abrantes" de la lista de estaciones de la red BiciMAD estando el servicio de datos inactivo.</w:t>
+        <w:t xml:space="preserve">El técnico selecciona la estación "377 - Metro Abrantes" de la lista de estaciones de la red </w:t>
+      </w:r>
+      <w:proofErr w:type="spellStart"/>
+      <w:r>
+        <w:t>BiciMAD</w:t>
+      </w:r>
+      <w:proofErr w:type="spellEnd"/>
+      <w:r>
+        <w:t xml:space="preserve"> estando el servicio de datos inactivo.</w:t>
       </w:r>
     </w:p>
     <w:p>
@@ -1197,7 +1223,15 @@
         <w:jc w:val="both"/>
       </w:pPr>
       <w:r>
-        <w:t>El técnico selecciona la estación "377 - Metro Abrantes" de la lista de estaciones de la red BiciMAD produciéndose un fallo al acceder al servicio de datos</w:t>
+        <w:t xml:space="preserve">El técnico selecciona la estación "377 - Metro Abrantes" de la lista de estaciones de la red </w:t>
+      </w:r>
+      <w:proofErr w:type="spellStart"/>
+      <w:r>
+        <w:t>BiciMAD</w:t>
+      </w:r>
+      <w:proofErr w:type="spellEnd"/>
+      <w:r>
+        <w:t xml:space="preserve"> produciéndose un fallo al acceder al servicio de datos</w:t>
       </w:r>
     </w:p>
     <w:p>
@@ -1251,8 +1285,13 @@
         <w:jc w:val="both"/>
       </w:pPr>
       <w:r>
-        <w:t>Con la conexión a Internet del dispositivo desactivada, el técnico selecciona la estación "377 - Metro Abrantes" de la lista de estaciones de la red BiciMAD</w:t>
-      </w:r>
+        <w:t xml:space="preserve">Con la conexión a Internet del dispositivo desactivada, el técnico selecciona la estación "377 - Metro Abrantes" de la lista de estaciones de la red </w:t>
+      </w:r>
+      <w:proofErr w:type="spellStart"/>
+      <w:r>
+        <w:t>BiciMAD</w:t>
+      </w:r>
+      <w:proofErr w:type="spellEnd"/>
       <w:r>
         <w:t>.</w:t>
       </w:r>
@@ -1327,12 +1366,21 @@
         </w:rPr>
         <w:t xml:space="preserve">1. </w:t>
       </w:r>
+      <w:proofErr w:type="spellStart"/>
       <w:r>
         <w:rPr>
           <w:b/>
           <w:bCs/>
         </w:rPr>
-        <w:t>onCreate():</w:t>
+        <w:t>onCreate</w:t>
+      </w:r>
+      <w:proofErr w:type="spellEnd"/>
+      <w:r>
+        <w:rPr>
+          <w:b/>
+          <w:bCs/>
+        </w:rPr>
+        <w:t>():</w:t>
       </w:r>
       <w:r>
         <w:t xml:space="preserve"> Método encargado de solicitar los detalles de la estación seleccionada a la capa de negocio/persistencia, validar que los datos estén disponibles y dentro de los rangos válidos (latitud en (-90, 90), longitud en (-180, 180), bicicletas disponibles &gt;= 0 y huecos libres &gt;= 0), sustituir por un guion ("-") aquellos datos ausentes o anómalos, y ordenar a la vista mostrar la información o notificar un error interno.</w:t>
@@ -1350,12 +1398,21 @@
         </w:rPr>
         <w:t xml:space="preserve">2. </w:t>
       </w:r>
+      <w:proofErr w:type="spellStart"/>
       <w:r>
         <w:rPr>
           <w:b/>
           <w:bCs/>
         </w:rPr>
-        <w:t>Presenter.init() (Ver Anexo):</w:t>
+        <w:t>Presenter.init</w:t>
+      </w:r>
+      <w:proofErr w:type="spellEnd"/>
+      <w:r>
+        <w:rPr>
+          <w:b/>
+          <w:bCs/>
+        </w:rPr>
+        <w:t>() (Ver Anexo):</w:t>
       </w:r>
       <w:r>
         <w:t xml:space="preserve"> Método genérico de lógica de presentación encargado de validar los datos del modelo y ordenar a la vista mostrarlos o sustituirlos por guiones. Susceptible de </w:t>
@@ -1368,7 +1425,15 @@
         <w:t>prueba unitaria</w:t>
       </w:r>
       <w:r>
-        <w:t xml:space="preserve"> mediante Mocks aislados.</w:t>
+        <w:t xml:space="preserve"> mediante </w:t>
+      </w:r>
+      <w:proofErr w:type="spellStart"/>
+      <w:r>
+        <w:t>Mocks</w:t>
+      </w:r>
+      <w:proofErr w:type="spellEnd"/>
+      <w:r>
+        <w:t xml:space="preserve"> aislados.</w:t>
       </w:r>
     </w:p>
     <w:p>
@@ -1394,12 +1459,17 @@
       <w:pPr>
         <w:spacing w:after="120"/>
         <w:jc w:val="both"/>
-        <w:rPr>
-          <w:u w:val="single"/>
-        </w:rPr>
-      </w:pPr>
-      <w:r>
-        <w:t>Al ser un método onCreate no vamos a realizar las pruebas unitarias, por ello al final de este documento habrá un anexo que añadas unas pruebas unitarias de init()</w:t>
+      </w:pPr>
+      <w:r>
+        <w:t>Debido a que la lógica de validación se ha acoplado directamente en la Vista (</w:t>
+      </w:r>
+      <w:proofErr w:type="spellStart"/>
+      <w:r>
+        <w:t>StationDetailsView.onCreate</w:t>
+      </w:r>
+      <w:proofErr w:type="spellEnd"/>
+      <w:r>
+        <w:t>()) y no se ha implementado la capa del Presentador para esta historia de usuario, es técnicamente inviable aislar el componente para realizar pruebas unitarias. Por tanto, no se realizarán pruebas unitarias en esta historia y la funcionalidad se certificará exclusivamente mediante las pruebas de integración descritas en la siguiente sección.</w:t>
       </w:r>
     </w:p>
     <w:p>
@@ -1510,8 +1580,17 @@
               <w:jc w:val="both"/>
             </w:pPr>
             <w:r>
-              <w:t xml:space="preserve">Se crea un Mock de Station con Mockito que, al invocar sus </w:t>
-            </w:r>
+              <w:t xml:space="preserve">Se crea un Mock de Station con </w:t>
+            </w:r>
+            <w:proofErr w:type="spellStart"/>
+            <w:r>
+              <w:t>Mockito</w:t>
+            </w:r>
+            <w:proofErr w:type="spellEnd"/>
+            <w:r>
+              <w:t xml:space="preserve"> que, al invocar sus </w:t>
+            </w:r>
+            <w:proofErr w:type="spellStart"/>
             <w:r>
               <w:rPr>
                 <w:i/>
@@ -1519,8 +1598,57 @@
               </w:rPr>
               <w:t>getters</w:t>
             </w:r>
-            <w:r>
-              <w:t>, devuelve los datos de la estación "377 - Metro Abrantes" (id = "01f5011f76069b1e81a11d4d51dd9d1d", latitude = 40.38091762, longitude = -3.72783615, timestamp = "2026-09-24T11:11:40.490774+00:00Z", freeBikes = 0, emptySlots = 18). El Mock se empaqueta en el Intent de inicio.</w:t>
+            <w:proofErr w:type="spellEnd"/>
+            <w:r>
+              <w:t xml:space="preserve">, devuelve los datos de la estación "377 - Metro Abrantes" (id = "01f5011f76069b1e81a11d4d51dd9d1d", </w:t>
+            </w:r>
+            <w:proofErr w:type="spellStart"/>
+            <w:r>
+              <w:t>latitude</w:t>
+            </w:r>
+            <w:proofErr w:type="spellEnd"/>
+            <w:r>
+              <w:t xml:space="preserve"> = 40.38091762, </w:t>
+            </w:r>
+            <w:proofErr w:type="spellStart"/>
+            <w:r>
+              <w:t>longitude</w:t>
+            </w:r>
+            <w:proofErr w:type="spellEnd"/>
+            <w:r>
+              <w:t xml:space="preserve"> = -3.72783615, </w:t>
+            </w:r>
+            <w:proofErr w:type="spellStart"/>
+            <w:r>
+              <w:t>timestamp</w:t>
+            </w:r>
+            <w:proofErr w:type="spellEnd"/>
+            <w:r>
+              <w:t xml:space="preserve"> = "2026-09-24T11:11:40.490774+00:00Z", </w:t>
+            </w:r>
+            <w:proofErr w:type="spellStart"/>
+            <w:r>
+              <w:t>freeBikes</w:t>
+            </w:r>
+            <w:proofErr w:type="spellEnd"/>
+            <w:r>
+              <w:t xml:space="preserve"> = 0, </w:t>
+            </w:r>
+            <w:proofErr w:type="spellStart"/>
+            <w:r>
+              <w:t>emptySlots</w:t>
+            </w:r>
+            <w:proofErr w:type="spellEnd"/>
+            <w:r>
+              <w:t xml:space="preserve"> = 18). El Mock se empaqueta en el </w:t>
+            </w:r>
+            <w:proofErr w:type="spellStart"/>
+            <w:r>
+              <w:t>Intent</w:t>
+            </w:r>
+            <w:proofErr w:type="spellEnd"/>
+            <w:r>
+              <w:t xml:space="preserve"> de inicio.</w:t>
             </w:r>
           </w:p>
         </w:tc>
@@ -1537,7 +1665,23 @@
               </w:rPr>
             </w:pPr>
             <w:r>
-              <w:t>La Actividad extrae correctamente el Mock del Intent. La aserción verifica que el TextView de bicicletas disponibles muestra "0" y los demás campos muestran sus valores exactos, sin invocar el mensaje de error interno.</w:t>
+              <w:t xml:space="preserve">La Actividad extrae correctamente el Mock del </w:t>
+            </w:r>
+            <w:proofErr w:type="spellStart"/>
+            <w:r>
+              <w:t>Intent</w:t>
+            </w:r>
+            <w:proofErr w:type="spellEnd"/>
+            <w:r>
+              <w:t xml:space="preserve">. La aserción verifica que el </w:t>
+            </w:r>
+            <w:proofErr w:type="spellStart"/>
+            <w:r>
+              <w:t>TextView</w:t>
+            </w:r>
+            <w:proofErr w:type="spellEnd"/>
+            <w:r>
+              <w:t xml:space="preserve"> de bicicletas disponibles muestra "0" y los demás campos muestran sus valores exactos, sin invocar el mensaje de error interno.</w:t>
             </w:r>
           </w:p>
         </w:tc>
@@ -1570,7 +1714,15 @@
               <w:jc w:val="both"/>
             </w:pPr>
             <w:r>
-              <w:t>Se configura un Mock de Station que devuelve null al consultar la latitud, longitud, hora de actualización, bicicletas y huecos.</w:t>
+              <w:t xml:space="preserve">Se configura un Mock de Station que devuelve </w:t>
+            </w:r>
+            <w:proofErr w:type="spellStart"/>
+            <w:r>
+              <w:t>null</w:t>
+            </w:r>
+            <w:proofErr w:type="spellEnd"/>
+            <w:r>
+              <w:t xml:space="preserve"> al consultar la latitud, longitud, hora de actualización, bicicletas y huecos.</w:t>
             </w:r>
           </w:p>
         </w:tc>
@@ -1584,7 +1736,31 @@
               <w:jc w:val="both"/>
             </w:pPr>
             <w:r>
-              <w:t>La lógica del onCreate evalúa correctamente los nulos provenientes del Mock y asigna la cadena de recurso R.string.noData ("-") a los TextView correspondientes, validando la integración del manejo de ausencia de datos.</w:t>
+              <w:t xml:space="preserve">La lógica del </w:t>
+            </w:r>
+            <w:proofErr w:type="spellStart"/>
+            <w:r>
+              <w:t>onCreate</w:t>
+            </w:r>
+            <w:proofErr w:type="spellEnd"/>
+            <w:r>
+              <w:t xml:space="preserve"> evalúa correctamente los nulos provenientes del Mock y asigna la cadena de recurso </w:t>
+            </w:r>
+            <w:proofErr w:type="spellStart"/>
+            <w:r>
+              <w:t>R.string.noData</w:t>
+            </w:r>
+            <w:proofErr w:type="spellEnd"/>
+            <w:r>
+              <w:t xml:space="preserve"> ("-") a los </w:t>
+            </w:r>
+            <w:proofErr w:type="spellStart"/>
+            <w:r>
+              <w:t>TextView</w:t>
+            </w:r>
+            <w:proofErr w:type="spellEnd"/>
+            <w:r>
+              <w:t xml:space="preserve"> correspondientes, validando la integración del manejo de ausencia de datos.</w:t>
             </w:r>
           </w:p>
         </w:tc>
@@ -1617,7 +1793,35 @@
               <w:jc w:val="both"/>
             </w:pPr>
             <w:r>
-              <w:t>Se configura un Mock de Station que devuelve valores fuera del rango geográfico y lógico: latitude = 95.0, longitude = -185.0, freeBikes = -1.</w:t>
+              <w:t xml:space="preserve">Se configura un Mock de Station que devuelve valores fuera del rango </w:t>
+            </w:r>
+            <w:r>
+              <w:lastRenderedPageBreak/>
+              <w:t xml:space="preserve">geográfico y lógico: </w:t>
+            </w:r>
+            <w:proofErr w:type="spellStart"/>
+            <w:r>
+              <w:t>latitude</w:t>
+            </w:r>
+            <w:proofErr w:type="spellEnd"/>
+            <w:r>
+              <w:t xml:space="preserve"> = 95.0, </w:t>
+            </w:r>
+            <w:proofErr w:type="spellStart"/>
+            <w:r>
+              <w:t>longitude</w:t>
+            </w:r>
+            <w:proofErr w:type="spellEnd"/>
+            <w:r>
+              <w:t xml:space="preserve"> = -185.0, </w:t>
+            </w:r>
+            <w:proofErr w:type="spellStart"/>
+            <w:r>
+              <w:t>freeBikes</w:t>
+            </w:r>
+            <w:proofErr w:type="spellEnd"/>
+            <w:r>
+              <w:t xml:space="preserve"> = -1.</w:t>
             </w:r>
           </w:p>
         </w:tc>
@@ -1631,11 +1835,28 @@
               <w:jc w:val="both"/>
             </w:pPr>
             <w:r>
-              <w:t xml:space="preserve">El onCreate integra los datos del Mock, las validaciones lógicas detectan los valores anómalos (&gt; 90, &lt; -180, &lt; 0) y la vista asigna R.string.noData ("-") exclusivamente a esos campos, </w:t>
-            </w:r>
-            <w:r>
               <w:lastRenderedPageBreak/>
-              <w:t>manteniendo los válidos (como el nombre o ID).</w:t>
+              <w:t xml:space="preserve">El </w:t>
+            </w:r>
+            <w:proofErr w:type="spellStart"/>
+            <w:r>
+              <w:t>onCreate</w:t>
+            </w:r>
+            <w:proofErr w:type="spellEnd"/>
+            <w:r>
+              <w:t xml:space="preserve"> integra los datos del Mock, las validaciones lógicas detectan los valores anómalos (&gt; </w:t>
+            </w:r>
+            <w:r>
+              <w:lastRenderedPageBreak/>
+              <w:t xml:space="preserve">90, &lt; -180, &lt; 0) y la vista asigna </w:t>
+            </w:r>
+            <w:proofErr w:type="spellStart"/>
+            <w:r>
+              <w:t>R.string.noData</w:t>
+            </w:r>
+            <w:proofErr w:type="spellEnd"/>
+            <w:r>
+              <w:t xml:space="preserve"> ("-") exclusivamente a esos campos, manteniendo los válidos (como el nombre o ID).</w:t>
             </w:r>
           </w:p>
         </w:tc>
@@ -1669,7 +1890,15 @@
               <w:jc w:val="both"/>
             </w:pPr>
             <w:r>
-              <w:t>Se lanza la Actividad con un Intent que no contiene ningún extra INTENT_STATION (simulando un fallo previo en la red).</w:t>
+              <w:t xml:space="preserve">Se lanza la Actividad con un </w:t>
+            </w:r>
+            <w:proofErr w:type="spellStart"/>
+            <w:r>
+              <w:t>Intent</w:t>
+            </w:r>
+            <w:proofErr w:type="spellEnd"/>
+            <w:r>
+              <w:t xml:space="preserve"> que no contiene ningún extra INTENT_STATION (simulando un fallo previo en la red).</w:t>
             </w:r>
           </w:p>
         </w:tc>
@@ -1686,7 +1915,39 @@
               </w:rPr>
             </w:pPr>
             <w:r>
-              <w:t>El onCreate detecta que el objeto extraído es null y ejecuta la rama de error, mostrando el Toast con el mensaje R.string.loadErrorStation.</w:t>
+              <w:t xml:space="preserve">El </w:t>
+            </w:r>
+            <w:proofErr w:type="spellStart"/>
+            <w:r>
+              <w:t>onCreate</w:t>
+            </w:r>
+            <w:proofErr w:type="spellEnd"/>
+            <w:r>
+              <w:t xml:space="preserve"> detecta que el objeto extraído es </w:t>
+            </w:r>
+            <w:proofErr w:type="spellStart"/>
+            <w:r>
+              <w:t>null</w:t>
+            </w:r>
+            <w:proofErr w:type="spellEnd"/>
+            <w:r>
+              <w:t xml:space="preserve"> y ejecuta la rama de error, mostrando el </w:t>
+            </w:r>
+            <w:proofErr w:type="spellStart"/>
+            <w:r>
+              <w:t>Toast</w:t>
+            </w:r>
+            <w:proofErr w:type="spellEnd"/>
+            <w:r>
+              <w:t xml:space="preserve"> con el mensaje </w:t>
+            </w:r>
+            <w:proofErr w:type="spellStart"/>
+            <w:r>
+              <w:t>R.string.loadErrorStation</w:t>
+            </w:r>
+            <w:proofErr w:type="spellEnd"/>
+            <w:r>
+              <w:t>.</w:t>
             </w:r>
           </w:p>
         </w:tc>
@@ -1723,7 +1984,32 @@
         <w:jc w:val="both"/>
       </w:pPr>
       <w:r>
-        <w:t>Los resultados de las pruebas de integración nos han dado a conocer que había un error en los tipos de datos, los tipos de datos que teníamos no aceptaban nulos al ser primitivos por ello debimos de cambiar aquellos tipos de datos como los double a Double para que pudiesen aceptar nulos.</w:t>
+        <w:t xml:space="preserve">Los resultados de las pruebas de integración nos han dado a conocer que había un error en los tipos de datos, los tipos de datos que teníamos no aceptaban nulos al ser primitivos por ello debimos de cambiar aquellos tipos de datos como los </w:t>
+      </w:r>
+      <w:proofErr w:type="spellStart"/>
+      <w:r>
+        <w:t>double</w:t>
+      </w:r>
+      <w:proofErr w:type="spellEnd"/>
+      <w:r>
+        <w:t xml:space="preserve"> a Double para que pudiesen aceptar nulos.</w:t>
+      </w:r>
+    </w:p>
+    <w:p>
+      <w:pPr>
+        <w:spacing w:after="120"/>
+        <w:jc w:val="both"/>
+      </w:pPr>
+      <w:r>
+        <w:t xml:space="preserve">En la resolución de las pruebas de unitarias del método </w:t>
+      </w:r>
+      <w:proofErr w:type="spellStart"/>
+      <w:r>
+        <w:t>init</w:t>
+      </w:r>
+      <w:proofErr w:type="spellEnd"/>
+      <w:r>
+        <w:t xml:space="preserve">() de los detalles de la red no encontramos fallos </w:t>
       </w:r>
     </w:p>
     <w:p>
@@ -1752,73 +2038,133 @@
         </w:rPr>
         <w:t>ESPECIFICACION DE PRUEBAS UNITARIAS DEL METODO INIT()</w:t>
       </w:r>
-    </w:p>
-    <w:p>
-      <w:pPr>
-        <w:spacing w:after="120"/>
-        <w:jc w:val="both"/>
-      </w:pPr>
-      <w:r>
-        <w:t xml:space="preserve">Dado que el método onCreate() de la Activity delega toda la lógica de inicialización y validación de datos en el método </w:t>
-      </w:r>
+      <w:r>
+        <w:rPr>
+          <w:b/>
+          <w:bCs/>
+          <w:u w:val="single"/>
+        </w:rPr>
+        <w:t xml:space="preserve"> </w:t>
+      </w:r>
+      <w:r>
+        <w:rPr>
+          <w:b/>
+          <w:bCs/>
+          <w:u w:val="single"/>
+        </w:rPr>
+        <w:t>(</w:t>
+      </w:r>
+      <w:proofErr w:type="spellStart"/>
+      <w:r>
+        <w:rPr>
+          <w:b/>
+          <w:bCs/>
+          <w:u w:val="single"/>
+        </w:rPr>
+        <w:t>RedDetailsPresenter</w:t>
+      </w:r>
+      <w:proofErr w:type="spellEnd"/>
+      <w:r>
+        <w:rPr>
+          <w:b/>
+          <w:bCs/>
+          <w:u w:val="single"/>
+        </w:rPr>
+        <w:t>)</w:t>
+      </w:r>
+    </w:p>
+    <w:p>
+      <w:pPr>
+        <w:spacing w:after="120"/>
+        <w:jc w:val="both"/>
+      </w:pPr>
+      <w:r>
+        <w:t xml:space="preserve">Dado que el método </w:t>
+      </w:r>
+      <w:proofErr w:type="spellStart"/>
+      <w:r>
+        <w:t>init</w:t>
+      </w:r>
+      <w:proofErr w:type="spellEnd"/>
+      <w:r>
+        <w:t xml:space="preserve">() del </w:t>
+      </w:r>
+      <w:proofErr w:type="spellStart"/>
+      <w:r>
+        <w:t>RedDetailsPresenter</w:t>
+      </w:r>
+      <w:proofErr w:type="spellEnd"/>
+      <w:r>
+        <w:t xml:space="preserve"> delega en métodos estáticos para comprobar la conectividad y la ubicación, se especifican a continuación las pruebas unitarias siguiendo técnicas de caja blanca (cobertura de caminos) y aislando sus dependencias estáticas mediante </w:t>
+      </w:r>
+      <w:proofErr w:type="spellStart"/>
+      <w:r>
+        <w:t>Mocks</w:t>
+      </w:r>
+      <w:proofErr w:type="spellEnd"/>
+      <w:r>
+        <w:t xml:space="preserve"> (</w:t>
+      </w:r>
+      <w:proofErr w:type="spellStart"/>
+      <w:r>
+        <w:t>Mockito</w:t>
+      </w:r>
+      <w:proofErr w:type="spellEnd"/>
+      <w:r>
+        <w:t>).</w:t>
+      </w:r>
+    </w:p>
+    <w:p>
+      <w:pPr>
+        <w:spacing w:after="120"/>
+        <w:jc w:val="both"/>
+      </w:pPr>
       <w:r>
         <w:rPr>
           <w:b/>
           <w:bCs/>
         </w:rPr>
-        <w:t>init()</w:t>
-      </w:r>
-      <w:r>
-        <w:t xml:space="preserve"> del Presentador, se especifican a continuación las pruebas unitarias de dicho método siguiendo técnicas de caja negra (</w:t>
-      </w:r>
+        <w:t>A.1. Clases de Equivalencia y Caminos Lógicos</w:t>
+      </w:r>
+    </w:p>
+    <w:p>
+      <w:pPr>
+        <w:numPr>
+          <w:ilvl w:val="0"/>
+          <w:numId w:val="25"/>
+        </w:numPr>
+        <w:spacing w:after="120"/>
+        <w:jc w:val="both"/>
+      </w:pPr>
       <w:r>
         <w:rPr>
           <w:b/>
           <w:bCs/>
         </w:rPr>
-        <w:t>Partición Equivalente y Análisis de Valores Límite - AVL</w:t>
-      </w:r>
-      <w:r>
-        <w:t xml:space="preserve">) y aislando sus dependencias mediante </w:t>
-      </w:r>
+        <w:t>Conexión a Red (</w:t>
+      </w:r>
+      <w:proofErr w:type="spellStart"/>
       <w:r>
         <w:rPr>
           <w:b/>
           <w:bCs/>
         </w:rPr>
-        <w:t>Mocks (Mockito)</w:t>
-      </w:r>
-      <w:r>
-        <w:t xml:space="preserve"> tanto para la capa de persistencia (mockRepository) como para la vista (mockView). </w:t>
-      </w:r>
-    </w:p>
-    <w:p>
-      <w:pPr>
-        <w:spacing w:after="120"/>
-        <w:jc w:val="both"/>
-      </w:pPr>
-      <w:r>
-        <w:t>A.1. Clases de Equivalencia y Valores Límite (AVL)</w:t>
-      </w:r>
-    </w:p>
-    <w:p>
-      <w:pPr>
-        <w:spacing w:after="120"/>
-        <w:jc w:val="both"/>
-      </w:pPr>
+        <w:t>Utils.isNetworkAvailable</w:t>
+      </w:r>
+      <w:proofErr w:type="spellEnd"/>
       <w:r>
         <w:rPr>
           <w:b/>
           <w:bCs/>
         </w:rPr>
-        <w:t>Respuesta del Repositorio (Mock):</w:t>
+        <w:t>):</w:t>
       </w:r>
     </w:p>
     <w:p>
       <w:pPr>
         <w:numPr>
-          <w:ilvl w:val="0"/>
-          <w:numId w:val="20"/>
+          <w:ilvl w:val="1"/>
+          <w:numId w:val="25"/>
         </w:numPr>
         <w:spacing w:after="120"/>
         <w:jc w:val="both"/>
@@ -1831,14 +2177,14 @@
         <w:t>CE1 (Válida):</w:t>
       </w:r>
       <w:r>
-        <w:t xml:space="preserve"> Devuelve un objeto Station válido. </w:t>
+        <w:t xml:space="preserve"> Devuelve true. Se evalúa la ubicación y se procede a cargar los datos.</w:t>
       </w:r>
     </w:p>
     <w:p>
       <w:pPr>
         <w:numPr>
-          <w:ilvl w:val="0"/>
-          <w:numId w:val="20"/>
+          <w:ilvl w:val="1"/>
+          <w:numId w:val="25"/>
         </w:numPr>
         <w:spacing w:after="120"/>
         <w:jc w:val="both"/>
@@ -1851,22 +2197,15 @@
         <w:t>CE2 (Inválida):</w:t>
       </w:r>
       <w:r>
-        <w:t xml:space="preserve"> Falla al obtener los datos (servicio inactivo, error de comunicación o sin red) </w:t>
-      </w:r>
-      <m:oMath>
-        <m:r>
-          <w:rPr>
-            <w:rFonts w:ascii="Cambria Math" w:hAnsi="Cambria Math"/>
-          </w:rPr>
-          <m:t>→</m:t>
-        </m:r>
-      </m:oMath>
-      <w:r>
-        <w:t xml:space="preserve"> Notifica error interno. </w:t>
-      </w:r>
-    </w:p>
-    <w:p>
-      <w:pPr>
+        <w:t xml:space="preserve"> Devuelve false. Se notifica error de red y se aborta el flujo.</w:t>
+      </w:r>
+    </w:p>
+    <w:p>
+      <w:pPr>
+        <w:numPr>
+          <w:ilvl w:val="0"/>
+          <w:numId w:val="25"/>
+        </w:numPr>
         <w:spacing w:after="120"/>
         <w:jc w:val="both"/>
       </w:pPr>
@@ -1875,14 +2214,30 @@
           <w:b/>
           <w:bCs/>
         </w:rPr>
-        <w:t>Latitud (double latitude):</w:t>
+        <w:t>Ubicación (</w:t>
+      </w:r>
+      <w:proofErr w:type="spellStart"/>
+      <w:r>
+        <w:rPr>
+          <w:b/>
+          <w:bCs/>
+        </w:rPr>
+        <w:t>Utils.isLocationEnabled</w:t>
+      </w:r>
+      <w:proofErr w:type="spellEnd"/>
+      <w:r>
+        <w:rPr>
+          <w:b/>
+          <w:bCs/>
+        </w:rPr>
+        <w:t>):</w:t>
       </w:r>
     </w:p>
     <w:p>
       <w:pPr>
         <w:numPr>
-          <w:ilvl w:val="0"/>
-          <w:numId w:val="21"/>
+          <w:ilvl w:val="1"/>
+          <w:numId w:val="25"/>
         </w:numPr>
         <w:spacing w:after="120"/>
         <w:jc w:val="both"/>
@@ -1895,25 +2250,14 @@
         <w:t>CE3 (Válida):</w:t>
       </w:r>
       <w:r>
-        <w:t xml:space="preserve"> (-90, 90) (AVL: -89.99, nominal 40.38091762, 89.99) </w:t>
-      </w:r>
-      <m:oMath>
-        <m:r>
-          <w:rPr>
-            <w:rFonts w:ascii="Cambria Math" w:hAnsi="Cambria Math"/>
-          </w:rPr>
-          <m:t>→</m:t>
-        </m:r>
-      </m:oMath>
-      <w:r>
-        <w:t xml:space="preserve"> Muestra el valor. </w:t>
+        <w:t xml:space="preserve"> Devuelve true. No se muestran errores y se carga la red.</w:t>
       </w:r>
     </w:p>
     <w:p>
       <w:pPr>
         <w:numPr>
-          <w:ilvl w:val="0"/>
-          <w:numId w:val="21"/>
+          <w:ilvl w:val="1"/>
+          <w:numId w:val="25"/>
         </w:numPr>
         <w:spacing w:after="120"/>
         <w:jc w:val="both"/>
@@ -1923,488 +2267,36 @@
           <w:b/>
           <w:bCs/>
         </w:rPr>
-        <w:t>CE4 (Inválida - Anómala inferior):</w:t>
-      </w:r>
-      <w:r>
-        <w:t xml:space="preserve"> </w:t>
-      </w:r>
-      <m:oMath>
-        <m:r>
-          <w:rPr>
-            <w:rFonts w:ascii="Cambria Math" w:hAnsi="Cambria Math"/>
-          </w:rPr>
-          <m:t>≤-90.0</m:t>
-        </m:r>
-      </m:oMath>
-      <w:r>
-        <w:t xml:space="preserve"> (AVL: -90.0, -90.01) </w:t>
-      </w:r>
-      <m:oMath>
-        <m:r>
-          <w:rPr>
-            <w:rFonts w:ascii="Cambria Math" w:hAnsi="Cambria Math"/>
-          </w:rPr>
-          <m:t>→</m:t>
-        </m:r>
-      </m:oMath>
-      <w:r>
-        <w:t xml:space="preserve"> Muestra "-". </w:t>
-      </w:r>
-    </w:p>
-    <w:p>
-      <w:pPr>
-        <w:numPr>
-          <w:ilvl w:val="0"/>
-          <w:numId w:val="21"/>
-        </w:numPr>
-        <w:spacing w:after="120"/>
-        <w:jc w:val="both"/>
-      </w:pPr>
-      <w:r>
-        <w:rPr>
-          <w:b/>
-          <w:bCs/>
-        </w:rPr>
-        <w:t>CE5 (Inválida - Anómala superior):</w:t>
-      </w:r>
-      <w:r>
-        <w:t xml:space="preserve"> </w:t>
-      </w:r>
-      <m:oMath>
-        <m:r>
-          <w:rPr>
-            <w:rFonts w:ascii="Cambria Math" w:hAnsi="Cambria Math"/>
-          </w:rPr>
-          <m:t>≥90.0</m:t>
-        </m:r>
-      </m:oMath>
-      <w:r>
-        <w:t xml:space="preserve"> (AVL: 90.0, 90.01) </w:t>
-      </w:r>
-      <m:oMath>
-        <m:r>
-          <w:rPr>
-            <w:rFonts w:ascii="Cambria Math" w:hAnsi="Cambria Math"/>
-          </w:rPr>
-          <m:t>→</m:t>
-        </m:r>
-      </m:oMath>
-      <w:r>
-        <w:t xml:space="preserve"> Muestra "-". </w:t>
-      </w:r>
-    </w:p>
-    <w:p>
-      <w:pPr>
-        <w:numPr>
-          <w:ilvl w:val="0"/>
-          <w:numId w:val="21"/>
-        </w:numPr>
-        <w:spacing w:after="120"/>
-        <w:jc w:val="both"/>
-      </w:pPr>
-      <w:r>
-        <w:rPr>
-          <w:b/>
-          <w:bCs/>
-        </w:rPr>
-        <w:t>CE6 (Inválida - Ausente):</w:t>
-      </w:r>
-      <w:r>
-        <w:t xml:space="preserve"> Dato no disponible (centinela de ausencia) </w:t>
-      </w:r>
-      <m:oMath>
-        <m:r>
-          <w:rPr>
-            <w:rFonts w:ascii="Cambria Math" w:hAnsi="Cambria Math"/>
-          </w:rPr>
-          <m:t>→</m:t>
-        </m:r>
-      </m:oMath>
-      <w:r>
-        <w:t xml:space="preserve"> Muestra "-". </w:t>
-      </w:r>
-    </w:p>
-    <w:p>
-      <w:pPr>
-        <w:spacing w:after="120"/>
-        <w:jc w:val="both"/>
-      </w:pPr>
-      <w:r>
-        <w:rPr>
-          <w:b/>
-          <w:bCs/>
-        </w:rPr>
-        <w:t>Longitud (double longitude):</w:t>
-      </w:r>
-    </w:p>
-    <w:p>
-      <w:pPr>
-        <w:numPr>
-          <w:ilvl w:val="0"/>
-          <w:numId w:val="22"/>
-        </w:numPr>
-        <w:spacing w:after="120"/>
-        <w:jc w:val="both"/>
-      </w:pPr>
-      <w:r>
-        <w:rPr>
-          <w:b/>
-          <w:bCs/>
-        </w:rPr>
-        <w:t>CE7 (Válida):</w:t>
-      </w:r>
-      <w:r>
-        <w:t xml:space="preserve"> (-180, 180) (AVL: -179.99, nominal -3.72783615, 179.99) </w:t>
-      </w:r>
-      <m:oMath>
-        <m:r>
-          <w:rPr>
-            <w:rFonts w:ascii="Cambria Math" w:hAnsi="Cambria Math"/>
-          </w:rPr>
-          <m:t>→</m:t>
-        </m:r>
-      </m:oMath>
-      <w:r>
-        <w:t xml:space="preserve"> Muestra el valor. </w:t>
-      </w:r>
-    </w:p>
-    <w:p>
-      <w:pPr>
-        <w:numPr>
-          <w:ilvl w:val="0"/>
-          <w:numId w:val="22"/>
-        </w:numPr>
-        <w:spacing w:after="120"/>
-        <w:jc w:val="both"/>
-      </w:pPr>
-      <w:r>
-        <w:rPr>
-          <w:b/>
-          <w:bCs/>
-        </w:rPr>
-        <w:t>CE8 (Inválida - Anómala inferior):</w:t>
-      </w:r>
-      <w:r>
-        <w:t xml:space="preserve"> </w:t>
-      </w:r>
-      <m:oMath>
-        <m:r>
-          <w:rPr>
-            <w:rFonts w:ascii="Cambria Math" w:hAnsi="Cambria Math"/>
-          </w:rPr>
-          <m:t>≤-180.0</m:t>
-        </m:r>
-      </m:oMath>
-      <w:r>
-        <w:t xml:space="preserve"> (AVL: -180.0, -180.01) </w:t>
-      </w:r>
-      <m:oMath>
-        <m:r>
-          <w:rPr>
-            <w:rFonts w:ascii="Cambria Math" w:hAnsi="Cambria Math"/>
-          </w:rPr>
-          <m:t>→</m:t>
-        </m:r>
-      </m:oMath>
-      <w:r>
-        <w:t xml:space="preserve"> Muestra "-". </w:t>
-      </w:r>
-    </w:p>
-    <w:p>
-      <w:pPr>
-        <w:numPr>
-          <w:ilvl w:val="0"/>
-          <w:numId w:val="22"/>
-        </w:numPr>
-        <w:spacing w:after="120"/>
-        <w:jc w:val="both"/>
-      </w:pPr>
-      <w:r>
-        <w:rPr>
-          <w:b/>
-          <w:bCs/>
-        </w:rPr>
-        <w:t>CE9 (Inválida - Anómala superior):</w:t>
-      </w:r>
-      <w:r>
-        <w:t xml:space="preserve"> </w:t>
-      </w:r>
-      <m:oMath>
-        <m:r>
-          <w:rPr>
-            <w:rFonts w:ascii="Cambria Math" w:hAnsi="Cambria Math"/>
-          </w:rPr>
-          <m:t>≥180.0</m:t>
-        </m:r>
-      </m:oMath>
-      <w:r>
-        <w:t xml:space="preserve"> (AVL: 180.0, 180.01) </w:t>
-      </w:r>
-      <m:oMath>
-        <m:r>
-          <w:rPr>
-            <w:rFonts w:ascii="Cambria Math" w:hAnsi="Cambria Math"/>
-          </w:rPr>
-          <m:t>→</m:t>
-        </m:r>
-      </m:oMath>
-      <w:r>
-        <w:t xml:space="preserve"> Muestra "-". </w:t>
-      </w:r>
-    </w:p>
-    <w:p>
-      <w:pPr>
-        <w:numPr>
-          <w:ilvl w:val="0"/>
-          <w:numId w:val="22"/>
-        </w:numPr>
-        <w:spacing w:after="120"/>
-        <w:jc w:val="both"/>
-      </w:pPr>
-      <w:r>
-        <w:rPr>
-          <w:b/>
-          <w:bCs/>
-        </w:rPr>
-        <w:t>CE10 (Inválida - Ausente):</w:t>
-      </w:r>
-      <w:r>
-        <w:t xml:space="preserve"> Dato no disponible (centinela de ausencia) </w:t>
-      </w:r>
-      <m:oMath>
-        <m:r>
-          <w:rPr>
-            <w:rFonts w:ascii="Cambria Math" w:hAnsi="Cambria Math"/>
-          </w:rPr>
-          <m:t>→</m:t>
-        </m:r>
-      </m:oMath>
-      <w:r>
-        <w:t xml:space="preserve"> Muestra "-". </w:t>
-      </w:r>
-    </w:p>
-    <w:p>
-      <w:pPr>
-        <w:spacing w:after="120"/>
-        <w:jc w:val="both"/>
-      </w:pPr>
-      <w:r>
-        <w:rPr>
-          <w:b/>
-          <w:bCs/>
-        </w:rPr>
-        <w:t>Bicicletas disponibles (int free_bikes) y Huecos libres (int empty_slots):</w:t>
-      </w:r>
-    </w:p>
-    <w:p>
-      <w:pPr>
-        <w:numPr>
-          <w:ilvl w:val="0"/>
-          <w:numId w:val="23"/>
-        </w:numPr>
-        <w:spacing w:after="120"/>
-        <w:jc w:val="both"/>
-      </w:pPr>
-      <w:r>
-        <w:rPr>
-          <w:b/>
-          <w:bCs/>
-        </w:rPr>
-        <w:t>CE11 (Válida):</w:t>
-      </w:r>
-      <w:r>
-        <w:t xml:space="preserve"> </w:t>
-      </w:r>
-      <m:oMath>
-        <m:r>
-          <w:rPr>
-            <w:rFonts w:ascii="Cambria Math" w:hAnsi="Cambria Math"/>
-          </w:rPr>
-          <m:t>≥0</m:t>
-        </m:r>
-      </m:oMath>
-      <w:r>
-        <w:t xml:space="preserve"> (AVL: límite inferior 0, nominal 18) </w:t>
-      </w:r>
-      <m:oMath>
-        <m:r>
-          <w:rPr>
-            <w:rFonts w:ascii="Cambria Math" w:hAnsi="Cambria Math"/>
-          </w:rPr>
-          <m:t>→</m:t>
-        </m:r>
-      </m:oMath>
-      <w:r>
-        <w:t xml:space="preserve"> Muestra el valor. </w:t>
-      </w:r>
-    </w:p>
-    <w:p>
-      <w:pPr>
-        <w:numPr>
-          <w:ilvl w:val="0"/>
-          <w:numId w:val="23"/>
-        </w:numPr>
-        <w:spacing w:after="120"/>
-        <w:jc w:val="both"/>
-      </w:pPr>
-      <w:r>
-        <w:rPr>
-          <w:b/>
-          <w:bCs/>
-        </w:rPr>
-        <w:lastRenderedPageBreak/>
-        <w:t>CE12 (Inválida - Anómala negativa):</w:t>
-      </w:r>
-      <w:r>
-        <w:t xml:space="preserve"> </w:t>
-      </w:r>
-      <m:oMath>
-        <m:r>
-          <w:rPr>
-            <w:rFonts w:ascii="Cambria Math" w:hAnsi="Cambria Math"/>
-          </w:rPr>
-          <m:t>&lt;0</m:t>
-        </m:r>
-      </m:oMath>
-      <w:r>
-        <w:t xml:space="preserve"> (AVL: -1) </w:t>
-      </w:r>
-      <m:oMath>
-        <m:r>
-          <w:rPr>
-            <w:rFonts w:ascii="Cambria Math" w:hAnsi="Cambria Math"/>
-          </w:rPr>
-          <m:t>→</m:t>
-        </m:r>
-      </m:oMath>
-      <w:r>
-        <w:t xml:space="preserve"> Muestra "-". </w:t>
-      </w:r>
-    </w:p>
-    <w:p>
-      <w:pPr>
-        <w:numPr>
-          <w:ilvl w:val="0"/>
-          <w:numId w:val="23"/>
-        </w:numPr>
-        <w:spacing w:after="120"/>
-        <w:jc w:val="both"/>
-      </w:pPr>
-      <w:r>
-        <w:rPr>
-          <w:b/>
-          <w:bCs/>
-        </w:rPr>
-        <w:t>CE13 (Inválida - Ausente):</w:t>
-      </w:r>
-      <w:r>
-        <w:t xml:space="preserve"> Dato no disponible (centinela de ausencia) </w:t>
-      </w:r>
-      <m:oMath>
-        <m:r>
-          <w:rPr>
-            <w:rFonts w:ascii="Cambria Math" w:hAnsi="Cambria Math"/>
-          </w:rPr>
-          <m:t>→</m:t>
-        </m:r>
-      </m:oMath>
-      <w:r>
-        <w:t xml:space="preserve"> Muestra "-". </w:t>
-      </w:r>
-    </w:p>
-    <w:p>
-      <w:pPr>
-        <w:spacing w:after="120"/>
-        <w:jc w:val="both"/>
-      </w:pPr>
-      <w:r>
-        <w:rPr>
-          <w:b/>
-          <w:bCs/>
-        </w:rPr>
-        <w:t>Hora de última actualización (String timestamp):</w:t>
-      </w:r>
-    </w:p>
-    <w:p>
-      <w:pPr>
-        <w:numPr>
-          <w:ilvl w:val="0"/>
-          <w:numId w:val="24"/>
-        </w:numPr>
-        <w:spacing w:after="120"/>
-        <w:jc w:val="both"/>
-      </w:pPr>
-      <w:r>
-        <w:rPr>
-          <w:b/>
-          <w:bCs/>
-        </w:rPr>
-        <w:t>CE14 (Válida):</w:t>
-      </w:r>
-      <w:r>
-        <w:t xml:space="preserve"> Cadena presente no vacía ("2026-09-24T11:11:40.490774+00:00Z") </w:t>
-      </w:r>
-      <m:oMath>
-        <m:r>
-          <w:rPr>
-            <w:rFonts w:ascii="Cambria Math" w:hAnsi="Cambria Math"/>
-          </w:rPr>
-          <m:t>→</m:t>
-        </m:r>
-      </m:oMath>
-      <w:r>
-        <w:t xml:space="preserve"> Muestra el valor. </w:t>
-      </w:r>
-    </w:p>
-    <w:p>
-      <w:pPr>
-        <w:numPr>
-          <w:ilvl w:val="0"/>
-          <w:numId w:val="24"/>
-        </w:numPr>
-        <w:spacing w:after="120"/>
-        <w:jc w:val="both"/>
-      </w:pPr>
-      <w:r>
-        <w:rPr>
-          <w:b/>
-          <w:bCs/>
-        </w:rPr>
-        <w:t>CE15 (Inválida - Ausente):</w:t>
-      </w:r>
-      <w:r>
-        <w:t xml:space="preserve"> null o vacía </w:t>
-      </w:r>
-      <m:oMath>
-        <m:r>
-          <w:rPr>
-            <w:rFonts w:ascii="Cambria Math" w:hAnsi="Cambria Math"/>
-          </w:rPr>
-          <m:t>→</m:t>
-        </m:r>
-      </m:oMath>
-      <w:r>
-        <w:t xml:space="preserve"> Muestra "-". </w:t>
+        <w:t>CE4 (Inválida):</w:t>
+      </w:r>
+      <w:r>
+        <w:t xml:space="preserve"> Devuelve false. Se notifica el error de ubicación pero se continúa con la carga de la red.</w:t>
+      </w:r>
+    </w:p>
+    <w:p>
+      <w:pPr>
+        <w:spacing w:after="120"/>
+        <w:jc w:val="both"/>
+      </w:pPr>
+      <w:r>
+        <w:t>A.2. Casos de Prueba Unitarios</w:t>
       </w:r>
     </w:p>
     <w:tbl>
       <w:tblPr>
         <w:tblStyle w:val="Tablaconcuadrcula"/>
-        <w:tblW w:w="9524" w:type="dxa"/>
+        <w:tblW w:w="0" w:type="auto"/>
         <w:tblLook w:val="04A0" w:firstRow="1" w:lastRow="0" w:firstColumn="1" w:lastColumn="0" w:noHBand="0" w:noVBand="1"/>
       </w:tblPr>
       <w:tblGrid>
-        <w:gridCol w:w="3023"/>
-        <w:gridCol w:w="3056"/>
-        <w:gridCol w:w="3445"/>
+        <w:gridCol w:w="2824"/>
+        <w:gridCol w:w="2827"/>
+        <w:gridCol w:w="2843"/>
       </w:tblGrid>
       <w:tr>
-        <w:trPr>
-          <w:trHeight w:val="405"/>
-        </w:trPr>
         <w:tc>
           <w:tcPr>
-            <w:tcW w:w="3023" w:type="dxa"/>
+            <w:tcW w:w="2831" w:type="dxa"/>
           </w:tcPr>
           <w:p>
             <w:pPr>
@@ -2412,13 +2304,13 @@
               <w:jc w:val="both"/>
             </w:pPr>
             <w:r>
-              <w:t>ID Caso</w:t>
+              <w:t>Caso de pruebas</w:t>
             </w:r>
           </w:p>
         </w:tc>
         <w:tc>
           <w:tcPr>
-            <w:tcW w:w="3056" w:type="dxa"/>
+            <w:tcW w:w="2831" w:type="dxa"/>
           </w:tcPr>
           <w:p>
             <w:pPr>
@@ -2426,13 +2318,13 @@
               <w:jc w:val="both"/>
             </w:pPr>
             <w:r>
-              <w:t xml:space="preserve">Entrada </w:t>
+              <w:t>Entrada</w:t>
             </w:r>
           </w:p>
         </w:tc>
         <w:tc>
           <w:tcPr>
-            <w:tcW w:w="3445" w:type="dxa"/>
+            <w:tcW w:w="2832" w:type="dxa"/>
           </w:tcPr>
           <w:p>
             <w:pPr>
@@ -2440,18 +2332,15 @@
               <w:jc w:val="both"/>
             </w:pPr>
             <w:r>
-              <w:t>Valor esperado</w:t>
+              <w:t>Salida esperada</w:t>
             </w:r>
           </w:p>
         </w:tc>
       </w:tr>
       <w:tr>
-        <w:trPr>
-          <w:trHeight w:val="405"/>
-        </w:trPr>
         <w:tc>
           <w:tcPr>
-            <w:tcW w:w="3023" w:type="dxa"/>
+            <w:tcW w:w="2831" w:type="dxa"/>
           </w:tcPr>
           <w:p>
             <w:pPr>
@@ -2459,27 +2348,46 @@
               <w:jc w:val="both"/>
             </w:pPr>
             <w:r>
-              <w:t>UT-00</w:t>
+              <w:t>UT-01</w:t>
             </w:r>
           </w:p>
         </w:tc>
         <w:tc>
           <w:tcPr>
-            <w:tcW w:w="3056" w:type="dxa"/>
+            <w:tcW w:w="2831" w:type="dxa"/>
           </w:tcPr>
           <w:p>
             <w:pPr>
               <w:spacing w:after="120"/>
               <w:jc w:val="both"/>
             </w:pPr>
-            <w:r>
-              <w:t>Se pasa a init() un objeto Station real con latitud 40.3809, longitud -3.7278 y bicicletas = 0.</w:t>
+            <w:proofErr w:type="spellStart"/>
+            <w:r>
+              <w:t>NetworkAvailable</w:t>
+            </w:r>
+            <w:proofErr w:type="spellEnd"/>
+            <w:r>
+              <w:t xml:space="preserve"> = true</w:t>
+            </w:r>
+          </w:p>
+          <w:p>
+            <w:pPr>
+              <w:spacing w:after="120"/>
+              <w:jc w:val="both"/>
+            </w:pPr>
+            <w:proofErr w:type="spellStart"/>
+            <w:r>
+              <w:t>LocationAvailable</w:t>
+            </w:r>
+            <w:proofErr w:type="spellEnd"/>
+            <w:r>
+              <w:t xml:space="preserve"> = true</w:t>
             </w:r>
           </w:p>
         </w:tc>
         <w:tc>
           <w:tcPr>
-            <w:tcW w:w="3445" w:type="dxa"/>
+            <w:tcW w:w="2832" w:type="dxa"/>
           </w:tcPr>
           <w:p>
             <w:pPr>
@@ -2487,18 +2395,35 @@
               <w:jc w:val="both"/>
             </w:pPr>
             <w:r>
-              <w:t>Se verifica que se invoca mockView.showLatitude("40.3809") y mockView.showFreeBikes("0").</w:t>
+              <w:t xml:space="preserve">Se debe invocar </w:t>
+            </w:r>
+            <w:proofErr w:type="spellStart"/>
+            <w:r>
+              <w:t>view.init</w:t>
+            </w:r>
+            <w:proofErr w:type="spellEnd"/>
+            <w:r>
+              <w:t xml:space="preserve">() y ejecutar el método interno de carga llamando a </w:t>
+            </w:r>
+            <w:proofErr w:type="spellStart"/>
+            <w:r>
+              <w:t>repository.requestNetwork</w:t>
+            </w:r>
+            <w:proofErr w:type="spellEnd"/>
+            <w:r>
+              <w:t xml:space="preserve">(). </w:t>
+            </w:r>
+            <w:r>
+              <w:lastRenderedPageBreak/>
+              <w:t>No se debe invocar ningún mensaje de erro</w:t>
             </w:r>
           </w:p>
         </w:tc>
       </w:tr>
       <w:tr>
-        <w:trPr>
-          <w:trHeight w:val="405"/>
-        </w:trPr>
         <w:tc>
           <w:tcPr>
-            <w:tcW w:w="3023" w:type="dxa"/>
+            <w:tcW w:w="2831" w:type="dxa"/>
           </w:tcPr>
           <w:p>
             <w:pPr>
@@ -2506,27 +2431,50 @@
               <w:jc w:val="both"/>
             </w:pPr>
             <w:r>
-              <w:t>UT-01</w:t>
+              <w:lastRenderedPageBreak/>
+              <w:t>UT-02</w:t>
             </w:r>
           </w:p>
         </w:tc>
         <w:tc>
           <w:tcPr>
-            <w:tcW w:w="3056" w:type="dxa"/>
+            <w:tcW w:w="2831" w:type="dxa"/>
           </w:tcPr>
           <w:p>
             <w:pPr>
               <w:spacing w:after="120"/>
               <w:jc w:val="both"/>
             </w:pPr>
-            <w:r>
-              <w:t>Se pasa un objeto Station donde todos los atributos evaluables son null.</w:t>
+            <w:proofErr w:type="spellStart"/>
+            <w:r>
+              <w:t>NetworkAvailable</w:t>
+            </w:r>
+            <w:proofErr w:type="spellEnd"/>
+            <w:r>
+              <w:t xml:space="preserve"> = true</w:t>
+            </w:r>
+          </w:p>
+          <w:p>
+            <w:pPr>
+              <w:spacing w:after="120"/>
+              <w:jc w:val="both"/>
+            </w:pPr>
+            <w:proofErr w:type="spellStart"/>
+            <w:r>
+              <w:t>LocationAvailable</w:t>
+            </w:r>
+            <w:proofErr w:type="spellEnd"/>
+            <w:r>
+              <w:t xml:space="preserve"> = </w:t>
+            </w:r>
+            <w:r>
+              <w:t>false</w:t>
             </w:r>
           </w:p>
         </w:tc>
         <w:tc>
           <w:tcPr>
-            <w:tcW w:w="3445" w:type="dxa"/>
+            <w:tcW w:w="2832" w:type="dxa"/>
           </w:tcPr>
           <w:p>
             <w:pPr>
@@ -2534,18 +2482,42 @@
               <w:jc w:val="both"/>
             </w:pPr>
             <w:r>
-              <w:t>Se verifica que se invoca mockView.showLatitude("-") y mockView.showFreeBikes("-").</w:t>
+              <w:t xml:space="preserve">Se invoca </w:t>
+            </w:r>
+            <w:proofErr w:type="spellStart"/>
+            <w:r>
+              <w:t>view.init</w:t>
+            </w:r>
+            <w:proofErr w:type="spellEnd"/>
+            <w:r>
+              <w:t xml:space="preserve">() y detecta la falta de GPS invocando </w:t>
+            </w:r>
+            <w:proofErr w:type="spellStart"/>
+            <w:r>
+              <w:t>view.showLocationError</w:t>
+            </w:r>
+            <w:proofErr w:type="spellEnd"/>
+            <w:r>
+              <w:t xml:space="preserve">().  </w:t>
+            </w:r>
+            <w:r>
+              <w:t xml:space="preserve">Posteriormente, continúa el flujo y ejecuta </w:t>
+            </w:r>
+            <w:proofErr w:type="spellStart"/>
+            <w:r>
+              <w:t>repository.requestNetwork</w:t>
+            </w:r>
+            <w:proofErr w:type="spellEnd"/>
+            <w:r>
+              <w:t>().</w:t>
             </w:r>
           </w:p>
         </w:tc>
       </w:tr>
       <w:tr>
-        <w:trPr>
-          <w:trHeight w:val="405"/>
-        </w:trPr>
         <w:tc>
           <w:tcPr>
-            <w:tcW w:w="3023" w:type="dxa"/>
+            <w:tcW w:w="2831" w:type="dxa"/>
           </w:tcPr>
           <w:p>
             <w:pPr>
@@ -2553,48 +2525,52 @@
               <w:jc w:val="both"/>
             </w:pPr>
             <w:r>
-              <w:t>UT-02</w:t>
+              <w:t>UT-03</w:t>
             </w:r>
           </w:p>
         </w:tc>
         <w:tc>
           <w:tcPr>
-            <w:tcW w:w="3056" w:type="dxa"/>
+            <w:tcW w:w="2831" w:type="dxa"/>
           </w:tcPr>
           <w:p>
             <w:pPr>
               <w:spacing w:after="120"/>
               <w:jc w:val="both"/>
             </w:pPr>
-            <w:r>
-              <w:t>Objeto Station con latitud =</w:t>
-            </w:r>
-            <w:r>
-              <w:t xml:space="preserve"> </w:t>
-            </w:r>
-            <w:r>
-              <w:t>9</w:t>
-            </w:r>
-            <w:r>
-              <w:t>5.00</w:t>
-            </w:r>
-            <w:r>
-              <w:t>, longitud = -18</w:t>
-            </w:r>
-            <w:r>
-              <w:t>5.00</w:t>
-            </w:r>
-            <w:r>
-              <w:t xml:space="preserve"> y bicicletas = -1</w:t>
-            </w:r>
-            <w:r>
-              <w:t>.</w:t>
-            </w:r>
+            <w:proofErr w:type="spellStart"/>
+            <w:r>
+              <w:t>NetworkAvailable</w:t>
+            </w:r>
+            <w:proofErr w:type="spellEnd"/>
+            <w:r>
+              <w:t xml:space="preserve"> = false</w:t>
+            </w:r>
+          </w:p>
+          <w:p>
+            <w:pPr>
+              <w:spacing w:after="120"/>
+              <w:jc w:val="both"/>
+            </w:pPr>
+            <w:proofErr w:type="spellStart"/>
+            <w:r>
+              <w:t>LocationEnabled</w:t>
+            </w:r>
+            <w:proofErr w:type="spellEnd"/>
+            <w:r>
+              <w:t xml:space="preserve"> = (No se evalúa)</w:t>
+            </w:r>
+          </w:p>
+          <w:p>
+            <w:pPr>
+              <w:spacing w:after="120"/>
+              <w:jc w:val="both"/>
+            </w:pPr>
           </w:p>
         </w:tc>
         <w:tc>
           <w:tcPr>
-            <w:tcW w:w="3445" w:type="dxa"/>
+            <w:tcW w:w="2832" w:type="dxa"/>
           </w:tcPr>
           <w:p>
             <w:pPr>
@@ -2602,104 +2578,41 @@
               <w:jc w:val="both"/>
             </w:pPr>
             <w:r>
-              <w:t>Se verifica que la lógica detecta los valores anómalos (límite superior en latitud y límite inferior en longitud/bicicletas) e invoca los métodos de la vista</w:t>
-            </w:r>
-            <w:r>
-              <w:t xml:space="preserve"> pasándoles el guion ("-") para esos campos concretos.</w:t>
-            </w:r>
-          </w:p>
-        </w:tc>
-      </w:tr>
-      <w:tr>
-        <w:trPr>
-          <w:trHeight w:val="405"/>
-        </w:trPr>
-        <w:tc>
-          <w:tcPr>
-            <w:tcW w:w="3023" w:type="dxa"/>
-          </w:tcPr>
-          <w:p>
-            <w:pPr>
-              <w:spacing w:after="120"/>
-              <w:jc w:val="both"/>
-            </w:pPr>
-            <w:r>
-              <w:t>UT-03</w:t>
-            </w:r>
-          </w:p>
-        </w:tc>
-        <w:tc>
-          <w:tcPr>
-            <w:tcW w:w="3056" w:type="dxa"/>
-          </w:tcPr>
-          <w:p>
-            <w:pPr>
-              <w:spacing w:after="120"/>
-              <w:jc w:val="both"/>
-            </w:pPr>
-            <w:r>
-              <w:t>Station con latitud = 90.01 y longitud = 180.01.</w:t>
-            </w:r>
-          </w:p>
-        </w:tc>
-        <w:tc>
-          <w:tcPr>
-            <w:tcW w:w="3445" w:type="dxa"/>
-          </w:tcPr>
-          <w:p>
-            <w:pPr>
-              <w:spacing w:after="120"/>
-              <w:jc w:val="both"/>
-            </w:pPr>
-            <w:r>
-              <w:t>Se verifica que la lógica detecta el AVL superior e invoca mockView.showLatitude("-") y mockView.showLongitude("-"), manteniendo intactos los datos como el nombre.</w:t>
-            </w:r>
-          </w:p>
-        </w:tc>
-      </w:tr>
-      <w:tr>
-        <w:trPr>
-          <w:trHeight w:val="405"/>
-        </w:trPr>
-        <w:tc>
-          <w:tcPr>
-            <w:tcW w:w="3023" w:type="dxa"/>
-          </w:tcPr>
-          <w:p>
-            <w:pPr>
-              <w:spacing w:after="120"/>
-              <w:jc w:val="both"/>
-            </w:pPr>
-            <w:r>
-              <w:t>UT-04</w:t>
-            </w:r>
-          </w:p>
-        </w:tc>
-        <w:tc>
-          <w:tcPr>
-            <w:tcW w:w="3056" w:type="dxa"/>
-          </w:tcPr>
-          <w:p>
-            <w:pPr>
-              <w:spacing w:after="120"/>
-              <w:jc w:val="both"/>
-            </w:pPr>
-            <w:r>
-              <w:t>Se invoca init(null).</w:t>
-            </w:r>
-          </w:p>
-        </w:tc>
-        <w:tc>
-          <w:tcPr>
-            <w:tcW w:w="3445" w:type="dxa"/>
-          </w:tcPr>
-          <w:p>
-            <w:pPr>
-              <w:spacing w:after="120"/>
-              <w:jc w:val="both"/>
-            </w:pPr>
-            <w:r>
-              <w:t>Se verifica que el presentador invoca mockView.showInternalError().</w:t>
+              <w:t xml:space="preserve">La lógica invoca </w:t>
+            </w:r>
+            <w:proofErr w:type="spellStart"/>
+            <w:r>
+              <w:t>view.init</w:t>
+            </w:r>
+            <w:proofErr w:type="spellEnd"/>
+            <w:r>
+              <w:t xml:space="preserve">() y detecta la falta de conexión, invocando </w:t>
+            </w:r>
+            <w:proofErr w:type="spellStart"/>
+            <w:r>
+              <w:t>view.showRedError</w:t>
+            </w:r>
+            <w:proofErr w:type="spellEnd"/>
+            <w:r>
+              <w:t xml:space="preserve">(). La ejecución se detiene y </w:t>
+            </w:r>
+            <w:r>
+              <w:rPr>
+                <w:b/>
+                <w:bCs/>
+              </w:rPr>
+              <w:t>nunca</w:t>
+            </w:r>
+            <w:r>
+              <w:t xml:space="preserve"> se llama a </w:t>
+            </w:r>
+            <w:proofErr w:type="spellStart"/>
+            <w:r>
+              <w:t>repository.requestNetwork</w:t>
+            </w:r>
+            <w:proofErr w:type="spellEnd"/>
+            <w:r>
+              <w:t>().</w:t>
             </w:r>
           </w:p>
         </w:tc>
@@ -3656,6 +3569,155 @@
     </w:lvl>
   </w:abstractNum>
   <w:abstractNum w:abstractNumId="5" w15:restartNumberingAfterBreak="0">
+    <w:nsid w:val="174203D9"/>
+    <w:multiLevelType w:val="multilevel"/>
+    <w:tmpl w:val="8758C034"/>
+    <w:lvl w:ilvl="0">
+      <w:start w:val="1"/>
+      <w:numFmt w:val="bullet"/>
+      <w:lvlText w:val=""/>
+      <w:lvlJc w:val="left"/>
+      <w:pPr>
+        <w:tabs>
+          <w:tab w:val="num" w:pos="720"/>
+        </w:tabs>
+        <w:ind w:left="720" w:hanging="360"/>
+      </w:pPr>
+      <w:rPr>
+        <w:rFonts w:ascii="Symbol" w:hAnsi="Symbol" w:hint="default"/>
+        <w:sz w:val="20"/>
+      </w:rPr>
+    </w:lvl>
+    <w:lvl w:ilvl="1">
+      <w:start w:val="1"/>
+      <w:numFmt w:val="bullet"/>
+      <w:lvlText w:val="o"/>
+      <w:lvlJc w:val="left"/>
+      <w:pPr>
+        <w:tabs>
+          <w:tab w:val="num" w:pos="1440"/>
+        </w:tabs>
+        <w:ind w:left="1440" w:hanging="360"/>
+      </w:pPr>
+      <w:rPr>
+        <w:rFonts w:ascii="Courier New" w:hAnsi="Courier New" w:hint="default"/>
+        <w:sz w:val="20"/>
+      </w:rPr>
+    </w:lvl>
+    <w:lvl w:ilvl="2" w:tentative="1">
+      <w:start w:val="1"/>
+      <w:numFmt w:val="bullet"/>
+      <w:lvlText w:val=""/>
+      <w:lvlJc w:val="left"/>
+      <w:pPr>
+        <w:tabs>
+          <w:tab w:val="num" w:pos="2160"/>
+        </w:tabs>
+        <w:ind w:left="2160" w:hanging="360"/>
+      </w:pPr>
+      <w:rPr>
+        <w:rFonts w:ascii="Wingdings" w:hAnsi="Wingdings" w:hint="default"/>
+        <w:sz w:val="20"/>
+      </w:rPr>
+    </w:lvl>
+    <w:lvl w:ilvl="3" w:tentative="1">
+      <w:start w:val="1"/>
+      <w:numFmt w:val="bullet"/>
+      <w:lvlText w:val=""/>
+      <w:lvlJc w:val="left"/>
+      <w:pPr>
+        <w:tabs>
+          <w:tab w:val="num" w:pos="2880"/>
+        </w:tabs>
+        <w:ind w:left="2880" w:hanging="360"/>
+      </w:pPr>
+      <w:rPr>
+        <w:rFonts w:ascii="Wingdings" w:hAnsi="Wingdings" w:hint="default"/>
+        <w:sz w:val="20"/>
+      </w:rPr>
+    </w:lvl>
+    <w:lvl w:ilvl="4" w:tentative="1">
+      <w:start w:val="1"/>
+      <w:numFmt w:val="bullet"/>
+      <w:lvlText w:val=""/>
+      <w:lvlJc w:val="left"/>
+      <w:pPr>
+        <w:tabs>
+          <w:tab w:val="num" w:pos="3600"/>
+        </w:tabs>
+        <w:ind w:left="3600" w:hanging="360"/>
+      </w:pPr>
+      <w:rPr>
+        <w:rFonts w:ascii="Wingdings" w:hAnsi="Wingdings" w:hint="default"/>
+        <w:sz w:val="20"/>
+      </w:rPr>
+    </w:lvl>
+    <w:lvl w:ilvl="5" w:tentative="1">
+      <w:start w:val="1"/>
+      <w:numFmt w:val="bullet"/>
+      <w:lvlText w:val=""/>
+      <w:lvlJc w:val="left"/>
+      <w:pPr>
+        <w:tabs>
+          <w:tab w:val="num" w:pos="4320"/>
+        </w:tabs>
+        <w:ind w:left="4320" w:hanging="360"/>
+      </w:pPr>
+      <w:rPr>
+        <w:rFonts w:ascii="Wingdings" w:hAnsi="Wingdings" w:hint="default"/>
+        <w:sz w:val="20"/>
+      </w:rPr>
+    </w:lvl>
+    <w:lvl w:ilvl="6" w:tentative="1">
+      <w:start w:val="1"/>
+      <w:numFmt w:val="bullet"/>
+      <w:lvlText w:val=""/>
+      <w:lvlJc w:val="left"/>
+      <w:pPr>
+        <w:tabs>
+          <w:tab w:val="num" w:pos="5040"/>
+        </w:tabs>
+        <w:ind w:left="5040" w:hanging="360"/>
+      </w:pPr>
+      <w:rPr>
+        <w:rFonts w:ascii="Wingdings" w:hAnsi="Wingdings" w:hint="default"/>
+        <w:sz w:val="20"/>
+      </w:rPr>
+    </w:lvl>
+    <w:lvl w:ilvl="7" w:tentative="1">
+      <w:start w:val="1"/>
+      <w:numFmt w:val="bullet"/>
+      <w:lvlText w:val=""/>
+      <w:lvlJc w:val="left"/>
+      <w:pPr>
+        <w:tabs>
+          <w:tab w:val="num" w:pos="5760"/>
+        </w:tabs>
+        <w:ind w:left="5760" w:hanging="360"/>
+      </w:pPr>
+      <w:rPr>
+        <w:rFonts w:ascii="Wingdings" w:hAnsi="Wingdings" w:hint="default"/>
+        <w:sz w:val="20"/>
+      </w:rPr>
+    </w:lvl>
+    <w:lvl w:ilvl="8" w:tentative="1">
+      <w:start w:val="1"/>
+      <w:numFmt w:val="bullet"/>
+      <w:lvlText w:val=""/>
+      <w:lvlJc w:val="left"/>
+      <w:pPr>
+        <w:tabs>
+          <w:tab w:val="num" w:pos="6480"/>
+        </w:tabs>
+        <w:ind w:left="6480" w:hanging="360"/>
+      </w:pPr>
+      <w:rPr>
+        <w:rFonts w:ascii="Wingdings" w:hAnsi="Wingdings" w:hint="default"/>
+        <w:sz w:val="20"/>
+      </w:rPr>
+    </w:lvl>
+  </w:abstractNum>
+  <w:abstractNum w:abstractNumId="6" w15:restartNumberingAfterBreak="0">
     <w:nsid w:val="204A7903"/>
     <w:multiLevelType w:val="multilevel"/>
     <w:tmpl w:val="6CFC9AEE"/>
@@ -3804,7 +3866,7 @@
       </w:rPr>
     </w:lvl>
   </w:abstractNum>
-  <w:abstractNum w:abstractNumId="6" w15:restartNumberingAfterBreak="0">
+  <w:abstractNum w:abstractNumId="7" w15:restartNumberingAfterBreak="0">
     <w:nsid w:val="234A1450"/>
     <w:multiLevelType w:val="multilevel"/>
     <w:tmpl w:val="DA080848"/>
@@ -3917,7 +3979,7 @@
       </w:pPr>
     </w:lvl>
   </w:abstractNum>
-  <w:abstractNum w:abstractNumId="7" w15:restartNumberingAfterBreak="0">
+  <w:abstractNum w:abstractNumId="8" w15:restartNumberingAfterBreak="0">
     <w:nsid w:val="24811E55"/>
     <w:multiLevelType w:val="multilevel"/>
     <w:tmpl w:val="BF1C2792"/>
@@ -4030,7 +4092,7 @@
       </w:pPr>
     </w:lvl>
   </w:abstractNum>
-  <w:abstractNum w:abstractNumId="8" w15:restartNumberingAfterBreak="0">
+  <w:abstractNum w:abstractNumId="9" w15:restartNumberingAfterBreak="0">
     <w:nsid w:val="2ADA3418"/>
     <w:multiLevelType w:val="multilevel"/>
     <w:tmpl w:val="8716D794"/>
@@ -4179,7 +4241,7 @@
       </w:rPr>
     </w:lvl>
   </w:abstractNum>
-  <w:abstractNum w:abstractNumId="9" w15:restartNumberingAfterBreak="0">
+  <w:abstractNum w:abstractNumId="10" w15:restartNumberingAfterBreak="0">
     <w:nsid w:val="34D62573"/>
     <w:multiLevelType w:val="multilevel"/>
     <w:tmpl w:val="381045CE"/>
@@ -4292,7 +4354,7 @@
       </w:pPr>
     </w:lvl>
   </w:abstractNum>
-  <w:abstractNum w:abstractNumId="10" w15:restartNumberingAfterBreak="0">
+  <w:abstractNum w:abstractNumId="11" w15:restartNumberingAfterBreak="0">
     <w:nsid w:val="3D44168C"/>
     <w:multiLevelType w:val="hybridMultilevel"/>
     <w:tmpl w:val="E938914C"/>
@@ -4381,7 +4443,7 @@
       </w:pPr>
     </w:lvl>
   </w:abstractNum>
-  <w:abstractNum w:abstractNumId="11" w15:restartNumberingAfterBreak="0">
+  <w:abstractNum w:abstractNumId="12" w15:restartNumberingAfterBreak="0">
     <w:nsid w:val="3E050527"/>
     <w:multiLevelType w:val="multilevel"/>
     <w:tmpl w:val="A4D867E4"/>
@@ -4494,7 +4556,7 @@
       </w:pPr>
     </w:lvl>
   </w:abstractNum>
-  <w:abstractNum w:abstractNumId="12" w15:restartNumberingAfterBreak="0">
+  <w:abstractNum w:abstractNumId="13" w15:restartNumberingAfterBreak="0">
     <w:nsid w:val="42F27314"/>
     <w:multiLevelType w:val="multilevel"/>
     <w:tmpl w:val="9A925B30"/>
@@ -4607,7 +4669,7 @@
       </w:pPr>
     </w:lvl>
   </w:abstractNum>
-  <w:abstractNum w:abstractNumId="13" w15:restartNumberingAfterBreak="0">
+  <w:abstractNum w:abstractNumId="14" w15:restartNumberingAfterBreak="0">
     <w:nsid w:val="4554665C"/>
     <w:multiLevelType w:val="hybridMultilevel"/>
     <w:tmpl w:val="9530D958"/>
@@ -4696,7 +4758,7 @@
       </w:pPr>
     </w:lvl>
   </w:abstractNum>
-  <w:abstractNum w:abstractNumId="14" w15:restartNumberingAfterBreak="0">
+  <w:abstractNum w:abstractNumId="15" w15:restartNumberingAfterBreak="0">
     <w:nsid w:val="46F27228"/>
     <w:multiLevelType w:val="multilevel"/>
     <w:tmpl w:val="DA080848"/>
@@ -4809,7 +4871,7 @@
       </w:pPr>
     </w:lvl>
   </w:abstractNum>
-  <w:abstractNum w:abstractNumId="15" w15:restartNumberingAfterBreak="0">
+  <w:abstractNum w:abstractNumId="16" w15:restartNumberingAfterBreak="0">
     <w:nsid w:val="4AF72EF0"/>
     <w:multiLevelType w:val="multilevel"/>
     <w:tmpl w:val="BF1C2792"/>
@@ -4922,7 +4984,7 @@
       </w:pPr>
     </w:lvl>
   </w:abstractNum>
-  <w:abstractNum w:abstractNumId="16" w15:restartNumberingAfterBreak="0">
+  <w:abstractNum w:abstractNumId="17" w15:restartNumberingAfterBreak="0">
     <w:nsid w:val="57356332"/>
     <w:multiLevelType w:val="multilevel"/>
     <w:tmpl w:val="809C590E"/>
@@ -5071,7 +5133,7 @@
       </w:rPr>
     </w:lvl>
   </w:abstractNum>
-  <w:abstractNum w:abstractNumId="17" w15:restartNumberingAfterBreak="0">
+  <w:abstractNum w:abstractNumId="18" w15:restartNumberingAfterBreak="0">
     <w:nsid w:val="5A5C530C"/>
     <w:multiLevelType w:val="multilevel"/>
     <w:tmpl w:val="725A7746"/>
@@ -5184,7 +5246,7 @@
       </w:pPr>
     </w:lvl>
   </w:abstractNum>
-  <w:abstractNum w:abstractNumId="18" w15:restartNumberingAfterBreak="0">
+  <w:abstractNum w:abstractNumId="19" w15:restartNumberingAfterBreak="0">
     <w:nsid w:val="657F0833"/>
     <w:multiLevelType w:val="multilevel"/>
     <w:tmpl w:val="812E69B8"/>
@@ -5333,7 +5395,7 @@
       </w:rPr>
     </w:lvl>
   </w:abstractNum>
-  <w:abstractNum w:abstractNumId="19" w15:restartNumberingAfterBreak="0">
+  <w:abstractNum w:abstractNumId="20" w15:restartNumberingAfterBreak="0">
     <w:nsid w:val="682240AC"/>
     <w:multiLevelType w:val="multilevel"/>
     <w:tmpl w:val="9A925B30"/>
@@ -5446,7 +5508,7 @@
       </w:pPr>
     </w:lvl>
   </w:abstractNum>
-  <w:abstractNum w:abstractNumId="20" w15:restartNumberingAfterBreak="0">
+  <w:abstractNum w:abstractNumId="21" w15:restartNumberingAfterBreak="0">
     <w:nsid w:val="74DF63E0"/>
     <w:multiLevelType w:val="multilevel"/>
     <w:tmpl w:val="A11AF2EE"/>
@@ -5559,7 +5621,7 @@
       </w:pPr>
     </w:lvl>
   </w:abstractNum>
-  <w:abstractNum w:abstractNumId="21" w15:restartNumberingAfterBreak="0">
+  <w:abstractNum w:abstractNumId="22" w15:restartNumberingAfterBreak="0">
     <w:nsid w:val="75A50A45"/>
     <w:multiLevelType w:val="multilevel"/>
     <w:tmpl w:val="66D8D8FC"/>
@@ -5708,7 +5770,7 @@
       </w:rPr>
     </w:lvl>
   </w:abstractNum>
-  <w:abstractNum w:abstractNumId="22" w15:restartNumberingAfterBreak="0">
+  <w:abstractNum w:abstractNumId="23" w15:restartNumberingAfterBreak="0">
     <w:nsid w:val="77A67E4B"/>
     <w:multiLevelType w:val="hybridMultilevel"/>
     <w:tmpl w:val="7E388D94"/>
@@ -5821,7 +5883,7 @@
       </w:rPr>
     </w:lvl>
   </w:abstractNum>
-  <w:abstractNum w:abstractNumId="23" w15:restartNumberingAfterBreak="0">
+  <w:abstractNum w:abstractNumId="24" w15:restartNumberingAfterBreak="0">
     <w:nsid w:val="797F59BE"/>
     <w:multiLevelType w:val="multilevel"/>
     <w:tmpl w:val="BF1C2792"/>
@@ -5935,13 +5997,13 @@
     </w:lvl>
   </w:abstractNum>
   <w:num w:numId="1" w16cid:durableId="101069171">
-    <w:abstractNumId w:val="22"/>
+    <w:abstractNumId w:val="23"/>
   </w:num>
   <w:num w:numId="2" w16cid:durableId="1786266961">
-    <w:abstractNumId w:val="10"/>
+    <w:abstractNumId w:val="11"/>
   </w:num>
   <w:num w:numId="3" w16cid:durableId="149911408">
-    <w:abstractNumId w:val="13"/>
+    <w:abstractNumId w:val="14"/>
   </w:num>
   <w:num w:numId="4" w16cid:durableId="1362392822">
     <w:abstractNumId w:val="2"/>
@@ -5950,10 +6012,10 @@
     <w:abstractNumId w:val="1"/>
   </w:num>
   <w:num w:numId="6" w16cid:durableId="1825970913">
-    <w:abstractNumId w:val="8"/>
+    <w:abstractNumId w:val="9"/>
   </w:num>
   <w:num w:numId="7" w16cid:durableId="179005006">
-    <w:abstractNumId w:val="17"/>
+    <w:abstractNumId w:val="18"/>
   </w:num>
   <w:num w:numId="8" w16cid:durableId="192427632">
     <w:abstractNumId w:val="0"/>
@@ -5962,49 +6024,52 @@
     <w:abstractNumId w:val="3"/>
   </w:num>
   <w:num w:numId="10" w16cid:durableId="1473521700">
-    <w:abstractNumId w:val="19"/>
+    <w:abstractNumId w:val="20"/>
   </w:num>
   <w:num w:numId="11" w16cid:durableId="2043509950">
+    <w:abstractNumId w:val="7"/>
+  </w:num>
+  <w:num w:numId="12" w16cid:durableId="1002396041">
+    <w:abstractNumId w:val="16"/>
+  </w:num>
+  <w:num w:numId="13" w16cid:durableId="1718354045">
+    <w:abstractNumId w:val="10"/>
+  </w:num>
+  <w:num w:numId="14" w16cid:durableId="1499031107">
+    <w:abstractNumId w:val="21"/>
+  </w:num>
+  <w:num w:numId="15" w16cid:durableId="1244684611">
+    <w:abstractNumId w:val="12"/>
+  </w:num>
+  <w:num w:numId="16" w16cid:durableId="337344084">
+    <w:abstractNumId w:val="13"/>
+  </w:num>
+  <w:num w:numId="17" w16cid:durableId="663365070">
+    <w:abstractNumId w:val="15"/>
+  </w:num>
+  <w:num w:numId="18" w16cid:durableId="1671444411">
+    <w:abstractNumId w:val="8"/>
+  </w:num>
+  <w:num w:numId="19" w16cid:durableId="314184064">
+    <w:abstractNumId w:val="24"/>
+  </w:num>
+  <w:num w:numId="20" w16cid:durableId="519975828">
     <w:abstractNumId w:val="6"/>
   </w:num>
-  <w:num w:numId="12" w16cid:durableId="1002396041">
-    <w:abstractNumId w:val="15"/>
-  </w:num>
-  <w:num w:numId="13" w16cid:durableId="1718354045">
-    <w:abstractNumId w:val="9"/>
-  </w:num>
-  <w:num w:numId="14" w16cid:durableId="1499031107">
-    <w:abstractNumId w:val="20"/>
-  </w:num>
-  <w:num w:numId="15" w16cid:durableId="1244684611">
-    <w:abstractNumId w:val="11"/>
-  </w:num>
-  <w:num w:numId="16" w16cid:durableId="337344084">
-    <w:abstractNumId w:val="12"/>
-  </w:num>
-  <w:num w:numId="17" w16cid:durableId="663365070">
-    <w:abstractNumId w:val="14"/>
-  </w:num>
-  <w:num w:numId="18" w16cid:durableId="1671444411">
-    <w:abstractNumId w:val="7"/>
-  </w:num>
-  <w:num w:numId="19" w16cid:durableId="314184064">
-    <w:abstractNumId w:val="23"/>
-  </w:num>
-  <w:num w:numId="20" w16cid:durableId="519975828">
-    <w:abstractNumId w:val="5"/>
-  </w:num>
   <w:num w:numId="21" w16cid:durableId="1765613013">
-    <w:abstractNumId w:val="21"/>
+    <w:abstractNumId w:val="22"/>
   </w:num>
   <w:num w:numId="22" w16cid:durableId="1177501438">
     <w:abstractNumId w:val="4"/>
   </w:num>
   <w:num w:numId="23" w16cid:durableId="654530660">
-    <w:abstractNumId w:val="18"/>
+    <w:abstractNumId w:val="19"/>
   </w:num>
   <w:num w:numId="24" w16cid:durableId="1952206721">
-    <w:abstractNumId w:val="16"/>
+    <w:abstractNumId w:val="17"/>
+  </w:num>
+  <w:num w:numId="25" w16cid:durableId="146554995">
+    <w:abstractNumId w:val="5"/>
   </w:num>
   <w:numIdMacAtCleanup w:val="5"/>
 </w:numbering>
@@ -7134,10 +7199,23 @@
 </file>
 
 <file path=customXml/item1.xml><?xml version="1.0" encoding="utf-8"?>
-<b:Sources xmlns:b="http://schemas.openxmlformats.org/officeDocument/2006/bibliography" xmlns="http://schemas.openxmlformats.org/officeDocument/2006/bibliography" SelectedStyle="\APA.XSL" StyleName="APA"/>
+<p:properties xmlns:p="http://schemas.microsoft.com/office/2006/metadata/properties" xmlns:xsi="http://www.w3.org/2001/XMLSchema-instance" xmlns:pc="http://schemas.microsoft.com/office/infopath/2007/PartnerControls">
+  <documentManagement>
+    <_activity xmlns="30c7f0a5-0460-48b3-ae5a-8da933a9cabc" xsi:nil="true"/>
+  </documentManagement>
+</p:properties>
 </file>
 
 <file path=customXml/item2.xml><?xml version="1.0" encoding="utf-8"?>
+<?mso-contentType ?>
+<FormTemplates xmlns="http://schemas.microsoft.com/sharepoint/v3/contenttype/forms">
+  <Display>DocumentLibraryForm</Display>
+  <Edit>DocumentLibraryForm</Edit>
+  <New>DocumentLibraryForm</New>
+</FormTemplates>
+</file>
+
+<file path=customXml/item3.xml><?xml version="1.0" encoding="utf-8"?>
 <ct:contentTypeSchema xmlns:ct="http://schemas.microsoft.com/office/2006/metadata/contentType" xmlns:ma="http://schemas.microsoft.com/office/2006/metadata/properties/metaAttributes" ct:_="" ma:_="" ma:contentTypeName="Documento" ma:contentTypeID="0x0101008A2DA2A88A7CD04691DDBB156CC2F629" ma:contentTypeVersion="14" ma:contentTypeDescription="Crear nuevo documento." ma:contentTypeScope="" ma:versionID="fa623cfde9ee52739a10639550e20630">
   <xsd:schema xmlns:xsd="http://www.w3.org/2001/XMLSchema" xmlns:xs="http://www.w3.org/2001/XMLSchema" xmlns:p="http://schemas.microsoft.com/office/2006/metadata/properties" xmlns:ns3="30c7f0a5-0460-48b3-ae5a-8da933a9cabc" xmlns:ns4="39664786-3c2d-494e-ba5d-eb5dc194af34" targetNamespace="http://schemas.microsoft.com/office/2006/metadata/properties" ma:root="true" ma:fieldsID="c8c51738a68246b2391ceec60ea14cb1" ns3:_="" ns4:_="">
     <xsd:import namespace="30c7f0a5-0460-48b3-ae5a-8da933a9cabc"/>
@@ -7364,32 +7442,29 @@
 </ct:contentTypeSchema>
 </file>
 
-<file path=customXml/item3.xml><?xml version="1.0" encoding="utf-8"?>
-<?mso-contentType ?>
-<FormTemplates xmlns="http://schemas.microsoft.com/sharepoint/v3/contenttype/forms">
-  <Display>DocumentLibraryForm</Display>
-  <Edit>DocumentLibraryForm</Edit>
-  <New>DocumentLibraryForm</New>
-</FormTemplates>
-</file>
-
 <file path=customXml/item4.xml><?xml version="1.0" encoding="utf-8"?>
-<p:properties xmlns:p="http://schemas.microsoft.com/office/2006/metadata/properties" xmlns:xsi="http://www.w3.org/2001/XMLSchema-instance" xmlns:pc="http://schemas.microsoft.com/office/infopath/2007/PartnerControls">
-  <documentManagement>
-    <_activity xmlns="30c7f0a5-0460-48b3-ae5a-8da933a9cabc" xsi:nil="true"/>
-  </documentManagement>
-</p:properties>
+<b:Sources xmlns:b="http://schemas.openxmlformats.org/officeDocument/2006/bibliography" xmlns="http://schemas.openxmlformats.org/officeDocument/2006/bibliography" SelectedStyle="\APA.XSL" StyleName="APA"/>
 </file>
 
 <file path=customXml/itemProps1.xml><?xml version="1.0" encoding="utf-8"?>
-<ds:datastoreItem xmlns:ds="http://schemas.openxmlformats.org/officeDocument/2006/customXml" ds:itemID="{77A3A6AA-CDB9-49FB-87E4-79E2EC2B1332}">
+<ds:datastoreItem xmlns:ds="http://schemas.openxmlformats.org/officeDocument/2006/customXml" ds:itemID="{0AEF3F1B-7B5E-4948-945B-936A86A38E7B}">
   <ds:schemaRefs>
-    <ds:schemaRef ds:uri="http://schemas.openxmlformats.org/officeDocument/2006/bibliography"/>
+    <ds:schemaRef ds:uri="http://schemas.microsoft.com/office/2006/metadata/properties"/>
+    <ds:schemaRef ds:uri="http://schemas.microsoft.com/office/infopath/2007/PartnerControls"/>
+    <ds:schemaRef ds:uri="30c7f0a5-0460-48b3-ae5a-8da933a9cabc"/>
   </ds:schemaRefs>
 </ds:datastoreItem>
 </file>
 
 <file path=customXml/itemProps2.xml><?xml version="1.0" encoding="utf-8"?>
+<ds:datastoreItem xmlns:ds="http://schemas.openxmlformats.org/officeDocument/2006/customXml" ds:itemID="{695A9024-BD60-4F4D-91DC-4B272A3D739F}">
+  <ds:schemaRefs>
+    <ds:schemaRef ds:uri="http://schemas.microsoft.com/sharepoint/v3/contenttype/forms"/>
+  </ds:schemaRefs>
+</ds:datastoreItem>
+</file>
+
+<file path=customXml/itemProps3.xml><?xml version="1.0" encoding="utf-8"?>
 <ds:datastoreItem xmlns:ds="http://schemas.openxmlformats.org/officeDocument/2006/customXml" ds:itemID="{21CE6CD8-F626-4B53-A0C7-27C8F699CD0D}">
   <ds:schemaRefs>
     <ds:schemaRef ds:uri="http://schemas.microsoft.com/office/2006/metadata/contentType"/>
@@ -7408,20 +7483,10 @@
 </ds:datastoreItem>
 </file>
 
-<file path=customXml/itemProps3.xml><?xml version="1.0" encoding="utf-8"?>
-<ds:datastoreItem xmlns:ds="http://schemas.openxmlformats.org/officeDocument/2006/customXml" ds:itemID="{695A9024-BD60-4F4D-91DC-4B272A3D739F}">
+<file path=customXml/itemProps4.xml><?xml version="1.0" encoding="utf-8"?>
+<ds:datastoreItem xmlns:ds="http://schemas.openxmlformats.org/officeDocument/2006/customXml" ds:itemID="{77A3A6AA-CDB9-49FB-87E4-79E2EC2B1332}">
   <ds:schemaRefs>
-    <ds:schemaRef ds:uri="http://schemas.microsoft.com/sharepoint/v3/contenttype/forms"/>
-  </ds:schemaRefs>
-</ds:datastoreItem>
-</file>
-
-<file path=customXml/itemProps4.xml><?xml version="1.0" encoding="utf-8"?>
-<ds:datastoreItem xmlns:ds="http://schemas.openxmlformats.org/officeDocument/2006/customXml" ds:itemID="{0AEF3F1B-7B5E-4948-945B-936A86A38E7B}">
-  <ds:schemaRefs>
-    <ds:schemaRef ds:uri="http://schemas.microsoft.com/office/2006/metadata/properties"/>
-    <ds:schemaRef ds:uri="http://schemas.microsoft.com/office/infopath/2007/PartnerControls"/>
-    <ds:schemaRef ds:uri="30c7f0a5-0460-48b3-ae5a-8da933a9cabc"/>
+    <ds:schemaRef ds:uri="http://schemas.openxmlformats.org/officeDocument/2006/bibliography"/>
   </ds:schemaRefs>
 </ds:datastoreItem>
 </file>
</xml_diff>

<commit_message>
Arreglados los test y ampliado el plan de pruebas con correcciones
</commit_message>
<xml_diff>
--- a/Docs/Test Plans/US532236-VerDetallesDeEstacion-TestPlan.docx
+++ b/Docs/Test Plans/US532236-VerDetallesDeEstacion-TestPlan.docx
@@ -546,13 +546,8 @@
         <w:t xml:space="preserve">e la lista de estaciones de </w:t>
       </w:r>
       <w:r>
-        <w:t xml:space="preserve">la red </w:t>
-      </w:r>
-      <w:proofErr w:type="spellStart"/>
-      <w:r>
-        <w:t>BiciMAD</w:t>
-      </w:r>
-      <w:proofErr w:type="spellEnd"/>
+        <w:t>la red BiciMAD</w:t>
+      </w:r>
       <w:r>
         <w:t>.</w:t>
       </w:r>
@@ -792,25 +787,20 @@
         <w:t xml:space="preserve">El técnico selecciona </w:t>
       </w:r>
       <w:r>
-        <w:t>la estación ”</w:t>
-      </w:r>
-      <w:r>
-        <w:t>377 - Metro Abrantes</w:t>
-      </w:r>
-      <w:r>
-        <w:t>” d</w:t>
+        <w:t xml:space="preserve">la estación </w:t>
+      </w:r>
+      <w:r>
+        <w:t>"390 - Estacion datos ausentes"</w:t>
+      </w:r>
+      <w:r>
+        <w:t xml:space="preserve"> d</w:t>
       </w:r>
       <w:r>
         <w:t xml:space="preserve">e la lista de estaciones de </w:t>
       </w:r>
       <w:r>
-        <w:t xml:space="preserve">la red </w:t>
-      </w:r>
-      <w:proofErr w:type="spellStart"/>
-      <w:r>
-        <w:t>BiciMAD</w:t>
-      </w:r>
-      <w:proofErr w:type="spellEnd"/>
+        <w:t>la red BiciMAD</w:t>
+      </w:r>
       <w:r>
         <w:t>.</w:t>
       </w:r>
@@ -826,7 +816,19 @@
         <w:jc w:val="both"/>
       </w:pPr>
       <w:r>
-        <w:t xml:space="preserve">La aplicación detecta que hay datos de la estación anómalos y muestra los datos normales junto con un guion ("-") en los anómalos: </w:t>
+        <w:t xml:space="preserve">La aplicación detecta que hay datos de la estación </w:t>
+      </w:r>
+      <w:r>
+        <w:t>ausentes</w:t>
+      </w:r>
+      <w:r>
+        <w:t xml:space="preserve"> y muestra los datos normales junto con un guion ("-") en los </w:t>
+      </w:r>
+      <w:r>
+        <w:t>ausentes</w:t>
+      </w:r>
+      <w:r>
+        <w:t xml:space="preserve">: </w:t>
       </w:r>
     </w:p>
     <w:p>
@@ -860,13 +862,10 @@
         <w:jc w:val="both"/>
       </w:pPr>
       <w:r>
-        <w:t>El nombre es “</w:t>
-      </w:r>
-      <w:r>
-        <w:t>377 - Metro Abrantes</w:t>
-      </w:r>
-      <w:r>
-        <w:t>”</w:t>
+        <w:t xml:space="preserve">El nombre es </w:t>
+      </w:r>
+      <w:r>
+        <w:t>"390 - Estacion datos ausentes"</w:t>
       </w:r>
     </w:p>
     <w:p>
@@ -960,7 +959,16 @@
         <w:t>no disponibles</w:t>
       </w:r>
       <w:r>
-        <w:t xml:space="preserve"> (latitud, longitud, bicicletas disponibles y huecos libres) se muestra un guion ("-").</w:t>
+        <w:t xml:space="preserve"> </w:t>
+      </w:r>
+      <w:r>
+        <w:t>(</w:t>
+      </w:r>
+      <w:r>
+        <w:t>hora de última actualización, bicicletas disponibles y huecos libres</w:t>
+      </w:r>
+      <w:r>
+        <w:t>) se muestra un guion ("-").</w:t>
       </w:r>
     </w:p>
     <w:p>
@@ -991,15 +999,7 @@
         <w:jc w:val="both"/>
       </w:pPr>
       <w:r>
-        <w:t xml:space="preserve">El técnico selecciona la estación "377 - Metro Abrantes" de la lista de estaciones de la red </w:t>
-      </w:r>
-      <w:proofErr w:type="spellStart"/>
-      <w:r>
-        <w:t>BiciMAD</w:t>
-      </w:r>
-      <w:proofErr w:type="spellEnd"/>
-      <w:r>
-        <w:t xml:space="preserve"> </w:t>
+        <w:t xml:space="preserve">El técnico selecciona la estación "377 - Metro Abrantes" de la lista de estaciones de la red BiciMAD </w:t>
       </w:r>
       <w:r>
         <w:t>teniendo datos anómalos</w:t>
@@ -1061,13 +1061,10 @@
         <w:jc w:val="both"/>
       </w:pPr>
       <w:r>
-        <w:t>El nombre es “</w:t>
-      </w:r>
-      <w:r>
-        <w:t>390 - Estacion datos ausentes</w:t>
-      </w:r>
-      <w:r>
-        <w:t>”</w:t>
+        <w:t xml:space="preserve">El nombre es </w:t>
+      </w:r>
+      <w:r>
+        <w:t>"377 - Metro Abrantes"</w:t>
       </w:r>
     </w:p>
     <w:p>
@@ -1161,15 +1158,7 @@
         <w:jc w:val="both"/>
       </w:pPr>
       <w:r>
-        <w:t xml:space="preserve">El técnico selecciona la estación "377 - Metro Abrantes" de la lista de estaciones de la red </w:t>
-      </w:r>
-      <w:proofErr w:type="spellStart"/>
-      <w:r>
-        <w:t>BiciMAD</w:t>
-      </w:r>
-      <w:proofErr w:type="spellEnd"/>
-      <w:r>
-        <w:t xml:space="preserve"> estando el servicio de datos inactivo.</w:t>
+        <w:t>El técnico selecciona la estación "377 - Metro Abrantes" de la lista de estaciones de la red BiciMAD estando el servicio de datos inactivo.</w:t>
       </w:r>
     </w:p>
     <w:p>
@@ -1223,15 +1212,7 @@
         <w:jc w:val="both"/>
       </w:pPr>
       <w:r>
-        <w:t xml:space="preserve">El técnico selecciona la estación "377 - Metro Abrantes" de la lista de estaciones de la red </w:t>
-      </w:r>
-      <w:proofErr w:type="spellStart"/>
-      <w:r>
-        <w:t>BiciMAD</w:t>
-      </w:r>
-      <w:proofErr w:type="spellEnd"/>
-      <w:r>
-        <w:t xml:space="preserve"> produciéndose un fallo al acceder al servicio de datos</w:t>
+        <w:t>El técnico selecciona la estación "377 - Metro Abrantes" de la lista de estaciones de la red BiciMAD produciéndose un fallo al acceder al servicio de datos</w:t>
       </w:r>
     </w:p>
     <w:p>
@@ -1285,13 +1266,8 @@
         <w:jc w:val="both"/>
       </w:pPr>
       <w:r>
-        <w:t xml:space="preserve">Con la conexión a Internet del dispositivo desactivada, el técnico selecciona la estación "377 - Metro Abrantes" de la lista de estaciones de la red </w:t>
-      </w:r>
-      <w:proofErr w:type="spellStart"/>
-      <w:r>
-        <w:t>BiciMAD</w:t>
-      </w:r>
-      <w:proofErr w:type="spellEnd"/>
+        <w:t>Con la conexión a Internet del dispositivo desactivada, el técnico selecciona la estación "377 - Metro Abrantes" de la lista de estaciones de la red BiciMAD</w:t>
+      </w:r>
       <w:r>
         <w:t>.</w:t>
       </w:r>
@@ -1366,21 +1342,12 @@
         </w:rPr>
         <w:t xml:space="preserve">1. </w:t>
       </w:r>
-      <w:proofErr w:type="spellStart"/>
       <w:r>
         <w:rPr>
           <w:b/>
           <w:bCs/>
         </w:rPr>
-        <w:t>onCreate</w:t>
-      </w:r>
-      <w:proofErr w:type="spellEnd"/>
-      <w:r>
-        <w:rPr>
-          <w:b/>
-          <w:bCs/>
-        </w:rPr>
-        <w:t>():</w:t>
+        <w:t>onCreate():</w:t>
       </w:r>
       <w:r>
         <w:t xml:space="preserve"> Método encargado de solicitar los detalles de la estación seleccionada a la capa de negocio/persistencia, validar que los datos estén disponibles y dentro de los rangos válidos (latitud en (-90, 90), longitud en (-180, 180), bicicletas disponibles &gt;= 0 y huecos libres &gt;= 0), sustituir por un guion ("-") aquellos datos ausentes o anómalos, y ordenar a la vista mostrar la información o notificar un error interno.</w:t>
@@ -1398,21 +1365,12 @@
         </w:rPr>
         <w:t xml:space="preserve">2. </w:t>
       </w:r>
-      <w:proofErr w:type="spellStart"/>
       <w:r>
         <w:rPr>
           <w:b/>
           <w:bCs/>
         </w:rPr>
-        <w:t>Presenter.init</w:t>
-      </w:r>
-      <w:proofErr w:type="spellEnd"/>
-      <w:r>
-        <w:rPr>
-          <w:b/>
-          <w:bCs/>
-        </w:rPr>
-        <w:t>() (Ver Anexo):</w:t>
+        <w:t>Presenter.init() (Ver Anexo):</w:t>
       </w:r>
       <w:r>
         <w:t xml:space="preserve"> Método genérico de lógica de presentación encargado de validar los datos del modelo y ordenar a la vista mostrarlos o sustituirlos por guiones. Susceptible de </w:t>
@@ -1425,15 +1383,7 @@
         <w:t>prueba unitaria</w:t>
       </w:r>
       <w:r>
-        <w:t xml:space="preserve"> mediante </w:t>
-      </w:r>
-      <w:proofErr w:type="spellStart"/>
-      <w:r>
-        <w:t>Mocks</w:t>
-      </w:r>
-      <w:proofErr w:type="spellEnd"/>
-      <w:r>
-        <w:t xml:space="preserve"> aislados.</w:t>
+        <w:t xml:space="preserve"> mediante Mocks aislados.</w:t>
       </w:r>
     </w:p>
     <w:p>
@@ -1461,15 +1411,54 @@
         <w:jc w:val="both"/>
       </w:pPr>
       <w:r>
-        <w:t>Debido a que la lógica de validación se ha acoplado directamente en la Vista (</w:t>
-      </w:r>
-      <w:proofErr w:type="spellStart"/>
-      <w:r>
-        <w:t>StationDetailsView.onCreate</w:t>
-      </w:r>
-      <w:proofErr w:type="spellEnd"/>
-      <w:r>
-        <w:t>()) y no se ha implementado la capa del Presentador para esta historia de usuario, es técnicamente inviable aislar el componente para realizar pruebas unitarias. Por tanto, no se realizarán pruebas unitarias en esta historia y la funcionalidad se certificará exclusivamente mediante las pruebas de integración descritas en la siguiente sección.</w:t>
+        <w:t xml:space="preserve">Durante el diseño e implementación de esta historia de usuario, el equipo decidió prescindir de la capa de presentación (Presenter) para la vista de detalle de estación (StationDetailsView), dado que la pantalla actúa únicamente como un receptor pasivo de un objeto Station previamente descargado y empaquetado en el Intent desde la vista anterior. Al encontrarse la lógica de validación y formateo de campos acoplada directamente en el método del ciclo de vida de Android StationDetailsView.onCreate(), no existen unidades funcionales aisladas del framework susceptibles de prueba unitaria pura en esta historia. </w:t>
+      </w:r>
+    </w:p>
+    <w:p>
+      <w:pPr>
+        <w:spacing w:after="120"/>
+        <w:jc w:val="both"/>
+      </w:pPr>
+      <w:r>
+        <w:t>Siguiendo las indicaciones de la profesora durante la sesión de validación y seguimiento del plan de pruebas:</w:t>
+      </w:r>
+    </w:p>
+    <w:p>
+      <w:pPr>
+        <w:numPr>
+          <w:ilvl w:val="0"/>
+          <w:numId w:val="26"/>
+        </w:numPr>
+        <w:spacing w:after="120"/>
+        <w:jc w:val="both"/>
+      </w:pPr>
+      <w:r>
+        <w:t xml:space="preserve">La verificación del comportamiento de StationDetailsView.onCreate() se certifica mediante Pruebas de Integración (StationDetailsViewITest) utilizando Robolectric y Mockito. </w:t>
+      </w:r>
+    </w:p>
+    <w:p>
+      <w:pPr>
+        <w:numPr>
+          <w:ilvl w:val="0"/>
+          <w:numId w:val="26"/>
+        </w:numPr>
+        <w:spacing w:after="120"/>
+        <w:jc w:val="both"/>
+      </w:pPr>
+      <w:r>
+        <w:t xml:space="preserve">Con el fin de cubrir los objetivos de evaluación individual relativos a la especificación, codificación y ejecución de pruebas unitarias aisladas con uso de </w:t>
+      </w:r>
+      <w:r>
+        <w:t>m</w:t>
+      </w:r>
+      <w:r>
+        <w:t xml:space="preserve">ocks, se ha acordado documentar e implementar en el </w:t>
+      </w:r>
+      <w:r>
+        <w:t>a</w:t>
+      </w:r>
+      <w:r>
+        <w:t xml:space="preserve">nexo de este documento las pruebas unitarias correspondientes al método RedDetailsPresenter.init() (implementadas en la clase RedDetailsPresenterTest). </w:t>
       </w:r>
     </w:p>
     <w:p>
@@ -1580,17 +1569,8 @@
               <w:jc w:val="both"/>
             </w:pPr>
             <w:r>
-              <w:t xml:space="preserve">Se crea un Mock de Station con </w:t>
-            </w:r>
-            <w:proofErr w:type="spellStart"/>
-            <w:r>
-              <w:t>Mockito</w:t>
-            </w:r>
-            <w:proofErr w:type="spellEnd"/>
-            <w:r>
-              <w:t xml:space="preserve"> que, al invocar sus </w:t>
-            </w:r>
-            <w:proofErr w:type="spellStart"/>
+              <w:t xml:space="preserve">Se crea un Mock de Station con Mockito que, al invocar sus </w:t>
+            </w:r>
             <w:r>
               <w:rPr>
                 <w:i/>
@@ -1598,57 +1578,12 @@
               </w:rPr>
               <w:t>getters</w:t>
             </w:r>
-            <w:proofErr w:type="spellEnd"/>
-            <w:r>
-              <w:t xml:space="preserve">, devuelve los datos de la estación "377 - Metro Abrantes" (id = "01f5011f76069b1e81a11d4d51dd9d1d", </w:t>
-            </w:r>
-            <w:proofErr w:type="spellStart"/>
-            <w:r>
-              <w:t>latitude</w:t>
-            </w:r>
-            <w:proofErr w:type="spellEnd"/>
-            <w:r>
-              <w:t xml:space="preserve"> = 40.38091762, </w:t>
-            </w:r>
-            <w:proofErr w:type="spellStart"/>
-            <w:r>
-              <w:t>longitude</w:t>
-            </w:r>
-            <w:proofErr w:type="spellEnd"/>
-            <w:r>
-              <w:t xml:space="preserve"> = -3.72783615, </w:t>
-            </w:r>
-            <w:proofErr w:type="spellStart"/>
-            <w:r>
-              <w:t>timestamp</w:t>
-            </w:r>
-            <w:proofErr w:type="spellEnd"/>
-            <w:r>
-              <w:t xml:space="preserve"> = "2026-09-24T11:11:40.490774+00:00Z", </w:t>
-            </w:r>
-            <w:proofErr w:type="spellStart"/>
-            <w:r>
-              <w:t>freeBikes</w:t>
-            </w:r>
-            <w:proofErr w:type="spellEnd"/>
-            <w:r>
-              <w:t xml:space="preserve"> = 0, </w:t>
-            </w:r>
-            <w:proofErr w:type="spellStart"/>
-            <w:r>
-              <w:t>emptySlots</w:t>
-            </w:r>
-            <w:proofErr w:type="spellEnd"/>
-            <w:r>
-              <w:t xml:space="preserve"> = 18). El Mock se empaqueta en el </w:t>
-            </w:r>
-            <w:proofErr w:type="spellStart"/>
-            <w:r>
-              <w:t>Intent</w:t>
-            </w:r>
-            <w:proofErr w:type="spellEnd"/>
-            <w:r>
-              <w:t xml:space="preserve"> de inicio.</w:t>
+            <w:r>
+              <w:t>, devuelve los datos de la estación "377 - Metro Abrantes" (id = "01f5011f76069b1e81a11d4d51dd9d1d", latitude = 40.38091762, longitude = -3.72783615, timestamp = "2026-09-</w:t>
+            </w:r>
+            <w:r>
+              <w:lastRenderedPageBreak/>
+              <w:t>24T11:11:40.490774+00:00Z", freeBikes = 0, emptySlots = 18). El Mock se empaqueta en el Intent de inicio.</w:t>
             </w:r>
           </w:p>
         </w:tc>
@@ -1665,23 +1600,12 @@
               </w:rPr>
             </w:pPr>
             <w:r>
-              <w:t xml:space="preserve">La Actividad extrae correctamente el Mock del </w:t>
-            </w:r>
-            <w:proofErr w:type="spellStart"/>
-            <w:r>
-              <w:t>Intent</w:t>
-            </w:r>
-            <w:proofErr w:type="spellEnd"/>
-            <w:r>
-              <w:t xml:space="preserve">. La aserción verifica que el </w:t>
-            </w:r>
-            <w:proofErr w:type="spellStart"/>
-            <w:r>
-              <w:t>TextView</w:t>
-            </w:r>
-            <w:proofErr w:type="spellEnd"/>
-            <w:r>
-              <w:t xml:space="preserve"> de bicicletas disponibles muestra "0" y los demás campos muestran sus valores exactos, sin invocar el mensaje de error interno.</w:t>
+              <w:lastRenderedPageBreak/>
+              <w:t xml:space="preserve">La Actividad extrae correctamente el Mock del Intent. La aserción verifica que el TextView de bicicletas disponibles muestra "0" y los demás campos muestran sus </w:t>
+            </w:r>
+            <w:r>
+              <w:lastRenderedPageBreak/>
+              <w:t>valores exactos, sin invocar el mensaje de error interno.</w:t>
             </w:r>
           </w:p>
         </w:tc>
@@ -1700,6 +1624,7 @@
               <w:jc w:val="both"/>
             </w:pPr>
             <w:r>
+              <w:lastRenderedPageBreak/>
               <w:t>Prueba 01.</w:t>
             </w:r>
           </w:p>
@@ -1714,15 +1639,43 @@
               <w:jc w:val="both"/>
             </w:pPr>
             <w:r>
-              <w:t xml:space="preserve">Se configura un Mock de Station que devuelve </w:t>
-            </w:r>
-            <w:proofErr w:type="spellStart"/>
-            <w:r>
-              <w:t>null</w:t>
-            </w:r>
-            <w:proofErr w:type="spellEnd"/>
-            <w:r>
-              <w:t xml:space="preserve"> al consultar la latitud, longitud, hora de actualización, bicicletas y huecos.</w:t>
+              <w:t>Se configura un Mock de Station que devuelve</w:t>
+            </w:r>
+            <w:r>
+              <w:t xml:space="preserve"> los nombres de </w:t>
+            </w:r>
+            <w:r>
+              <w:t>"390 - Estacion datos ausentes"</w:t>
+            </w:r>
+            <w:r>
+              <w:t xml:space="preserve"> y la longitud y la latitud </w:t>
+            </w:r>
+            <w:r>
+              <w:t>“</w:t>
+            </w:r>
+            <w:r>
+              <w:t>40.38091762</w:t>
+            </w:r>
+            <w:r>
+              <w:t xml:space="preserve">, </w:t>
+            </w:r>
+            <w:r>
+              <w:t>-3.72783615</w:t>
+            </w:r>
+            <w:r>
+              <w:t>”</w:t>
+            </w:r>
+            <w:r>
+              <w:t xml:space="preserve"> además debe de ser</w:t>
+            </w:r>
+            <w:r>
+              <w:t xml:space="preserve"> null al consultar la</w:t>
+            </w:r>
+            <w:r>
+              <w:t xml:space="preserve"> </w:t>
+            </w:r>
+            <w:r>
+              <w:t>hora de actualización, bicicletas y huecos.</w:t>
             </w:r>
           </w:p>
         </w:tc>
@@ -1736,31 +1689,7 @@
               <w:jc w:val="both"/>
             </w:pPr>
             <w:r>
-              <w:t xml:space="preserve">La lógica del </w:t>
-            </w:r>
-            <w:proofErr w:type="spellStart"/>
-            <w:r>
-              <w:t>onCreate</w:t>
-            </w:r>
-            <w:proofErr w:type="spellEnd"/>
-            <w:r>
-              <w:t xml:space="preserve"> evalúa correctamente los nulos provenientes del Mock y asigna la cadena de recurso </w:t>
-            </w:r>
-            <w:proofErr w:type="spellStart"/>
-            <w:r>
-              <w:t>R.string.noData</w:t>
-            </w:r>
-            <w:proofErr w:type="spellEnd"/>
-            <w:r>
-              <w:t xml:space="preserve"> ("-") a los </w:t>
-            </w:r>
-            <w:proofErr w:type="spellStart"/>
-            <w:r>
-              <w:t>TextView</w:t>
-            </w:r>
-            <w:proofErr w:type="spellEnd"/>
-            <w:r>
-              <w:t xml:space="preserve"> correspondientes, validando la integración del manejo de ausencia de datos.</w:t>
+              <w:t>La lógica del onCreate evalúa correctamente los nulos provenientes del Mock y asigna la cadena de recurso R.string.noData ("-") a los TextView correspondientes, validando la integración del manejo de ausencia de datos.</w:t>
             </w:r>
           </w:p>
         </w:tc>
@@ -1793,35 +1722,7 @@
               <w:jc w:val="both"/>
             </w:pPr>
             <w:r>
-              <w:t xml:space="preserve">Se configura un Mock de Station que devuelve valores fuera del rango </w:t>
-            </w:r>
-            <w:r>
-              <w:lastRenderedPageBreak/>
-              <w:t xml:space="preserve">geográfico y lógico: </w:t>
-            </w:r>
-            <w:proofErr w:type="spellStart"/>
-            <w:r>
-              <w:t>latitude</w:t>
-            </w:r>
-            <w:proofErr w:type="spellEnd"/>
-            <w:r>
-              <w:t xml:space="preserve"> = 95.0, </w:t>
-            </w:r>
-            <w:proofErr w:type="spellStart"/>
-            <w:r>
-              <w:t>longitude</w:t>
-            </w:r>
-            <w:proofErr w:type="spellEnd"/>
-            <w:r>
-              <w:t xml:space="preserve"> = -185.0, </w:t>
-            </w:r>
-            <w:proofErr w:type="spellStart"/>
-            <w:r>
-              <w:t>freeBikes</w:t>
-            </w:r>
-            <w:proofErr w:type="spellEnd"/>
-            <w:r>
-              <w:t xml:space="preserve"> = -1.</w:t>
+              <w:t>Se configura un Mock de Station que devuelve valores fuera del rango geográfico y lógico: latitude = 95.0, longitude = -185.0, freeBikes = -1.</w:t>
             </w:r>
           </w:p>
         </w:tc>
@@ -1835,28 +1736,7 @@
               <w:jc w:val="both"/>
             </w:pPr>
             <w:r>
-              <w:lastRenderedPageBreak/>
-              <w:t xml:space="preserve">El </w:t>
-            </w:r>
-            <w:proofErr w:type="spellStart"/>
-            <w:r>
-              <w:t>onCreate</w:t>
-            </w:r>
-            <w:proofErr w:type="spellEnd"/>
-            <w:r>
-              <w:t xml:space="preserve"> integra los datos del Mock, las validaciones lógicas detectan los valores anómalos (&gt; </w:t>
-            </w:r>
-            <w:r>
-              <w:lastRenderedPageBreak/>
-              <w:t xml:space="preserve">90, &lt; -180, &lt; 0) y la vista asigna </w:t>
-            </w:r>
-            <w:proofErr w:type="spellStart"/>
-            <w:r>
-              <w:t>R.string.noData</w:t>
-            </w:r>
-            <w:proofErr w:type="spellEnd"/>
-            <w:r>
-              <w:t xml:space="preserve"> ("-") exclusivamente a esos campos, manteniendo los válidos (como el nombre o ID).</w:t>
+              <w:t>El onCreate integra los datos del Mock, las validaciones lógicas detectan los valores anómalos (&gt; 90, &lt; -180, &lt; 0) y la vista asigna R.string.noData ("-") exclusivamente a esos campos, manteniendo los válidos (como el nombre o ID).</w:t>
             </w:r>
           </w:p>
         </w:tc>
@@ -1875,7 +1755,6 @@
               <w:jc w:val="both"/>
             </w:pPr>
             <w:r>
-              <w:lastRenderedPageBreak/>
               <w:t>Prueba 03.</w:t>
             </w:r>
           </w:p>
@@ -1890,15 +1769,7 @@
               <w:jc w:val="both"/>
             </w:pPr>
             <w:r>
-              <w:t xml:space="preserve">Se lanza la Actividad con un </w:t>
-            </w:r>
-            <w:proofErr w:type="spellStart"/>
-            <w:r>
-              <w:t>Intent</w:t>
-            </w:r>
-            <w:proofErr w:type="spellEnd"/>
-            <w:r>
-              <w:t xml:space="preserve"> que no contiene ningún extra INTENT_STATION (simulando un fallo previo en la red).</w:t>
+              <w:t>Se lanza la Actividad con un Intent que no contiene ningún extra INTENT_STATION (simulando un fallo previo en la red).</w:t>
             </w:r>
           </w:p>
         </w:tc>
@@ -1915,39 +1786,7 @@
               </w:rPr>
             </w:pPr>
             <w:r>
-              <w:t xml:space="preserve">El </w:t>
-            </w:r>
-            <w:proofErr w:type="spellStart"/>
-            <w:r>
-              <w:t>onCreate</w:t>
-            </w:r>
-            <w:proofErr w:type="spellEnd"/>
-            <w:r>
-              <w:t xml:space="preserve"> detecta que el objeto extraído es </w:t>
-            </w:r>
-            <w:proofErr w:type="spellStart"/>
-            <w:r>
-              <w:t>null</w:t>
-            </w:r>
-            <w:proofErr w:type="spellEnd"/>
-            <w:r>
-              <w:t xml:space="preserve"> y ejecuta la rama de error, mostrando el </w:t>
-            </w:r>
-            <w:proofErr w:type="spellStart"/>
-            <w:r>
-              <w:t>Toast</w:t>
-            </w:r>
-            <w:proofErr w:type="spellEnd"/>
-            <w:r>
-              <w:t xml:space="preserve"> con el mensaje </w:t>
-            </w:r>
-            <w:proofErr w:type="spellStart"/>
-            <w:r>
-              <w:t>R.string.loadErrorStation</w:t>
-            </w:r>
-            <w:proofErr w:type="spellEnd"/>
-            <w:r>
-              <w:t>.</w:t>
+              <w:t>El onCreate detecta que el objeto extraído es null y ejecuta la rama de error, mostrando el Toast con el mensaje R.string.loadErrorStation.</w:t>
             </w:r>
           </w:p>
         </w:tc>
@@ -1984,32 +1823,506 @@
         <w:jc w:val="both"/>
       </w:pPr>
       <w:r>
-        <w:t xml:space="preserve">Los resultados de las pruebas de integración nos han dado a conocer que había un error en los tipos de datos, los tipos de datos que teníamos no aceptaban nulos al ser primitivos por ello debimos de cambiar aquellos tipos de datos como los </w:t>
-      </w:r>
-      <w:proofErr w:type="spellStart"/>
-      <w:r>
-        <w:t>double</w:t>
-      </w:r>
-      <w:proofErr w:type="spellEnd"/>
-      <w:r>
-        <w:t xml:space="preserve"> a Double para que pudiesen aceptar nulos.</w:t>
-      </w:r>
-    </w:p>
-    <w:p>
-      <w:pPr>
-        <w:spacing w:after="120"/>
-        <w:jc w:val="both"/>
-      </w:pPr>
-      <w:r>
-        <w:t xml:space="preserve">En la resolución de las pruebas de unitarias del método </w:t>
-      </w:r>
-      <w:proofErr w:type="spellStart"/>
-      <w:r>
-        <w:t>init</w:t>
-      </w:r>
-      <w:proofErr w:type="spellEnd"/>
-      <w:r>
-        <w:t xml:space="preserve">() de los detalles de la red no encontramos fallos </w:t>
+        <w:rPr>
+          <w:b/>
+          <w:bCs/>
+        </w:rPr>
+        <w:t>Responsables de los artefactos de prueba:</w:t>
+      </w:r>
+    </w:p>
+    <w:p>
+      <w:r>
+        <w:t>Autor del Plan de Pruebas: David García.</w:t>
+      </w:r>
+    </w:p>
+    <w:p>
+      <w:r>
+        <w:t>Autor y ejecutor de las pruebas (Unitarias, Integración y UI): David García.</w:t>
+      </w:r>
+    </w:p>
+    <w:p>
+      <w:r>
+        <w:t>Responsable de corrección de defectos en el código de producción: Aarón Alegría (implementador de la historia de usuario).</w:t>
+      </w:r>
+    </w:p>
+    <w:tbl>
+      <w:tblPr>
+        <w:tblStyle w:val="Tablaconcuadrcula"/>
+        <w:tblW w:w="0" w:type="auto"/>
+        <w:tblLook w:val="04A0" w:firstRow="1" w:lastRow="0" w:firstColumn="1" w:lastColumn="0" w:noHBand="0" w:noVBand="1"/>
+      </w:tblPr>
+      <w:tblGrid>
+        <w:gridCol w:w="1206"/>
+        <w:gridCol w:w="3870"/>
+        <w:gridCol w:w="1132"/>
+        <w:gridCol w:w="1087"/>
+        <w:gridCol w:w="1199"/>
+      </w:tblGrid>
+      <w:tr>
+        <w:tc>
+          <w:tcPr>
+            <w:tcW w:w="1206" w:type="dxa"/>
+          </w:tcPr>
+          <w:p>
+            <w:r>
+              <w:t>Nivel de Prueba</w:t>
+            </w:r>
+          </w:p>
+        </w:tc>
+        <w:tc>
+          <w:tcPr>
+            <w:tcW w:w="3870" w:type="dxa"/>
+          </w:tcPr>
+          <w:p>
+            <w:r>
+              <w:t>Clase de Prueba</w:t>
+            </w:r>
+          </w:p>
+        </w:tc>
+        <w:tc>
+          <w:tcPr>
+            <w:tcW w:w="1132" w:type="dxa"/>
+          </w:tcPr>
+          <w:p>
+            <w:pPr>
+              <w:jc w:val="center"/>
+            </w:pPr>
+            <w:r>
+              <w:t>Caso de Prueba</w:t>
+            </w:r>
+          </w:p>
+        </w:tc>
+        <w:tc>
+          <w:tcPr>
+            <w:tcW w:w="1087" w:type="dxa"/>
+          </w:tcPr>
+          <w:p>
+            <w:r>
+              <w:t>Resultado Inicial</w:t>
+            </w:r>
+          </w:p>
+        </w:tc>
+        <w:tc>
+          <w:tcPr>
+            <w:tcW w:w="1199" w:type="dxa"/>
+          </w:tcPr>
+          <w:p>
+            <w:r>
+              <w:t>Resultado Final (Post-corrección)</w:t>
+            </w:r>
+          </w:p>
+        </w:tc>
+      </w:tr>
+      <w:tr>
+        <w:tc>
+          <w:tcPr>
+            <w:tcW w:w="1206" w:type="dxa"/>
+          </w:tcPr>
+          <w:p>
+            <w:pPr>
+              <w:jc w:val="center"/>
+            </w:pPr>
+            <w:r>
+              <w:t>Integración</w:t>
+            </w:r>
+          </w:p>
+        </w:tc>
+        <w:tc>
+          <w:tcPr>
+            <w:tcW w:w="3870" w:type="dxa"/>
+          </w:tcPr>
+          <w:p>
+            <w:pPr>
+              <w:jc w:val="center"/>
+            </w:pPr>
+            <w:r>
+              <w:t>StationDetailsViewITest</w:t>
+            </w:r>
+          </w:p>
+        </w:tc>
+        <w:tc>
+          <w:tcPr>
+            <w:tcW w:w="1132" w:type="dxa"/>
+          </w:tcPr>
+          <w:p>
+            <w:r>
+              <w:t>IT-00 (Datos válidos)</w:t>
+            </w:r>
+          </w:p>
+        </w:tc>
+        <w:tc>
+          <w:tcPr>
+            <w:tcW w:w="1087" w:type="dxa"/>
+          </w:tcPr>
+          <w:p>
+            <w:r>
+              <w:t>Éxito (PASS)</w:t>
+            </w:r>
+          </w:p>
+        </w:tc>
+        <w:tc>
+          <w:tcPr>
+            <w:tcW w:w="1199" w:type="dxa"/>
+          </w:tcPr>
+          <w:p>
+            <w:r>
+              <w:t>Éxito (PASS)</w:t>
+            </w:r>
+          </w:p>
+        </w:tc>
+      </w:tr>
+      <w:tr>
+        <w:tc>
+          <w:tcPr>
+            <w:tcW w:w="1206" w:type="dxa"/>
+          </w:tcPr>
+          <w:p>
+            <w:r>
+              <w:t>Integración</w:t>
+            </w:r>
+          </w:p>
+        </w:tc>
+        <w:tc>
+          <w:tcPr>
+            <w:tcW w:w="3870" w:type="dxa"/>
+          </w:tcPr>
+          <w:p>
+            <w:r>
+              <w:t>StationDetailsViewITest</w:t>
+            </w:r>
+          </w:p>
+        </w:tc>
+        <w:tc>
+          <w:tcPr>
+            <w:tcW w:w="1132" w:type="dxa"/>
+          </w:tcPr>
+          <w:p>
+            <w:r>
+              <w:t xml:space="preserve">IT-01 (Datos </w:t>
+            </w:r>
+            <w:r>
+              <w:lastRenderedPageBreak/>
+              <w:t>ausentes / nulos)</w:t>
+            </w:r>
+          </w:p>
+        </w:tc>
+        <w:tc>
+          <w:tcPr>
+            <w:tcW w:w="1087" w:type="dxa"/>
+          </w:tcPr>
+          <w:p>
+            <w:r>
+              <w:lastRenderedPageBreak/>
+              <w:t>Fallo (FAIL)</w:t>
+            </w:r>
+          </w:p>
+        </w:tc>
+        <w:tc>
+          <w:tcPr>
+            <w:tcW w:w="1199" w:type="dxa"/>
+          </w:tcPr>
+          <w:p>
+            <w:r>
+              <w:t>Éxito (PASS)</w:t>
+            </w:r>
+          </w:p>
+        </w:tc>
+      </w:tr>
+      <w:tr>
+        <w:tc>
+          <w:tcPr>
+            <w:tcW w:w="1206" w:type="dxa"/>
+          </w:tcPr>
+          <w:p>
+            <w:r>
+              <w:t>Integración</w:t>
+            </w:r>
+          </w:p>
+        </w:tc>
+        <w:tc>
+          <w:tcPr>
+            <w:tcW w:w="3870" w:type="dxa"/>
+          </w:tcPr>
+          <w:p>
+            <w:r>
+              <w:t>StationDetailsViewITest</w:t>
+            </w:r>
+          </w:p>
+        </w:tc>
+        <w:tc>
+          <w:tcPr>
+            <w:tcW w:w="1132" w:type="dxa"/>
+          </w:tcPr>
+          <w:p>
+            <w:r>
+              <w:t xml:space="preserve">IT-02 (Datos anómalos) </w:t>
+            </w:r>
+          </w:p>
+          <w:p/>
+        </w:tc>
+        <w:tc>
+          <w:tcPr>
+            <w:tcW w:w="1087" w:type="dxa"/>
+          </w:tcPr>
+          <w:p>
+            <w:r>
+              <w:t>Fallo (FAIL)</w:t>
+            </w:r>
+          </w:p>
+        </w:tc>
+        <w:tc>
+          <w:tcPr>
+            <w:tcW w:w="1199" w:type="dxa"/>
+          </w:tcPr>
+          <w:p>
+            <w:r>
+              <w:t>Éxito (PASS)</w:t>
+            </w:r>
+          </w:p>
+        </w:tc>
+      </w:tr>
+      <w:tr>
+        <w:tc>
+          <w:tcPr>
+            <w:tcW w:w="1206" w:type="dxa"/>
+          </w:tcPr>
+          <w:p>
+            <w:r>
+              <w:t>Integración</w:t>
+            </w:r>
+          </w:p>
+        </w:tc>
+        <w:tc>
+          <w:tcPr>
+            <w:tcW w:w="3870" w:type="dxa"/>
+          </w:tcPr>
+          <w:p>
+            <w:r>
+              <w:t>StationDetailsViewITest</w:t>
+            </w:r>
+          </w:p>
+        </w:tc>
+        <w:tc>
+          <w:tcPr>
+            <w:tcW w:w="1132" w:type="dxa"/>
+          </w:tcPr>
+          <w:p>
+            <w:r>
+              <w:t>IT-03 (Sin extra / Error de carga)</w:t>
+            </w:r>
+          </w:p>
+        </w:tc>
+        <w:tc>
+          <w:tcPr>
+            <w:tcW w:w="1087" w:type="dxa"/>
+          </w:tcPr>
+          <w:p>
+            <w:r>
+              <w:t>Éxito (PASS)</w:t>
+            </w:r>
+          </w:p>
+        </w:tc>
+        <w:tc>
+          <w:tcPr>
+            <w:tcW w:w="1199" w:type="dxa"/>
+          </w:tcPr>
+          <w:p>
+            <w:r>
+              <w:t>Éxito (PASS)</w:t>
+            </w:r>
+          </w:p>
+        </w:tc>
+      </w:tr>
+      <w:tr>
+        <w:tc>
+          <w:tcPr>
+            <w:tcW w:w="1206" w:type="dxa"/>
+          </w:tcPr>
+          <w:p>
+            <w:r>
+              <w:t>Unitaria (Anexo)</w:t>
+            </w:r>
+          </w:p>
+        </w:tc>
+        <w:tc>
+          <w:tcPr>
+            <w:tcW w:w="3870" w:type="dxa"/>
+          </w:tcPr>
+          <w:p>
+            <w:r>
+              <w:t>RedDetailsPresenterTest</w:t>
+            </w:r>
+          </w:p>
+        </w:tc>
+        <w:tc>
+          <w:tcPr>
+            <w:tcW w:w="1132" w:type="dxa"/>
+          </w:tcPr>
+          <w:p>
+            <w:r>
+              <w:t>UT-01, UT-02, UT-03</w:t>
+            </w:r>
+          </w:p>
+        </w:tc>
+        <w:tc>
+          <w:tcPr>
+            <w:tcW w:w="1087" w:type="dxa"/>
+          </w:tcPr>
+          <w:p>
+            <w:r>
+              <w:t>Éxito (PASS)</w:t>
+            </w:r>
+          </w:p>
+        </w:tc>
+        <w:tc>
+          <w:tcPr>
+            <w:tcW w:w="1199" w:type="dxa"/>
+          </w:tcPr>
+          <w:p>
+            <w:r>
+              <w:t>Éxito (PASS)</w:t>
+            </w:r>
+          </w:p>
+        </w:tc>
+      </w:tr>
+      <w:tr>
+        <w:tc>
+          <w:tcPr>
+            <w:tcW w:w="1206" w:type="dxa"/>
+          </w:tcPr>
+          <w:p>
+            <w:pPr>
+              <w:jc w:val="center"/>
+            </w:pPr>
+            <w:r>
+              <w:t>Interfaz (UI)</w:t>
+            </w:r>
+          </w:p>
+        </w:tc>
+        <w:tc>
+          <w:tcPr>
+            <w:tcW w:w="3870" w:type="dxa"/>
+          </w:tcPr>
+          <w:p>
+            <w:r>
+              <w:t>VerDetalleEstacionExito00UITest</w:t>
+            </w:r>
+          </w:p>
+        </w:tc>
+        <w:tc>
+          <w:tcPr>
+            <w:tcW w:w="1132" w:type="dxa"/>
+          </w:tcPr>
+          <w:p>
+            <w:r>
+              <w:t>Prueba 00. Éxito</w:t>
+            </w:r>
+          </w:p>
+        </w:tc>
+        <w:tc>
+          <w:tcPr>
+            <w:tcW w:w="1087" w:type="dxa"/>
+          </w:tcPr>
+          <w:p>
+            <w:r>
+              <w:t>Éxito (PASS)</w:t>
+            </w:r>
+          </w:p>
+        </w:tc>
+        <w:tc>
+          <w:tcPr>
+            <w:tcW w:w="1199" w:type="dxa"/>
+          </w:tcPr>
+          <w:p>
+            <w:r>
+              <w:t>Éxito (PASS)</w:t>
+            </w:r>
+          </w:p>
+        </w:tc>
+      </w:tr>
+      <w:tr>
+        <w:tc>
+          <w:tcPr>
+            <w:tcW w:w="1206" w:type="dxa"/>
+          </w:tcPr>
+          <w:p>
+            <w:r>
+              <w:t>Interfaz (UI)</w:t>
+            </w:r>
+          </w:p>
+        </w:tc>
+        <w:tc>
+          <w:tcPr>
+            <w:tcW w:w="3870" w:type="dxa"/>
+          </w:tcPr>
+          <w:p>
+            <w:r>
+              <w:t>VerDetallesEstacionDatoAusente01UITest</w:t>
+            </w:r>
+          </w:p>
+          <w:p/>
+        </w:tc>
+        <w:tc>
+          <w:tcPr>
+            <w:tcW w:w="1132" w:type="dxa"/>
+          </w:tcPr>
+          <w:p>
+            <w:r>
+              <w:t>Prueba 01. Datos ausentes</w:t>
+            </w:r>
+          </w:p>
+        </w:tc>
+        <w:tc>
+          <w:tcPr>
+            <w:tcW w:w="1087" w:type="dxa"/>
+          </w:tcPr>
+          <w:p>
+            <w:r>
+              <w:t>Éxito (PASS)</w:t>
+            </w:r>
+          </w:p>
+        </w:tc>
+        <w:tc>
+          <w:tcPr>
+            <w:tcW w:w="1199" w:type="dxa"/>
+          </w:tcPr>
+          <w:p>
+            <w:r>
+              <w:t>Éxito (PASS)</w:t>
+            </w:r>
+          </w:p>
+        </w:tc>
+      </w:tr>
+    </w:tbl>
+    <w:p/>
+    <w:p>
+      <w:r>
+        <w:rPr>
+          <w:b/>
+          <w:bCs/>
+        </w:rPr>
+        <w:t>Ejecución de Pruebas de Integración (IT-01 e IT-02):</w:t>
+      </w:r>
+      <w:r>
+        <w:t xml:space="preserve"> Durante la primera ejecución de StationDetailsViewITest, los casos de prueba IT-01 (datos ausentes) e IT-02 (datos anómalos) resultaron fallidos. En IT-01, al configurar el Mock de Station para devolver null en atributos numéricos (</w:t>
+      </w:r>
+      <w:r>
+        <w:t xml:space="preserve">hora, </w:t>
+      </w:r>
+      <w:r>
+        <w:t>bicicletas disponibles y huecos libres), se producía un error (NullPointerException) debido a que el modelo Station utilizaba tipos de datos primitivos (double e int) que no admiten valores nulos. Asimismo, en IT-02, las condiciones de validación en StationDetailsView.onCreate() no filtraban correctamente la totalidad de los rangos anómalos (valores negativos o fuera de coordenadas geográficas), mostrando el valor erróneo en lugar del guion ("-").</w:t>
+      </w:r>
+    </w:p>
+    <w:p>
+      <w:r>
+        <w:rPr>
+          <w:b/>
+          <w:bCs/>
+        </w:rPr>
+        <w:t>Ejecución de Pruebas Unitarias (RedDetailsPresenterTest):</w:t>
+      </w:r>
+      <w:r>
+        <w:t xml:space="preserve"> En la ejecución de los casos UT-01, UT-02 y UT-03 del método init() de los detalles de la red no se detectaron fallos, cumpliendo la cobertura de caminos prevista a la primera.</w:t>
       </w:r>
     </w:p>
     <w:p>
@@ -2052,66 +2365,16 @@
           <w:bCs/>
           <w:u w:val="single"/>
         </w:rPr>
-        <w:t>(</w:t>
-      </w:r>
-      <w:proofErr w:type="spellStart"/>
-      <w:r>
-        <w:rPr>
-          <w:b/>
-          <w:bCs/>
-          <w:u w:val="single"/>
-        </w:rPr>
-        <w:t>RedDetailsPresenter</w:t>
-      </w:r>
-      <w:proofErr w:type="spellEnd"/>
-      <w:r>
-        <w:rPr>
-          <w:b/>
-          <w:bCs/>
-          <w:u w:val="single"/>
-        </w:rPr>
-        <w:t>)</w:t>
-      </w:r>
-    </w:p>
-    <w:p>
-      <w:pPr>
-        <w:spacing w:after="120"/>
-        <w:jc w:val="both"/>
-      </w:pPr>
-      <w:r>
-        <w:t xml:space="preserve">Dado que el método </w:t>
-      </w:r>
-      <w:proofErr w:type="spellStart"/>
-      <w:r>
-        <w:t>init</w:t>
-      </w:r>
-      <w:proofErr w:type="spellEnd"/>
-      <w:r>
-        <w:t xml:space="preserve">() del </w:t>
-      </w:r>
-      <w:proofErr w:type="spellStart"/>
-      <w:r>
-        <w:t>RedDetailsPresenter</w:t>
-      </w:r>
-      <w:proofErr w:type="spellEnd"/>
-      <w:r>
-        <w:t xml:space="preserve"> delega en métodos estáticos para comprobar la conectividad y la ubicación, se especifican a continuación las pruebas unitarias siguiendo técnicas de caja blanca (cobertura de caminos) y aislando sus dependencias estáticas mediante </w:t>
-      </w:r>
-      <w:proofErr w:type="spellStart"/>
-      <w:r>
-        <w:t>Mocks</w:t>
-      </w:r>
-      <w:proofErr w:type="spellEnd"/>
-      <w:r>
-        <w:t xml:space="preserve"> (</w:t>
-      </w:r>
-      <w:proofErr w:type="spellStart"/>
-      <w:r>
-        <w:t>Mockito</w:t>
-      </w:r>
-      <w:proofErr w:type="spellEnd"/>
-      <w:r>
-        <w:t>).</w:t>
+        <w:t>(RedDetailsPresenter)</w:t>
+      </w:r>
+    </w:p>
+    <w:p>
+      <w:pPr>
+        <w:spacing w:after="120"/>
+        <w:jc w:val="both"/>
+      </w:pPr>
+      <w:r>
+        <w:t>Dado que el método init() del RedDetailsPresenter delega en métodos estáticos para comprobar la conectividad y la ubicación, se especifican a continuación las pruebas unitarias siguiendo técnicas de caja blanca (cobertura de caminos) y aislando sus dependencias estáticas mediante Mocks (Mockito).</w:t>
       </w:r>
     </w:p>
     <w:p>
@@ -2141,23 +2404,7 @@
           <w:b/>
           <w:bCs/>
         </w:rPr>
-        <w:t>Conexión a Red (</w:t>
-      </w:r>
-      <w:proofErr w:type="spellStart"/>
-      <w:r>
-        <w:rPr>
-          <w:b/>
-          <w:bCs/>
-        </w:rPr>
-        <w:t>Utils.isNetworkAvailable</w:t>
-      </w:r>
-      <w:proofErr w:type="spellEnd"/>
-      <w:r>
-        <w:rPr>
-          <w:b/>
-          <w:bCs/>
-        </w:rPr>
-        <w:t>):</w:t>
+        <w:t>Conexión a Red (Utils.isNetworkAvailable):</w:t>
       </w:r>
     </w:p>
     <w:p>
@@ -2214,23 +2461,8 @@
           <w:b/>
           <w:bCs/>
         </w:rPr>
-        <w:t>Ubicación (</w:t>
-      </w:r>
-      <w:proofErr w:type="spellStart"/>
-      <w:r>
-        <w:rPr>
-          <w:b/>
-          <w:bCs/>
-        </w:rPr>
-        <w:t>Utils.isLocationEnabled</w:t>
-      </w:r>
-      <w:proofErr w:type="spellEnd"/>
-      <w:r>
-        <w:rPr>
-          <w:b/>
-          <w:bCs/>
-        </w:rPr>
-        <w:t>):</w:t>
+        <w:lastRenderedPageBreak/>
+        <w:t>Ubicación (Utils.isLocationEnabled):</w:t>
       </w:r>
     </w:p>
     <w:p>
@@ -2361,13 +2593,8 @@
               <w:spacing w:after="120"/>
               <w:jc w:val="both"/>
             </w:pPr>
-            <w:proofErr w:type="spellStart"/>
-            <w:r>
-              <w:t>NetworkAvailable</w:t>
-            </w:r>
-            <w:proofErr w:type="spellEnd"/>
-            <w:r>
-              <w:t xml:space="preserve"> = true</w:t>
+            <w:r>
+              <w:t>NetworkAvailable = true</w:t>
             </w:r>
           </w:p>
           <w:p>
@@ -2375,13 +2602,8 @@
               <w:spacing w:after="120"/>
               <w:jc w:val="both"/>
             </w:pPr>
-            <w:proofErr w:type="spellStart"/>
-            <w:r>
-              <w:t>LocationAvailable</w:t>
-            </w:r>
-            <w:proofErr w:type="spellEnd"/>
-            <w:r>
-              <w:t xml:space="preserve"> = true</w:t>
+            <w:r>
+              <w:t>LocationAvailable = true</w:t>
             </w:r>
           </w:p>
         </w:tc>
@@ -2395,27 +2617,10 @@
               <w:jc w:val="both"/>
             </w:pPr>
             <w:r>
-              <w:t xml:space="preserve">Se debe invocar </w:t>
-            </w:r>
-            <w:proofErr w:type="spellStart"/>
-            <w:r>
-              <w:t>view.init</w:t>
-            </w:r>
-            <w:proofErr w:type="spellEnd"/>
-            <w:r>
-              <w:t xml:space="preserve">() y ejecutar el método interno de carga llamando a </w:t>
-            </w:r>
-            <w:proofErr w:type="spellStart"/>
-            <w:r>
-              <w:t>repository.requestNetwork</w:t>
-            </w:r>
-            <w:proofErr w:type="spellEnd"/>
-            <w:r>
-              <w:t xml:space="preserve">(). </w:t>
-            </w:r>
-            <w:r>
-              <w:lastRenderedPageBreak/>
-              <w:t>No se debe invocar ningún mensaje de erro</w:t>
+              <w:t>Se debe invocar view.init() y ejecutar el método interno de carga llamando a repository.requestNetwork(). No se debe invocar ningún mensaje de erro</w:t>
+            </w:r>
+            <w:r>
+              <w:t>r.</w:t>
             </w:r>
           </w:p>
         </w:tc>
@@ -2431,7 +2636,6 @@
               <w:jc w:val="both"/>
             </w:pPr>
             <w:r>
-              <w:lastRenderedPageBreak/>
               <w:t>UT-02</w:t>
             </w:r>
           </w:p>
@@ -2445,13 +2649,8 @@
               <w:spacing w:after="120"/>
               <w:jc w:val="both"/>
             </w:pPr>
-            <w:proofErr w:type="spellStart"/>
-            <w:r>
-              <w:t>NetworkAvailable</w:t>
-            </w:r>
-            <w:proofErr w:type="spellEnd"/>
-            <w:r>
-              <w:t xml:space="preserve"> = true</w:t>
+            <w:r>
+              <w:t>NetworkAvailable = true</w:t>
             </w:r>
           </w:p>
           <w:p>
@@ -2459,13 +2658,8 @@
               <w:spacing w:after="120"/>
               <w:jc w:val="both"/>
             </w:pPr>
-            <w:proofErr w:type="spellStart"/>
-            <w:r>
-              <w:t>LocationAvailable</w:t>
-            </w:r>
-            <w:proofErr w:type="spellEnd"/>
-            <w:r>
-              <w:t xml:space="preserve"> = </w:t>
+            <w:r>
+              <w:t xml:space="preserve">LocationAvailable = </w:t>
             </w:r>
             <w:r>
               <w:t>false</w:t>
@@ -2482,34 +2676,10 @@
               <w:jc w:val="both"/>
             </w:pPr>
             <w:r>
-              <w:t xml:space="preserve">Se invoca </w:t>
-            </w:r>
-            <w:proofErr w:type="spellStart"/>
-            <w:r>
-              <w:t>view.init</w:t>
-            </w:r>
-            <w:proofErr w:type="spellEnd"/>
-            <w:r>
-              <w:t xml:space="preserve">() y detecta la falta de GPS invocando </w:t>
-            </w:r>
-            <w:proofErr w:type="spellStart"/>
-            <w:r>
-              <w:t>view.showLocationError</w:t>
-            </w:r>
-            <w:proofErr w:type="spellEnd"/>
-            <w:r>
-              <w:t xml:space="preserve">().  </w:t>
-            </w:r>
-            <w:r>
-              <w:t xml:space="preserve">Posteriormente, continúa el flujo y ejecuta </w:t>
-            </w:r>
-            <w:proofErr w:type="spellStart"/>
-            <w:r>
-              <w:t>repository.requestNetwork</w:t>
-            </w:r>
-            <w:proofErr w:type="spellEnd"/>
-            <w:r>
-              <w:t>().</w:t>
+              <w:t xml:space="preserve">Se invoca view.init() y detecta la falta de GPS invocando view.showLocationError().  </w:t>
+            </w:r>
+            <w:r>
+              <w:t>Posteriormente, continúa el flujo y ejecuta repository.requestNetwork().</w:t>
             </w:r>
           </w:p>
         </w:tc>
@@ -2538,13 +2708,8 @@
               <w:spacing w:after="120"/>
               <w:jc w:val="both"/>
             </w:pPr>
-            <w:proofErr w:type="spellStart"/>
-            <w:r>
-              <w:t>NetworkAvailable</w:t>
-            </w:r>
-            <w:proofErr w:type="spellEnd"/>
-            <w:r>
-              <w:t xml:space="preserve"> = false</w:t>
+            <w:r>
+              <w:t>NetworkAvailable = false</w:t>
             </w:r>
           </w:p>
           <w:p>
@@ -2552,13 +2717,8 @@
               <w:spacing w:after="120"/>
               <w:jc w:val="both"/>
             </w:pPr>
-            <w:proofErr w:type="spellStart"/>
-            <w:r>
-              <w:t>LocationEnabled</w:t>
-            </w:r>
-            <w:proofErr w:type="spellEnd"/>
-            <w:r>
-              <w:t xml:space="preserve"> = (No se evalúa)</w:t>
+            <w:r>
+              <w:t>LocationEnabled = (No se evalúa)</w:t>
             </w:r>
           </w:p>
           <w:p>
@@ -2578,23 +2738,7 @@
               <w:jc w:val="both"/>
             </w:pPr>
             <w:r>
-              <w:t xml:space="preserve">La lógica invoca </w:t>
-            </w:r>
-            <w:proofErr w:type="spellStart"/>
-            <w:r>
-              <w:t>view.init</w:t>
-            </w:r>
-            <w:proofErr w:type="spellEnd"/>
-            <w:r>
-              <w:t xml:space="preserve">() y detecta la falta de conexión, invocando </w:t>
-            </w:r>
-            <w:proofErr w:type="spellStart"/>
-            <w:r>
-              <w:t>view.showRedError</w:t>
-            </w:r>
-            <w:proofErr w:type="spellEnd"/>
-            <w:r>
-              <w:t xml:space="preserve">(). La ejecución se detiene y </w:t>
+              <w:t xml:space="preserve">La lógica invoca view.init() y detecta la falta de conexión, invocando view.showRedError(). La ejecución se detiene y </w:t>
             </w:r>
             <w:r>
               <w:rPr>
@@ -2604,15 +2748,7 @@
               <w:t>nunca</w:t>
             </w:r>
             <w:r>
-              <w:t xml:space="preserve"> se llama a </w:t>
-            </w:r>
-            <w:proofErr w:type="spellStart"/>
-            <w:r>
-              <w:t>repository.requestNetwork</w:t>
-            </w:r>
-            <w:proofErr w:type="spellEnd"/>
-            <w:r>
-              <w:t>().</w:t>
+              <w:t xml:space="preserve"> se llama a repository.requestNetwork().</w:t>
             </w:r>
           </w:p>
         </w:tc>
@@ -4355,6 +4491,119 @@
     </w:lvl>
   </w:abstractNum>
   <w:abstractNum w:abstractNumId="11" w15:restartNumberingAfterBreak="0">
+    <w:nsid w:val="3B555AFA"/>
+    <w:multiLevelType w:val="multilevel"/>
+    <w:tmpl w:val="E6DADBDE"/>
+    <w:lvl w:ilvl="0">
+      <w:start w:val="1"/>
+      <w:numFmt w:val="decimal"/>
+      <w:lvlText w:val="%1."/>
+      <w:lvlJc w:val="left"/>
+      <w:pPr>
+        <w:tabs>
+          <w:tab w:val="num" w:pos="720"/>
+        </w:tabs>
+        <w:ind w:left="720" w:hanging="360"/>
+      </w:pPr>
+    </w:lvl>
+    <w:lvl w:ilvl="1" w:tentative="1">
+      <w:start w:val="1"/>
+      <w:numFmt w:val="decimal"/>
+      <w:lvlText w:val="%2."/>
+      <w:lvlJc w:val="left"/>
+      <w:pPr>
+        <w:tabs>
+          <w:tab w:val="num" w:pos="1440"/>
+        </w:tabs>
+        <w:ind w:left="1440" w:hanging="360"/>
+      </w:pPr>
+    </w:lvl>
+    <w:lvl w:ilvl="2" w:tentative="1">
+      <w:start w:val="1"/>
+      <w:numFmt w:val="decimal"/>
+      <w:lvlText w:val="%3."/>
+      <w:lvlJc w:val="left"/>
+      <w:pPr>
+        <w:tabs>
+          <w:tab w:val="num" w:pos="2160"/>
+        </w:tabs>
+        <w:ind w:left="2160" w:hanging="360"/>
+      </w:pPr>
+    </w:lvl>
+    <w:lvl w:ilvl="3" w:tentative="1">
+      <w:start w:val="1"/>
+      <w:numFmt w:val="decimal"/>
+      <w:lvlText w:val="%4."/>
+      <w:lvlJc w:val="left"/>
+      <w:pPr>
+        <w:tabs>
+          <w:tab w:val="num" w:pos="2880"/>
+        </w:tabs>
+        <w:ind w:left="2880" w:hanging="360"/>
+      </w:pPr>
+    </w:lvl>
+    <w:lvl w:ilvl="4" w:tentative="1">
+      <w:start w:val="1"/>
+      <w:numFmt w:val="decimal"/>
+      <w:lvlText w:val="%5."/>
+      <w:lvlJc w:val="left"/>
+      <w:pPr>
+        <w:tabs>
+          <w:tab w:val="num" w:pos="3600"/>
+        </w:tabs>
+        <w:ind w:left="3600" w:hanging="360"/>
+      </w:pPr>
+    </w:lvl>
+    <w:lvl w:ilvl="5" w:tentative="1">
+      <w:start w:val="1"/>
+      <w:numFmt w:val="decimal"/>
+      <w:lvlText w:val="%6."/>
+      <w:lvlJc w:val="left"/>
+      <w:pPr>
+        <w:tabs>
+          <w:tab w:val="num" w:pos="4320"/>
+        </w:tabs>
+        <w:ind w:left="4320" w:hanging="360"/>
+      </w:pPr>
+    </w:lvl>
+    <w:lvl w:ilvl="6" w:tentative="1">
+      <w:start w:val="1"/>
+      <w:numFmt w:val="decimal"/>
+      <w:lvlText w:val="%7."/>
+      <w:lvlJc w:val="left"/>
+      <w:pPr>
+        <w:tabs>
+          <w:tab w:val="num" w:pos="5040"/>
+        </w:tabs>
+        <w:ind w:left="5040" w:hanging="360"/>
+      </w:pPr>
+    </w:lvl>
+    <w:lvl w:ilvl="7" w:tentative="1">
+      <w:start w:val="1"/>
+      <w:numFmt w:val="decimal"/>
+      <w:lvlText w:val="%8."/>
+      <w:lvlJc w:val="left"/>
+      <w:pPr>
+        <w:tabs>
+          <w:tab w:val="num" w:pos="5760"/>
+        </w:tabs>
+        <w:ind w:left="5760" w:hanging="360"/>
+      </w:pPr>
+    </w:lvl>
+    <w:lvl w:ilvl="8" w:tentative="1">
+      <w:start w:val="1"/>
+      <w:numFmt w:val="decimal"/>
+      <w:lvlText w:val="%9."/>
+      <w:lvlJc w:val="left"/>
+      <w:pPr>
+        <w:tabs>
+          <w:tab w:val="num" w:pos="6480"/>
+        </w:tabs>
+        <w:ind w:left="6480" w:hanging="360"/>
+      </w:pPr>
+    </w:lvl>
+  </w:abstractNum>
+  <w:abstractNum w:abstractNumId="12" w15:restartNumberingAfterBreak="0">
     <w:nsid w:val="3D44168C"/>
     <w:multiLevelType w:val="hybridMultilevel"/>
     <w:tmpl w:val="E938914C"/>
@@ -4443,7 +4692,7 @@
       </w:pPr>
     </w:lvl>
   </w:abstractNum>
-  <w:abstractNum w:abstractNumId="12" w15:restartNumberingAfterBreak="0">
+  <w:abstractNum w:abstractNumId="13" w15:restartNumberingAfterBreak="0">
     <w:nsid w:val="3E050527"/>
     <w:multiLevelType w:val="multilevel"/>
     <w:tmpl w:val="A4D867E4"/>
@@ -4556,7 +4805,156 @@
       </w:pPr>
     </w:lvl>
   </w:abstractNum>
-  <w:abstractNum w:abstractNumId="13" w15:restartNumberingAfterBreak="0">
+  <w:abstractNum w:abstractNumId="14" w15:restartNumberingAfterBreak="0">
+    <w:nsid w:val="40123CF5"/>
+    <w:multiLevelType w:val="multilevel"/>
+    <w:tmpl w:val="981ABCF6"/>
+    <w:lvl w:ilvl="0">
+      <w:start w:val="1"/>
+      <w:numFmt w:val="bullet"/>
+      <w:lvlText w:val=""/>
+      <w:lvlJc w:val="left"/>
+      <w:pPr>
+        <w:tabs>
+          <w:tab w:val="num" w:pos="720"/>
+        </w:tabs>
+        <w:ind w:left="720" w:hanging="360"/>
+      </w:pPr>
+      <w:rPr>
+        <w:rFonts w:ascii="Symbol" w:hAnsi="Symbol" w:hint="default"/>
+        <w:sz w:val="20"/>
+      </w:rPr>
+    </w:lvl>
+    <w:lvl w:ilvl="1" w:tentative="1">
+      <w:start w:val="1"/>
+      <w:numFmt w:val="bullet"/>
+      <w:lvlText w:val="o"/>
+      <w:lvlJc w:val="left"/>
+      <w:pPr>
+        <w:tabs>
+          <w:tab w:val="num" w:pos="1440"/>
+        </w:tabs>
+        <w:ind w:left="1440" w:hanging="360"/>
+      </w:pPr>
+      <w:rPr>
+        <w:rFonts w:ascii="Courier New" w:hAnsi="Courier New" w:hint="default"/>
+        <w:sz w:val="20"/>
+      </w:rPr>
+    </w:lvl>
+    <w:lvl w:ilvl="2" w:tentative="1">
+      <w:start w:val="1"/>
+      <w:numFmt w:val="bullet"/>
+      <w:lvlText w:val=""/>
+      <w:lvlJc w:val="left"/>
+      <w:pPr>
+        <w:tabs>
+          <w:tab w:val="num" w:pos="2160"/>
+        </w:tabs>
+        <w:ind w:left="2160" w:hanging="360"/>
+      </w:pPr>
+      <w:rPr>
+        <w:rFonts w:ascii="Wingdings" w:hAnsi="Wingdings" w:hint="default"/>
+        <w:sz w:val="20"/>
+      </w:rPr>
+    </w:lvl>
+    <w:lvl w:ilvl="3" w:tentative="1">
+      <w:start w:val="1"/>
+      <w:numFmt w:val="bullet"/>
+      <w:lvlText w:val=""/>
+      <w:lvlJc w:val="left"/>
+      <w:pPr>
+        <w:tabs>
+          <w:tab w:val="num" w:pos="2880"/>
+        </w:tabs>
+        <w:ind w:left="2880" w:hanging="360"/>
+      </w:pPr>
+      <w:rPr>
+        <w:rFonts w:ascii="Wingdings" w:hAnsi="Wingdings" w:hint="default"/>
+        <w:sz w:val="20"/>
+      </w:rPr>
+    </w:lvl>
+    <w:lvl w:ilvl="4" w:tentative="1">
+      <w:start w:val="1"/>
+      <w:numFmt w:val="bullet"/>
+      <w:lvlText w:val=""/>
+      <w:lvlJc w:val="left"/>
+      <w:pPr>
+        <w:tabs>
+          <w:tab w:val="num" w:pos="3600"/>
+        </w:tabs>
+        <w:ind w:left="3600" w:hanging="360"/>
+      </w:pPr>
+      <w:rPr>
+        <w:rFonts w:ascii="Wingdings" w:hAnsi="Wingdings" w:hint="default"/>
+        <w:sz w:val="20"/>
+      </w:rPr>
+    </w:lvl>
+    <w:lvl w:ilvl="5" w:tentative="1">
+      <w:start w:val="1"/>
+      <w:numFmt w:val="bullet"/>
+      <w:lvlText w:val=""/>
+      <w:lvlJc w:val="left"/>
+      <w:pPr>
+        <w:tabs>
+          <w:tab w:val="num" w:pos="4320"/>
+        </w:tabs>
+        <w:ind w:left="4320" w:hanging="360"/>
+      </w:pPr>
+      <w:rPr>
+        <w:rFonts w:ascii="Wingdings" w:hAnsi="Wingdings" w:hint="default"/>
+        <w:sz w:val="20"/>
+      </w:rPr>
+    </w:lvl>
+    <w:lvl w:ilvl="6" w:tentative="1">
+      <w:start w:val="1"/>
+      <w:numFmt w:val="bullet"/>
+      <w:lvlText w:val=""/>
+      <w:lvlJc w:val="left"/>
+      <w:pPr>
+        <w:tabs>
+          <w:tab w:val="num" w:pos="5040"/>
+        </w:tabs>
+        <w:ind w:left="5040" w:hanging="360"/>
+      </w:pPr>
+      <w:rPr>
+        <w:rFonts w:ascii="Wingdings" w:hAnsi="Wingdings" w:hint="default"/>
+        <w:sz w:val="20"/>
+      </w:rPr>
+    </w:lvl>
+    <w:lvl w:ilvl="7" w:tentative="1">
+      <w:start w:val="1"/>
+      <w:numFmt w:val="bullet"/>
+      <w:lvlText w:val=""/>
+      <w:lvlJc w:val="left"/>
+      <w:pPr>
+        <w:tabs>
+          <w:tab w:val="num" w:pos="5760"/>
+        </w:tabs>
+        <w:ind w:left="5760" w:hanging="360"/>
+      </w:pPr>
+      <w:rPr>
+        <w:rFonts w:ascii="Wingdings" w:hAnsi="Wingdings" w:hint="default"/>
+        <w:sz w:val="20"/>
+      </w:rPr>
+    </w:lvl>
+    <w:lvl w:ilvl="8" w:tentative="1">
+      <w:start w:val="1"/>
+      <w:numFmt w:val="bullet"/>
+      <w:lvlText w:val=""/>
+      <w:lvlJc w:val="left"/>
+      <w:pPr>
+        <w:tabs>
+          <w:tab w:val="num" w:pos="6480"/>
+        </w:tabs>
+        <w:ind w:left="6480" w:hanging="360"/>
+      </w:pPr>
+      <w:rPr>
+        <w:rFonts w:ascii="Wingdings" w:hAnsi="Wingdings" w:hint="default"/>
+        <w:sz w:val="20"/>
+      </w:rPr>
+    </w:lvl>
+  </w:abstractNum>
+  <w:abstractNum w:abstractNumId="15" w15:restartNumberingAfterBreak="0">
     <w:nsid w:val="42F27314"/>
     <w:multiLevelType w:val="multilevel"/>
     <w:tmpl w:val="9A925B30"/>
@@ -4669,7 +5067,7 @@
       </w:pPr>
     </w:lvl>
   </w:abstractNum>
-  <w:abstractNum w:abstractNumId="14" w15:restartNumberingAfterBreak="0">
+  <w:abstractNum w:abstractNumId="16" w15:restartNumberingAfterBreak="0">
     <w:nsid w:val="4554665C"/>
     <w:multiLevelType w:val="hybridMultilevel"/>
     <w:tmpl w:val="9530D958"/>
@@ -4758,7 +5156,7 @@
       </w:pPr>
     </w:lvl>
   </w:abstractNum>
-  <w:abstractNum w:abstractNumId="15" w15:restartNumberingAfterBreak="0">
+  <w:abstractNum w:abstractNumId="17" w15:restartNumberingAfterBreak="0">
     <w:nsid w:val="46F27228"/>
     <w:multiLevelType w:val="multilevel"/>
     <w:tmpl w:val="DA080848"/>
@@ -4871,7 +5269,7 @@
       </w:pPr>
     </w:lvl>
   </w:abstractNum>
-  <w:abstractNum w:abstractNumId="16" w15:restartNumberingAfterBreak="0">
+  <w:abstractNum w:abstractNumId="18" w15:restartNumberingAfterBreak="0">
     <w:nsid w:val="4AF72EF0"/>
     <w:multiLevelType w:val="multilevel"/>
     <w:tmpl w:val="BF1C2792"/>
@@ -4984,7 +5382,7 @@
       </w:pPr>
     </w:lvl>
   </w:abstractNum>
-  <w:abstractNum w:abstractNumId="17" w15:restartNumberingAfterBreak="0">
+  <w:abstractNum w:abstractNumId="19" w15:restartNumberingAfterBreak="0">
     <w:nsid w:val="57356332"/>
     <w:multiLevelType w:val="multilevel"/>
     <w:tmpl w:val="809C590E"/>
@@ -5133,7 +5531,7 @@
       </w:rPr>
     </w:lvl>
   </w:abstractNum>
-  <w:abstractNum w:abstractNumId="18" w15:restartNumberingAfterBreak="0">
+  <w:abstractNum w:abstractNumId="20" w15:restartNumberingAfterBreak="0">
     <w:nsid w:val="5A5C530C"/>
     <w:multiLevelType w:val="multilevel"/>
     <w:tmpl w:val="725A7746"/>
@@ -5246,7 +5644,7 @@
       </w:pPr>
     </w:lvl>
   </w:abstractNum>
-  <w:abstractNum w:abstractNumId="19" w15:restartNumberingAfterBreak="0">
+  <w:abstractNum w:abstractNumId="21" w15:restartNumberingAfterBreak="0">
     <w:nsid w:val="657F0833"/>
     <w:multiLevelType w:val="multilevel"/>
     <w:tmpl w:val="812E69B8"/>
@@ -5395,7 +5793,7 @@
       </w:rPr>
     </w:lvl>
   </w:abstractNum>
-  <w:abstractNum w:abstractNumId="20" w15:restartNumberingAfterBreak="0">
+  <w:abstractNum w:abstractNumId="22" w15:restartNumberingAfterBreak="0">
     <w:nsid w:val="682240AC"/>
     <w:multiLevelType w:val="multilevel"/>
     <w:tmpl w:val="9A925B30"/>
@@ -5508,7 +5906,7 @@
       </w:pPr>
     </w:lvl>
   </w:abstractNum>
-  <w:abstractNum w:abstractNumId="21" w15:restartNumberingAfterBreak="0">
+  <w:abstractNum w:abstractNumId="23" w15:restartNumberingAfterBreak="0">
     <w:nsid w:val="74DF63E0"/>
     <w:multiLevelType w:val="multilevel"/>
     <w:tmpl w:val="A11AF2EE"/>
@@ -5621,7 +6019,7 @@
       </w:pPr>
     </w:lvl>
   </w:abstractNum>
-  <w:abstractNum w:abstractNumId="22" w15:restartNumberingAfterBreak="0">
+  <w:abstractNum w:abstractNumId="24" w15:restartNumberingAfterBreak="0">
     <w:nsid w:val="75A50A45"/>
     <w:multiLevelType w:val="multilevel"/>
     <w:tmpl w:val="66D8D8FC"/>
@@ -5770,7 +6168,7 @@
       </w:rPr>
     </w:lvl>
   </w:abstractNum>
-  <w:abstractNum w:abstractNumId="23" w15:restartNumberingAfterBreak="0">
+  <w:abstractNum w:abstractNumId="25" w15:restartNumberingAfterBreak="0">
     <w:nsid w:val="77A67E4B"/>
     <w:multiLevelType w:val="hybridMultilevel"/>
     <w:tmpl w:val="7E388D94"/>
@@ -5883,7 +6281,7 @@
       </w:rPr>
     </w:lvl>
   </w:abstractNum>
-  <w:abstractNum w:abstractNumId="24" w15:restartNumberingAfterBreak="0">
+  <w:abstractNum w:abstractNumId="26" w15:restartNumberingAfterBreak="0">
     <w:nsid w:val="797F59BE"/>
     <w:multiLevelType w:val="multilevel"/>
     <w:tmpl w:val="BF1C2792"/>
@@ -5997,13 +6395,13 @@
     </w:lvl>
   </w:abstractNum>
   <w:num w:numId="1" w16cid:durableId="101069171">
-    <w:abstractNumId w:val="23"/>
+    <w:abstractNumId w:val="25"/>
   </w:num>
   <w:num w:numId="2" w16cid:durableId="1786266961">
-    <w:abstractNumId w:val="11"/>
+    <w:abstractNumId w:val="12"/>
   </w:num>
   <w:num w:numId="3" w16cid:durableId="149911408">
-    <w:abstractNumId w:val="14"/>
+    <w:abstractNumId w:val="16"/>
   </w:num>
   <w:num w:numId="4" w16cid:durableId="1362392822">
     <w:abstractNumId w:val="2"/>
@@ -6015,7 +6413,7 @@
     <w:abstractNumId w:val="9"/>
   </w:num>
   <w:num w:numId="7" w16cid:durableId="179005006">
-    <w:abstractNumId w:val="18"/>
+    <w:abstractNumId w:val="20"/>
   </w:num>
   <w:num w:numId="8" w16cid:durableId="192427632">
     <w:abstractNumId w:val="0"/>
@@ -6024,52 +6422,58 @@
     <w:abstractNumId w:val="3"/>
   </w:num>
   <w:num w:numId="10" w16cid:durableId="1473521700">
-    <w:abstractNumId w:val="20"/>
+    <w:abstractNumId w:val="22"/>
   </w:num>
   <w:num w:numId="11" w16cid:durableId="2043509950">
     <w:abstractNumId w:val="7"/>
   </w:num>
   <w:num w:numId="12" w16cid:durableId="1002396041">
-    <w:abstractNumId w:val="16"/>
+    <w:abstractNumId w:val="18"/>
   </w:num>
   <w:num w:numId="13" w16cid:durableId="1718354045">
     <w:abstractNumId w:val="10"/>
   </w:num>
   <w:num w:numId="14" w16cid:durableId="1499031107">
-    <w:abstractNumId w:val="21"/>
+    <w:abstractNumId w:val="23"/>
   </w:num>
   <w:num w:numId="15" w16cid:durableId="1244684611">
-    <w:abstractNumId w:val="12"/>
+    <w:abstractNumId w:val="13"/>
   </w:num>
   <w:num w:numId="16" w16cid:durableId="337344084">
-    <w:abstractNumId w:val="13"/>
+    <w:abstractNumId w:val="15"/>
   </w:num>
   <w:num w:numId="17" w16cid:durableId="663365070">
-    <w:abstractNumId w:val="15"/>
+    <w:abstractNumId w:val="17"/>
   </w:num>
   <w:num w:numId="18" w16cid:durableId="1671444411">
     <w:abstractNumId w:val="8"/>
   </w:num>
   <w:num w:numId="19" w16cid:durableId="314184064">
-    <w:abstractNumId w:val="24"/>
+    <w:abstractNumId w:val="26"/>
   </w:num>
   <w:num w:numId="20" w16cid:durableId="519975828">
     <w:abstractNumId w:val="6"/>
   </w:num>
   <w:num w:numId="21" w16cid:durableId="1765613013">
-    <w:abstractNumId w:val="22"/>
+    <w:abstractNumId w:val="24"/>
   </w:num>
   <w:num w:numId="22" w16cid:durableId="1177501438">
     <w:abstractNumId w:val="4"/>
   </w:num>
   <w:num w:numId="23" w16cid:durableId="654530660">
-    <w:abstractNumId w:val="19"/>
+    <w:abstractNumId w:val="21"/>
   </w:num>
   <w:num w:numId="24" w16cid:durableId="1952206721">
-    <w:abstractNumId w:val="17"/>
+    <w:abstractNumId w:val="19"/>
   </w:num>
   <w:num w:numId="25" w16cid:durableId="146554995">
     <w:abstractNumId w:val="5"/>
+  </w:num>
+  <w:num w:numId="26" w16cid:durableId="904530387">
+    <w:abstractNumId w:val="11"/>
+  </w:num>
+  <w:num w:numId="27" w16cid:durableId="1780025232">
+    <w:abstractNumId w:val="14"/>
   </w:num>
   <w:numIdMacAtCleanup w:val="5"/>
 </w:numbering>

</xml_diff>

<commit_message>
Revert "Arreglados los test y ampliado el plan de pruebas con correcciones"
This reverts commit 523d976b01b915c18ab876819bf9f2453c78a092.
</commit_message>
<xml_diff>
--- a/Docs/Test Plans/US532236-VerDetallesDeEstacion-TestPlan.docx
+++ b/Docs/Test Plans/US532236-VerDetallesDeEstacion-TestPlan.docx
@@ -546,8 +546,13 @@
         <w:t xml:space="preserve">e la lista de estaciones de </w:t>
       </w:r>
       <w:r>
-        <w:t>la red BiciMAD</w:t>
-      </w:r>
+        <w:t xml:space="preserve">la red </w:t>
+      </w:r>
+      <w:proofErr w:type="spellStart"/>
+      <w:r>
+        <w:t>BiciMAD</w:t>
+      </w:r>
+      <w:proofErr w:type="spellEnd"/>
       <w:r>
         <w:t>.</w:t>
       </w:r>
@@ -787,20 +792,25 @@
         <w:t xml:space="preserve">El técnico selecciona </w:t>
       </w:r>
       <w:r>
-        <w:t xml:space="preserve">la estación </w:t>
-      </w:r>
-      <w:r>
-        <w:t>"390 - Estacion datos ausentes"</w:t>
-      </w:r>
-      <w:r>
-        <w:t xml:space="preserve"> d</w:t>
+        <w:t>la estación ”</w:t>
+      </w:r>
+      <w:r>
+        <w:t>377 - Metro Abrantes</w:t>
+      </w:r>
+      <w:r>
+        <w:t>” d</w:t>
       </w:r>
       <w:r>
         <w:t xml:space="preserve">e la lista de estaciones de </w:t>
       </w:r>
       <w:r>
-        <w:t>la red BiciMAD</w:t>
-      </w:r>
+        <w:t xml:space="preserve">la red </w:t>
+      </w:r>
+      <w:proofErr w:type="spellStart"/>
+      <w:r>
+        <w:t>BiciMAD</w:t>
+      </w:r>
+      <w:proofErr w:type="spellEnd"/>
       <w:r>
         <w:t>.</w:t>
       </w:r>
@@ -816,19 +826,7 @@
         <w:jc w:val="both"/>
       </w:pPr>
       <w:r>
-        <w:t xml:space="preserve">La aplicación detecta que hay datos de la estación </w:t>
-      </w:r>
-      <w:r>
-        <w:t>ausentes</w:t>
-      </w:r>
-      <w:r>
-        <w:t xml:space="preserve"> y muestra los datos normales junto con un guion ("-") en los </w:t>
-      </w:r>
-      <w:r>
-        <w:t>ausentes</w:t>
-      </w:r>
-      <w:r>
-        <w:t xml:space="preserve">: </w:t>
+        <w:t xml:space="preserve">La aplicación detecta que hay datos de la estación anómalos y muestra los datos normales junto con un guion ("-") en los anómalos: </w:t>
       </w:r>
     </w:p>
     <w:p>
@@ -862,10 +860,13 @@
         <w:jc w:val="both"/>
       </w:pPr>
       <w:r>
-        <w:t xml:space="preserve">El nombre es </w:t>
-      </w:r>
-      <w:r>
-        <w:t>"390 - Estacion datos ausentes"</w:t>
+        <w:t>El nombre es “</w:t>
+      </w:r>
+      <w:r>
+        <w:t>377 - Metro Abrantes</w:t>
+      </w:r>
+      <w:r>
+        <w:t>”</w:t>
       </w:r>
     </w:p>
     <w:p>
@@ -959,16 +960,7 @@
         <w:t>no disponibles</w:t>
       </w:r>
       <w:r>
-        <w:t xml:space="preserve"> </w:t>
-      </w:r>
-      <w:r>
-        <w:t>(</w:t>
-      </w:r>
-      <w:r>
-        <w:t>hora de última actualización, bicicletas disponibles y huecos libres</w:t>
-      </w:r>
-      <w:r>
-        <w:t>) se muestra un guion ("-").</w:t>
+        <w:t xml:space="preserve"> (latitud, longitud, bicicletas disponibles y huecos libres) se muestra un guion ("-").</w:t>
       </w:r>
     </w:p>
     <w:p>
@@ -999,7 +991,15 @@
         <w:jc w:val="both"/>
       </w:pPr>
       <w:r>
-        <w:t xml:space="preserve">El técnico selecciona la estación "377 - Metro Abrantes" de la lista de estaciones de la red BiciMAD </w:t>
+        <w:t xml:space="preserve">El técnico selecciona la estación "377 - Metro Abrantes" de la lista de estaciones de la red </w:t>
+      </w:r>
+      <w:proofErr w:type="spellStart"/>
+      <w:r>
+        <w:t>BiciMAD</w:t>
+      </w:r>
+      <w:proofErr w:type="spellEnd"/>
+      <w:r>
+        <w:t xml:space="preserve"> </w:t>
       </w:r>
       <w:r>
         <w:t>teniendo datos anómalos</w:t>
@@ -1061,10 +1061,13 @@
         <w:jc w:val="both"/>
       </w:pPr>
       <w:r>
-        <w:t xml:space="preserve">El nombre es </w:t>
-      </w:r>
-      <w:r>
-        <w:t>"377 - Metro Abrantes"</w:t>
+        <w:t>El nombre es “</w:t>
+      </w:r>
+      <w:r>
+        <w:t>390 - Estacion datos ausentes</w:t>
+      </w:r>
+      <w:r>
+        <w:t>”</w:t>
       </w:r>
     </w:p>
     <w:p>
@@ -1158,7 +1161,15 @@
         <w:jc w:val="both"/>
       </w:pPr>
       <w:r>
-        <w:t>El técnico selecciona la estación "377 - Metro Abrantes" de la lista de estaciones de la red BiciMAD estando el servicio de datos inactivo.</w:t>
+        <w:t xml:space="preserve">El técnico selecciona la estación "377 - Metro Abrantes" de la lista de estaciones de la red </w:t>
+      </w:r>
+      <w:proofErr w:type="spellStart"/>
+      <w:r>
+        <w:t>BiciMAD</w:t>
+      </w:r>
+      <w:proofErr w:type="spellEnd"/>
+      <w:r>
+        <w:t xml:space="preserve"> estando el servicio de datos inactivo.</w:t>
       </w:r>
     </w:p>
     <w:p>
@@ -1212,7 +1223,15 @@
         <w:jc w:val="both"/>
       </w:pPr>
       <w:r>
-        <w:t>El técnico selecciona la estación "377 - Metro Abrantes" de la lista de estaciones de la red BiciMAD produciéndose un fallo al acceder al servicio de datos</w:t>
+        <w:t xml:space="preserve">El técnico selecciona la estación "377 - Metro Abrantes" de la lista de estaciones de la red </w:t>
+      </w:r>
+      <w:proofErr w:type="spellStart"/>
+      <w:r>
+        <w:t>BiciMAD</w:t>
+      </w:r>
+      <w:proofErr w:type="spellEnd"/>
+      <w:r>
+        <w:t xml:space="preserve"> produciéndose un fallo al acceder al servicio de datos</w:t>
       </w:r>
     </w:p>
     <w:p>
@@ -1266,8 +1285,13 @@
         <w:jc w:val="both"/>
       </w:pPr>
       <w:r>
-        <w:t>Con la conexión a Internet del dispositivo desactivada, el técnico selecciona la estación "377 - Metro Abrantes" de la lista de estaciones de la red BiciMAD</w:t>
-      </w:r>
+        <w:t xml:space="preserve">Con la conexión a Internet del dispositivo desactivada, el técnico selecciona la estación "377 - Metro Abrantes" de la lista de estaciones de la red </w:t>
+      </w:r>
+      <w:proofErr w:type="spellStart"/>
+      <w:r>
+        <w:t>BiciMAD</w:t>
+      </w:r>
+      <w:proofErr w:type="spellEnd"/>
       <w:r>
         <w:t>.</w:t>
       </w:r>
@@ -1342,12 +1366,21 @@
         </w:rPr>
         <w:t xml:space="preserve">1. </w:t>
       </w:r>
+      <w:proofErr w:type="spellStart"/>
       <w:r>
         <w:rPr>
           <w:b/>
           <w:bCs/>
         </w:rPr>
-        <w:t>onCreate():</w:t>
+        <w:t>onCreate</w:t>
+      </w:r>
+      <w:proofErr w:type="spellEnd"/>
+      <w:r>
+        <w:rPr>
+          <w:b/>
+          <w:bCs/>
+        </w:rPr>
+        <w:t>():</w:t>
       </w:r>
       <w:r>
         <w:t xml:space="preserve"> Método encargado de solicitar los detalles de la estación seleccionada a la capa de negocio/persistencia, validar que los datos estén disponibles y dentro de los rangos válidos (latitud en (-90, 90), longitud en (-180, 180), bicicletas disponibles &gt;= 0 y huecos libres &gt;= 0), sustituir por un guion ("-") aquellos datos ausentes o anómalos, y ordenar a la vista mostrar la información o notificar un error interno.</w:t>
@@ -1365,12 +1398,21 @@
         </w:rPr>
         <w:t xml:space="preserve">2. </w:t>
       </w:r>
+      <w:proofErr w:type="spellStart"/>
       <w:r>
         <w:rPr>
           <w:b/>
           <w:bCs/>
         </w:rPr>
-        <w:t>Presenter.init() (Ver Anexo):</w:t>
+        <w:t>Presenter.init</w:t>
+      </w:r>
+      <w:proofErr w:type="spellEnd"/>
+      <w:r>
+        <w:rPr>
+          <w:b/>
+          <w:bCs/>
+        </w:rPr>
+        <w:t>() (Ver Anexo):</w:t>
       </w:r>
       <w:r>
         <w:t xml:space="preserve"> Método genérico de lógica de presentación encargado de validar los datos del modelo y ordenar a la vista mostrarlos o sustituirlos por guiones. Susceptible de </w:t>
@@ -1383,7 +1425,15 @@
         <w:t>prueba unitaria</w:t>
       </w:r>
       <w:r>
-        <w:t xml:space="preserve"> mediante Mocks aislados.</w:t>
+        <w:t xml:space="preserve"> mediante </w:t>
+      </w:r>
+      <w:proofErr w:type="spellStart"/>
+      <w:r>
+        <w:t>Mocks</w:t>
+      </w:r>
+      <w:proofErr w:type="spellEnd"/>
+      <w:r>
+        <w:t xml:space="preserve"> aislados.</w:t>
       </w:r>
     </w:p>
     <w:p>
@@ -1411,54 +1461,15 @@
         <w:jc w:val="both"/>
       </w:pPr>
       <w:r>
-        <w:t xml:space="preserve">Durante el diseño e implementación de esta historia de usuario, el equipo decidió prescindir de la capa de presentación (Presenter) para la vista de detalle de estación (StationDetailsView), dado que la pantalla actúa únicamente como un receptor pasivo de un objeto Station previamente descargado y empaquetado en el Intent desde la vista anterior. Al encontrarse la lógica de validación y formateo de campos acoplada directamente en el método del ciclo de vida de Android StationDetailsView.onCreate(), no existen unidades funcionales aisladas del framework susceptibles de prueba unitaria pura en esta historia. </w:t>
-      </w:r>
-    </w:p>
-    <w:p>
-      <w:pPr>
-        <w:spacing w:after="120"/>
-        <w:jc w:val="both"/>
-      </w:pPr>
-      <w:r>
-        <w:t>Siguiendo las indicaciones de la profesora durante la sesión de validación y seguimiento del plan de pruebas:</w:t>
-      </w:r>
-    </w:p>
-    <w:p>
-      <w:pPr>
-        <w:numPr>
-          <w:ilvl w:val="0"/>
-          <w:numId w:val="26"/>
-        </w:numPr>
-        <w:spacing w:after="120"/>
-        <w:jc w:val="both"/>
-      </w:pPr>
-      <w:r>
-        <w:t xml:space="preserve">La verificación del comportamiento de StationDetailsView.onCreate() se certifica mediante Pruebas de Integración (StationDetailsViewITest) utilizando Robolectric y Mockito. </w:t>
-      </w:r>
-    </w:p>
-    <w:p>
-      <w:pPr>
-        <w:numPr>
-          <w:ilvl w:val="0"/>
-          <w:numId w:val="26"/>
-        </w:numPr>
-        <w:spacing w:after="120"/>
-        <w:jc w:val="both"/>
-      </w:pPr>
-      <w:r>
-        <w:t xml:space="preserve">Con el fin de cubrir los objetivos de evaluación individual relativos a la especificación, codificación y ejecución de pruebas unitarias aisladas con uso de </w:t>
-      </w:r>
-      <w:r>
-        <w:t>m</w:t>
-      </w:r>
-      <w:r>
-        <w:t xml:space="preserve">ocks, se ha acordado documentar e implementar en el </w:t>
-      </w:r>
-      <w:r>
-        <w:t>a</w:t>
-      </w:r>
-      <w:r>
-        <w:t xml:space="preserve">nexo de este documento las pruebas unitarias correspondientes al método RedDetailsPresenter.init() (implementadas en la clase RedDetailsPresenterTest). </w:t>
+        <w:t>Debido a que la lógica de validación se ha acoplado directamente en la Vista (</w:t>
+      </w:r>
+      <w:proofErr w:type="spellStart"/>
+      <w:r>
+        <w:t>StationDetailsView.onCreate</w:t>
+      </w:r>
+      <w:proofErr w:type="spellEnd"/>
+      <w:r>
+        <w:t>()) y no se ha implementado la capa del Presentador para esta historia de usuario, es técnicamente inviable aislar el componente para realizar pruebas unitarias. Por tanto, no se realizarán pruebas unitarias en esta historia y la funcionalidad se certificará exclusivamente mediante las pruebas de integración descritas en la siguiente sección.</w:t>
       </w:r>
     </w:p>
     <w:p>
@@ -1569,8 +1580,17 @@
               <w:jc w:val="both"/>
             </w:pPr>
             <w:r>
-              <w:t xml:space="preserve">Se crea un Mock de Station con Mockito que, al invocar sus </w:t>
-            </w:r>
+              <w:t xml:space="preserve">Se crea un Mock de Station con </w:t>
+            </w:r>
+            <w:proofErr w:type="spellStart"/>
+            <w:r>
+              <w:t>Mockito</w:t>
+            </w:r>
+            <w:proofErr w:type="spellEnd"/>
+            <w:r>
+              <w:t xml:space="preserve"> que, al invocar sus </w:t>
+            </w:r>
+            <w:proofErr w:type="spellStart"/>
             <w:r>
               <w:rPr>
                 <w:i/>
@@ -1578,12 +1598,57 @@
               </w:rPr>
               <w:t>getters</w:t>
             </w:r>
-            <w:r>
-              <w:t>, devuelve los datos de la estación "377 - Metro Abrantes" (id = "01f5011f76069b1e81a11d4d51dd9d1d", latitude = 40.38091762, longitude = -3.72783615, timestamp = "2026-09-</w:t>
-            </w:r>
-            <w:r>
-              <w:lastRenderedPageBreak/>
-              <w:t>24T11:11:40.490774+00:00Z", freeBikes = 0, emptySlots = 18). El Mock se empaqueta en el Intent de inicio.</w:t>
+            <w:proofErr w:type="spellEnd"/>
+            <w:r>
+              <w:t xml:space="preserve">, devuelve los datos de la estación "377 - Metro Abrantes" (id = "01f5011f76069b1e81a11d4d51dd9d1d", </w:t>
+            </w:r>
+            <w:proofErr w:type="spellStart"/>
+            <w:r>
+              <w:t>latitude</w:t>
+            </w:r>
+            <w:proofErr w:type="spellEnd"/>
+            <w:r>
+              <w:t xml:space="preserve"> = 40.38091762, </w:t>
+            </w:r>
+            <w:proofErr w:type="spellStart"/>
+            <w:r>
+              <w:t>longitude</w:t>
+            </w:r>
+            <w:proofErr w:type="spellEnd"/>
+            <w:r>
+              <w:t xml:space="preserve"> = -3.72783615, </w:t>
+            </w:r>
+            <w:proofErr w:type="spellStart"/>
+            <w:r>
+              <w:t>timestamp</w:t>
+            </w:r>
+            <w:proofErr w:type="spellEnd"/>
+            <w:r>
+              <w:t xml:space="preserve"> = "2026-09-24T11:11:40.490774+00:00Z", </w:t>
+            </w:r>
+            <w:proofErr w:type="spellStart"/>
+            <w:r>
+              <w:t>freeBikes</w:t>
+            </w:r>
+            <w:proofErr w:type="spellEnd"/>
+            <w:r>
+              <w:t xml:space="preserve"> = 0, </w:t>
+            </w:r>
+            <w:proofErr w:type="spellStart"/>
+            <w:r>
+              <w:t>emptySlots</w:t>
+            </w:r>
+            <w:proofErr w:type="spellEnd"/>
+            <w:r>
+              <w:t xml:space="preserve"> = 18). El Mock se empaqueta en el </w:t>
+            </w:r>
+            <w:proofErr w:type="spellStart"/>
+            <w:r>
+              <w:t>Intent</w:t>
+            </w:r>
+            <w:proofErr w:type="spellEnd"/>
+            <w:r>
+              <w:t xml:space="preserve"> de inicio.</w:t>
             </w:r>
           </w:p>
         </w:tc>
@@ -1600,12 +1665,23 @@
               </w:rPr>
             </w:pPr>
             <w:r>
-              <w:lastRenderedPageBreak/>
-              <w:t xml:space="preserve">La Actividad extrae correctamente el Mock del Intent. La aserción verifica que el TextView de bicicletas disponibles muestra "0" y los demás campos muestran sus </w:t>
-            </w:r>
-            <w:r>
-              <w:lastRenderedPageBreak/>
-              <w:t>valores exactos, sin invocar el mensaje de error interno.</w:t>
+              <w:t xml:space="preserve">La Actividad extrae correctamente el Mock del </w:t>
+            </w:r>
+            <w:proofErr w:type="spellStart"/>
+            <w:r>
+              <w:t>Intent</w:t>
+            </w:r>
+            <w:proofErr w:type="spellEnd"/>
+            <w:r>
+              <w:t xml:space="preserve">. La aserción verifica que el </w:t>
+            </w:r>
+            <w:proofErr w:type="spellStart"/>
+            <w:r>
+              <w:t>TextView</w:t>
+            </w:r>
+            <w:proofErr w:type="spellEnd"/>
+            <w:r>
+              <w:t xml:space="preserve"> de bicicletas disponibles muestra "0" y los demás campos muestran sus valores exactos, sin invocar el mensaje de error interno.</w:t>
             </w:r>
           </w:p>
         </w:tc>
@@ -1624,7 +1700,6 @@
               <w:jc w:val="both"/>
             </w:pPr>
             <w:r>
-              <w:lastRenderedPageBreak/>
               <w:t>Prueba 01.</w:t>
             </w:r>
           </w:p>
@@ -1639,43 +1714,15 @@
               <w:jc w:val="both"/>
             </w:pPr>
             <w:r>
-              <w:t>Se configura un Mock de Station que devuelve</w:t>
-            </w:r>
-            <w:r>
-              <w:t xml:space="preserve"> los nombres de </w:t>
-            </w:r>
-            <w:r>
-              <w:t>"390 - Estacion datos ausentes"</w:t>
-            </w:r>
-            <w:r>
-              <w:t xml:space="preserve"> y la longitud y la latitud </w:t>
-            </w:r>
-            <w:r>
-              <w:t>“</w:t>
-            </w:r>
-            <w:r>
-              <w:t>40.38091762</w:t>
-            </w:r>
-            <w:r>
-              <w:t xml:space="preserve">, </w:t>
-            </w:r>
-            <w:r>
-              <w:t>-3.72783615</w:t>
-            </w:r>
-            <w:r>
-              <w:t>”</w:t>
-            </w:r>
-            <w:r>
-              <w:t xml:space="preserve"> además debe de ser</w:t>
-            </w:r>
-            <w:r>
-              <w:t xml:space="preserve"> null al consultar la</w:t>
-            </w:r>
-            <w:r>
-              <w:t xml:space="preserve"> </w:t>
-            </w:r>
-            <w:r>
-              <w:t>hora de actualización, bicicletas y huecos.</w:t>
+              <w:t xml:space="preserve">Se configura un Mock de Station que devuelve </w:t>
+            </w:r>
+            <w:proofErr w:type="spellStart"/>
+            <w:r>
+              <w:t>null</w:t>
+            </w:r>
+            <w:proofErr w:type="spellEnd"/>
+            <w:r>
+              <w:t xml:space="preserve"> al consultar la latitud, longitud, hora de actualización, bicicletas y huecos.</w:t>
             </w:r>
           </w:p>
         </w:tc>
@@ -1689,7 +1736,31 @@
               <w:jc w:val="both"/>
             </w:pPr>
             <w:r>
-              <w:t>La lógica del onCreate evalúa correctamente los nulos provenientes del Mock y asigna la cadena de recurso R.string.noData ("-") a los TextView correspondientes, validando la integración del manejo de ausencia de datos.</w:t>
+              <w:t xml:space="preserve">La lógica del </w:t>
+            </w:r>
+            <w:proofErr w:type="spellStart"/>
+            <w:r>
+              <w:t>onCreate</w:t>
+            </w:r>
+            <w:proofErr w:type="spellEnd"/>
+            <w:r>
+              <w:t xml:space="preserve"> evalúa correctamente los nulos provenientes del Mock y asigna la cadena de recurso </w:t>
+            </w:r>
+            <w:proofErr w:type="spellStart"/>
+            <w:r>
+              <w:t>R.string.noData</w:t>
+            </w:r>
+            <w:proofErr w:type="spellEnd"/>
+            <w:r>
+              <w:t xml:space="preserve"> ("-") a los </w:t>
+            </w:r>
+            <w:proofErr w:type="spellStart"/>
+            <w:r>
+              <w:t>TextView</w:t>
+            </w:r>
+            <w:proofErr w:type="spellEnd"/>
+            <w:r>
+              <w:t xml:space="preserve"> correspondientes, validando la integración del manejo de ausencia de datos.</w:t>
             </w:r>
           </w:p>
         </w:tc>
@@ -1722,7 +1793,35 @@
               <w:jc w:val="both"/>
             </w:pPr>
             <w:r>
-              <w:t>Se configura un Mock de Station que devuelve valores fuera del rango geográfico y lógico: latitude = 95.0, longitude = -185.0, freeBikes = -1.</w:t>
+              <w:t xml:space="preserve">Se configura un Mock de Station que devuelve valores fuera del rango </w:t>
+            </w:r>
+            <w:r>
+              <w:lastRenderedPageBreak/>
+              <w:t xml:space="preserve">geográfico y lógico: </w:t>
+            </w:r>
+            <w:proofErr w:type="spellStart"/>
+            <w:r>
+              <w:t>latitude</w:t>
+            </w:r>
+            <w:proofErr w:type="spellEnd"/>
+            <w:r>
+              <w:t xml:space="preserve"> = 95.0, </w:t>
+            </w:r>
+            <w:proofErr w:type="spellStart"/>
+            <w:r>
+              <w:t>longitude</w:t>
+            </w:r>
+            <w:proofErr w:type="spellEnd"/>
+            <w:r>
+              <w:t xml:space="preserve"> = -185.0, </w:t>
+            </w:r>
+            <w:proofErr w:type="spellStart"/>
+            <w:r>
+              <w:t>freeBikes</w:t>
+            </w:r>
+            <w:proofErr w:type="spellEnd"/>
+            <w:r>
+              <w:t xml:space="preserve"> = -1.</w:t>
             </w:r>
           </w:p>
         </w:tc>
@@ -1736,7 +1835,28 @@
               <w:jc w:val="both"/>
             </w:pPr>
             <w:r>
-              <w:t>El onCreate integra los datos del Mock, las validaciones lógicas detectan los valores anómalos (&gt; 90, &lt; -180, &lt; 0) y la vista asigna R.string.noData ("-") exclusivamente a esos campos, manteniendo los válidos (como el nombre o ID).</w:t>
+              <w:lastRenderedPageBreak/>
+              <w:t xml:space="preserve">El </w:t>
+            </w:r>
+            <w:proofErr w:type="spellStart"/>
+            <w:r>
+              <w:t>onCreate</w:t>
+            </w:r>
+            <w:proofErr w:type="spellEnd"/>
+            <w:r>
+              <w:t xml:space="preserve"> integra los datos del Mock, las validaciones lógicas detectan los valores anómalos (&gt; </w:t>
+            </w:r>
+            <w:r>
+              <w:lastRenderedPageBreak/>
+              <w:t xml:space="preserve">90, &lt; -180, &lt; 0) y la vista asigna </w:t>
+            </w:r>
+            <w:proofErr w:type="spellStart"/>
+            <w:r>
+              <w:t>R.string.noData</w:t>
+            </w:r>
+            <w:proofErr w:type="spellEnd"/>
+            <w:r>
+              <w:t xml:space="preserve"> ("-") exclusivamente a esos campos, manteniendo los válidos (como el nombre o ID).</w:t>
             </w:r>
           </w:p>
         </w:tc>
@@ -1755,6 +1875,7 @@
               <w:jc w:val="both"/>
             </w:pPr>
             <w:r>
+              <w:lastRenderedPageBreak/>
               <w:t>Prueba 03.</w:t>
             </w:r>
           </w:p>
@@ -1769,7 +1890,15 @@
               <w:jc w:val="both"/>
             </w:pPr>
             <w:r>
-              <w:t>Se lanza la Actividad con un Intent que no contiene ningún extra INTENT_STATION (simulando un fallo previo en la red).</w:t>
+              <w:t xml:space="preserve">Se lanza la Actividad con un </w:t>
+            </w:r>
+            <w:proofErr w:type="spellStart"/>
+            <w:r>
+              <w:t>Intent</w:t>
+            </w:r>
+            <w:proofErr w:type="spellEnd"/>
+            <w:r>
+              <w:t xml:space="preserve"> que no contiene ningún extra INTENT_STATION (simulando un fallo previo en la red).</w:t>
             </w:r>
           </w:p>
         </w:tc>
@@ -1786,7 +1915,39 @@
               </w:rPr>
             </w:pPr>
             <w:r>
-              <w:t>El onCreate detecta que el objeto extraído es null y ejecuta la rama de error, mostrando el Toast con el mensaje R.string.loadErrorStation.</w:t>
+              <w:t xml:space="preserve">El </w:t>
+            </w:r>
+            <w:proofErr w:type="spellStart"/>
+            <w:r>
+              <w:t>onCreate</w:t>
+            </w:r>
+            <w:proofErr w:type="spellEnd"/>
+            <w:r>
+              <w:t xml:space="preserve"> detecta que el objeto extraído es </w:t>
+            </w:r>
+            <w:proofErr w:type="spellStart"/>
+            <w:r>
+              <w:t>null</w:t>
+            </w:r>
+            <w:proofErr w:type="spellEnd"/>
+            <w:r>
+              <w:t xml:space="preserve"> y ejecuta la rama de error, mostrando el </w:t>
+            </w:r>
+            <w:proofErr w:type="spellStart"/>
+            <w:r>
+              <w:t>Toast</w:t>
+            </w:r>
+            <w:proofErr w:type="spellEnd"/>
+            <w:r>
+              <w:t xml:space="preserve"> con el mensaje </w:t>
+            </w:r>
+            <w:proofErr w:type="spellStart"/>
+            <w:r>
+              <w:t>R.string.loadErrorStation</w:t>
+            </w:r>
+            <w:proofErr w:type="spellEnd"/>
+            <w:r>
+              <w:t>.</w:t>
             </w:r>
           </w:p>
         </w:tc>
@@ -1823,506 +1984,32 @@
         <w:jc w:val="both"/>
       </w:pPr>
       <w:r>
-        <w:rPr>
-          <w:b/>
-          <w:bCs/>
-        </w:rPr>
-        <w:t>Responsables de los artefactos de prueba:</w:t>
-      </w:r>
-    </w:p>
-    <w:p>
-      <w:r>
-        <w:t>Autor del Plan de Pruebas: David García.</w:t>
-      </w:r>
-    </w:p>
-    <w:p>
-      <w:r>
-        <w:t>Autor y ejecutor de las pruebas (Unitarias, Integración y UI): David García.</w:t>
-      </w:r>
-    </w:p>
-    <w:p>
-      <w:r>
-        <w:t>Responsable de corrección de defectos en el código de producción: Aarón Alegría (implementador de la historia de usuario).</w:t>
-      </w:r>
-    </w:p>
-    <w:tbl>
-      <w:tblPr>
-        <w:tblStyle w:val="Tablaconcuadrcula"/>
-        <w:tblW w:w="0" w:type="auto"/>
-        <w:tblLook w:val="04A0" w:firstRow="1" w:lastRow="0" w:firstColumn="1" w:lastColumn="0" w:noHBand="0" w:noVBand="1"/>
-      </w:tblPr>
-      <w:tblGrid>
-        <w:gridCol w:w="1206"/>
-        <w:gridCol w:w="3870"/>
-        <w:gridCol w:w="1132"/>
-        <w:gridCol w:w="1087"/>
-        <w:gridCol w:w="1199"/>
-      </w:tblGrid>
-      <w:tr>
-        <w:tc>
-          <w:tcPr>
-            <w:tcW w:w="1206" w:type="dxa"/>
-          </w:tcPr>
-          <w:p>
-            <w:r>
-              <w:t>Nivel de Prueba</w:t>
-            </w:r>
-          </w:p>
-        </w:tc>
-        <w:tc>
-          <w:tcPr>
-            <w:tcW w:w="3870" w:type="dxa"/>
-          </w:tcPr>
-          <w:p>
-            <w:r>
-              <w:t>Clase de Prueba</w:t>
-            </w:r>
-          </w:p>
-        </w:tc>
-        <w:tc>
-          <w:tcPr>
-            <w:tcW w:w="1132" w:type="dxa"/>
-          </w:tcPr>
-          <w:p>
-            <w:pPr>
-              <w:jc w:val="center"/>
-            </w:pPr>
-            <w:r>
-              <w:t>Caso de Prueba</w:t>
-            </w:r>
-          </w:p>
-        </w:tc>
-        <w:tc>
-          <w:tcPr>
-            <w:tcW w:w="1087" w:type="dxa"/>
-          </w:tcPr>
-          <w:p>
-            <w:r>
-              <w:t>Resultado Inicial</w:t>
-            </w:r>
-          </w:p>
-        </w:tc>
-        <w:tc>
-          <w:tcPr>
-            <w:tcW w:w="1199" w:type="dxa"/>
-          </w:tcPr>
-          <w:p>
-            <w:r>
-              <w:t>Resultado Final (Post-corrección)</w:t>
-            </w:r>
-          </w:p>
-        </w:tc>
-      </w:tr>
-      <w:tr>
-        <w:tc>
-          <w:tcPr>
-            <w:tcW w:w="1206" w:type="dxa"/>
-          </w:tcPr>
-          <w:p>
-            <w:pPr>
-              <w:jc w:val="center"/>
-            </w:pPr>
-            <w:r>
-              <w:t>Integración</w:t>
-            </w:r>
-          </w:p>
-        </w:tc>
-        <w:tc>
-          <w:tcPr>
-            <w:tcW w:w="3870" w:type="dxa"/>
-          </w:tcPr>
-          <w:p>
-            <w:pPr>
-              <w:jc w:val="center"/>
-            </w:pPr>
-            <w:r>
-              <w:t>StationDetailsViewITest</w:t>
-            </w:r>
-          </w:p>
-        </w:tc>
-        <w:tc>
-          <w:tcPr>
-            <w:tcW w:w="1132" w:type="dxa"/>
-          </w:tcPr>
-          <w:p>
-            <w:r>
-              <w:t>IT-00 (Datos válidos)</w:t>
-            </w:r>
-          </w:p>
-        </w:tc>
-        <w:tc>
-          <w:tcPr>
-            <w:tcW w:w="1087" w:type="dxa"/>
-          </w:tcPr>
-          <w:p>
-            <w:r>
-              <w:t>Éxito (PASS)</w:t>
-            </w:r>
-          </w:p>
-        </w:tc>
-        <w:tc>
-          <w:tcPr>
-            <w:tcW w:w="1199" w:type="dxa"/>
-          </w:tcPr>
-          <w:p>
-            <w:r>
-              <w:t>Éxito (PASS)</w:t>
-            </w:r>
-          </w:p>
-        </w:tc>
-      </w:tr>
-      <w:tr>
-        <w:tc>
-          <w:tcPr>
-            <w:tcW w:w="1206" w:type="dxa"/>
-          </w:tcPr>
-          <w:p>
-            <w:r>
-              <w:t>Integración</w:t>
-            </w:r>
-          </w:p>
-        </w:tc>
-        <w:tc>
-          <w:tcPr>
-            <w:tcW w:w="3870" w:type="dxa"/>
-          </w:tcPr>
-          <w:p>
-            <w:r>
-              <w:t>StationDetailsViewITest</w:t>
-            </w:r>
-          </w:p>
-        </w:tc>
-        <w:tc>
-          <w:tcPr>
-            <w:tcW w:w="1132" w:type="dxa"/>
-          </w:tcPr>
-          <w:p>
-            <w:r>
-              <w:t xml:space="preserve">IT-01 (Datos </w:t>
-            </w:r>
-            <w:r>
-              <w:lastRenderedPageBreak/>
-              <w:t>ausentes / nulos)</w:t>
-            </w:r>
-          </w:p>
-        </w:tc>
-        <w:tc>
-          <w:tcPr>
-            <w:tcW w:w="1087" w:type="dxa"/>
-          </w:tcPr>
-          <w:p>
-            <w:r>
-              <w:lastRenderedPageBreak/>
-              <w:t>Fallo (FAIL)</w:t>
-            </w:r>
-          </w:p>
-        </w:tc>
-        <w:tc>
-          <w:tcPr>
-            <w:tcW w:w="1199" w:type="dxa"/>
-          </w:tcPr>
-          <w:p>
-            <w:r>
-              <w:t>Éxito (PASS)</w:t>
-            </w:r>
-          </w:p>
-        </w:tc>
-      </w:tr>
-      <w:tr>
-        <w:tc>
-          <w:tcPr>
-            <w:tcW w:w="1206" w:type="dxa"/>
-          </w:tcPr>
-          <w:p>
-            <w:r>
-              <w:t>Integración</w:t>
-            </w:r>
-          </w:p>
-        </w:tc>
-        <w:tc>
-          <w:tcPr>
-            <w:tcW w:w="3870" w:type="dxa"/>
-          </w:tcPr>
-          <w:p>
-            <w:r>
-              <w:t>StationDetailsViewITest</w:t>
-            </w:r>
-          </w:p>
-        </w:tc>
-        <w:tc>
-          <w:tcPr>
-            <w:tcW w:w="1132" w:type="dxa"/>
-          </w:tcPr>
-          <w:p>
-            <w:r>
-              <w:t xml:space="preserve">IT-02 (Datos anómalos) </w:t>
-            </w:r>
-          </w:p>
-          <w:p/>
-        </w:tc>
-        <w:tc>
-          <w:tcPr>
-            <w:tcW w:w="1087" w:type="dxa"/>
-          </w:tcPr>
-          <w:p>
-            <w:r>
-              <w:t>Fallo (FAIL)</w:t>
-            </w:r>
-          </w:p>
-        </w:tc>
-        <w:tc>
-          <w:tcPr>
-            <w:tcW w:w="1199" w:type="dxa"/>
-          </w:tcPr>
-          <w:p>
-            <w:r>
-              <w:t>Éxito (PASS)</w:t>
-            </w:r>
-          </w:p>
-        </w:tc>
-      </w:tr>
-      <w:tr>
-        <w:tc>
-          <w:tcPr>
-            <w:tcW w:w="1206" w:type="dxa"/>
-          </w:tcPr>
-          <w:p>
-            <w:r>
-              <w:t>Integración</w:t>
-            </w:r>
-          </w:p>
-        </w:tc>
-        <w:tc>
-          <w:tcPr>
-            <w:tcW w:w="3870" w:type="dxa"/>
-          </w:tcPr>
-          <w:p>
-            <w:r>
-              <w:t>StationDetailsViewITest</w:t>
-            </w:r>
-          </w:p>
-        </w:tc>
-        <w:tc>
-          <w:tcPr>
-            <w:tcW w:w="1132" w:type="dxa"/>
-          </w:tcPr>
-          <w:p>
-            <w:r>
-              <w:t>IT-03 (Sin extra / Error de carga)</w:t>
-            </w:r>
-          </w:p>
-        </w:tc>
-        <w:tc>
-          <w:tcPr>
-            <w:tcW w:w="1087" w:type="dxa"/>
-          </w:tcPr>
-          <w:p>
-            <w:r>
-              <w:t>Éxito (PASS)</w:t>
-            </w:r>
-          </w:p>
-        </w:tc>
-        <w:tc>
-          <w:tcPr>
-            <w:tcW w:w="1199" w:type="dxa"/>
-          </w:tcPr>
-          <w:p>
-            <w:r>
-              <w:t>Éxito (PASS)</w:t>
-            </w:r>
-          </w:p>
-        </w:tc>
-      </w:tr>
-      <w:tr>
-        <w:tc>
-          <w:tcPr>
-            <w:tcW w:w="1206" w:type="dxa"/>
-          </w:tcPr>
-          <w:p>
-            <w:r>
-              <w:t>Unitaria (Anexo)</w:t>
-            </w:r>
-          </w:p>
-        </w:tc>
-        <w:tc>
-          <w:tcPr>
-            <w:tcW w:w="3870" w:type="dxa"/>
-          </w:tcPr>
-          <w:p>
-            <w:r>
-              <w:t>RedDetailsPresenterTest</w:t>
-            </w:r>
-          </w:p>
-        </w:tc>
-        <w:tc>
-          <w:tcPr>
-            <w:tcW w:w="1132" w:type="dxa"/>
-          </w:tcPr>
-          <w:p>
-            <w:r>
-              <w:t>UT-01, UT-02, UT-03</w:t>
-            </w:r>
-          </w:p>
-        </w:tc>
-        <w:tc>
-          <w:tcPr>
-            <w:tcW w:w="1087" w:type="dxa"/>
-          </w:tcPr>
-          <w:p>
-            <w:r>
-              <w:t>Éxito (PASS)</w:t>
-            </w:r>
-          </w:p>
-        </w:tc>
-        <w:tc>
-          <w:tcPr>
-            <w:tcW w:w="1199" w:type="dxa"/>
-          </w:tcPr>
-          <w:p>
-            <w:r>
-              <w:t>Éxito (PASS)</w:t>
-            </w:r>
-          </w:p>
-        </w:tc>
-      </w:tr>
-      <w:tr>
-        <w:tc>
-          <w:tcPr>
-            <w:tcW w:w="1206" w:type="dxa"/>
-          </w:tcPr>
-          <w:p>
-            <w:pPr>
-              <w:jc w:val="center"/>
-            </w:pPr>
-            <w:r>
-              <w:t>Interfaz (UI)</w:t>
-            </w:r>
-          </w:p>
-        </w:tc>
-        <w:tc>
-          <w:tcPr>
-            <w:tcW w:w="3870" w:type="dxa"/>
-          </w:tcPr>
-          <w:p>
-            <w:r>
-              <w:t>VerDetalleEstacionExito00UITest</w:t>
-            </w:r>
-          </w:p>
-        </w:tc>
-        <w:tc>
-          <w:tcPr>
-            <w:tcW w:w="1132" w:type="dxa"/>
-          </w:tcPr>
-          <w:p>
-            <w:r>
-              <w:t>Prueba 00. Éxito</w:t>
-            </w:r>
-          </w:p>
-        </w:tc>
-        <w:tc>
-          <w:tcPr>
-            <w:tcW w:w="1087" w:type="dxa"/>
-          </w:tcPr>
-          <w:p>
-            <w:r>
-              <w:t>Éxito (PASS)</w:t>
-            </w:r>
-          </w:p>
-        </w:tc>
-        <w:tc>
-          <w:tcPr>
-            <w:tcW w:w="1199" w:type="dxa"/>
-          </w:tcPr>
-          <w:p>
-            <w:r>
-              <w:t>Éxito (PASS)</w:t>
-            </w:r>
-          </w:p>
-        </w:tc>
-      </w:tr>
-      <w:tr>
-        <w:tc>
-          <w:tcPr>
-            <w:tcW w:w="1206" w:type="dxa"/>
-          </w:tcPr>
-          <w:p>
-            <w:r>
-              <w:t>Interfaz (UI)</w:t>
-            </w:r>
-          </w:p>
-        </w:tc>
-        <w:tc>
-          <w:tcPr>
-            <w:tcW w:w="3870" w:type="dxa"/>
-          </w:tcPr>
-          <w:p>
-            <w:r>
-              <w:t>VerDetallesEstacionDatoAusente01UITest</w:t>
-            </w:r>
-          </w:p>
-          <w:p/>
-        </w:tc>
-        <w:tc>
-          <w:tcPr>
-            <w:tcW w:w="1132" w:type="dxa"/>
-          </w:tcPr>
-          <w:p>
-            <w:r>
-              <w:t>Prueba 01. Datos ausentes</w:t>
-            </w:r>
-          </w:p>
-        </w:tc>
-        <w:tc>
-          <w:tcPr>
-            <w:tcW w:w="1087" w:type="dxa"/>
-          </w:tcPr>
-          <w:p>
-            <w:r>
-              <w:t>Éxito (PASS)</w:t>
-            </w:r>
-          </w:p>
-        </w:tc>
-        <w:tc>
-          <w:tcPr>
-            <w:tcW w:w="1199" w:type="dxa"/>
-          </w:tcPr>
-          <w:p>
-            <w:r>
-              <w:t>Éxito (PASS)</w:t>
-            </w:r>
-          </w:p>
-        </w:tc>
-      </w:tr>
-    </w:tbl>
-    <w:p/>
-    <w:p>
-      <w:r>
-        <w:rPr>
-          <w:b/>
-          <w:bCs/>
-        </w:rPr>
-        <w:t>Ejecución de Pruebas de Integración (IT-01 e IT-02):</w:t>
-      </w:r>
-      <w:r>
-        <w:t xml:space="preserve"> Durante la primera ejecución de StationDetailsViewITest, los casos de prueba IT-01 (datos ausentes) e IT-02 (datos anómalos) resultaron fallidos. En IT-01, al configurar el Mock de Station para devolver null en atributos numéricos (</w:t>
-      </w:r>
-      <w:r>
-        <w:t xml:space="preserve">hora, </w:t>
-      </w:r>
-      <w:r>
-        <w:t>bicicletas disponibles y huecos libres), se producía un error (NullPointerException) debido a que el modelo Station utilizaba tipos de datos primitivos (double e int) que no admiten valores nulos. Asimismo, en IT-02, las condiciones de validación en StationDetailsView.onCreate() no filtraban correctamente la totalidad de los rangos anómalos (valores negativos o fuera de coordenadas geográficas), mostrando el valor erróneo en lugar del guion ("-").</w:t>
-      </w:r>
-    </w:p>
-    <w:p>
-      <w:r>
-        <w:rPr>
-          <w:b/>
-          <w:bCs/>
-        </w:rPr>
-        <w:t>Ejecución de Pruebas Unitarias (RedDetailsPresenterTest):</w:t>
-      </w:r>
-      <w:r>
-        <w:t xml:space="preserve"> En la ejecución de los casos UT-01, UT-02 y UT-03 del método init() de los detalles de la red no se detectaron fallos, cumpliendo la cobertura de caminos prevista a la primera.</w:t>
+        <w:t xml:space="preserve">Los resultados de las pruebas de integración nos han dado a conocer que había un error en los tipos de datos, los tipos de datos que teníamos no aceptaban nulos al ser primitivos por ello debimos de cambiar aquellos tipos de datos como los </w:t>
+      </w:r>
+      <w:proofErr w:type="spellStart"/>
+      <w:r>
+        <w:t>double</w:t>
+      </w:r>
+      <w:proofErr w:type="spellEnd"/>
+      <w:r>
+        <w:t xml:space="preserve"> a Double para que pudiesen aceptar nulos.</w:t>
+      </w:r>
+    </w:p>
+    <w:p>
+      <w:pPr>
+        <w:spacing w:after="120"/>
+        <w:jc w:val="both"/>
+      </w:pPr>
+      <w:r>
+        <w:t xml:space="preserve">En la resolución de las pruebas de unitarias del método </w:t>
+      </w:r>
+      <w:proofErr w:type="spellStart"/>
+      <w:r>
+        <w:t>init</w:t>
+      </w:r>
+      <w:proofErr w:type="spellEnd"/>
+      <w:r>
+        <w:t xml:space="preserve">() de los detalles de la red no encontramos fallos </w:t>
       </w:r>
     </w:p>
     <w:p>
@@ -2365,16 +2052,66 @@
           <w:bCs/>
           <w:u w:val="single"/>
         </w:rPr>
-        <w:t>(RedDetailsPresenter)</w:t>
-      </w:r>
-    </w:p>
-    <w:p>
-      <w:pPr>
-        <w:spacing w:after="120"/>
-        <w:jc w:val="both"/>
-      </w:pPr>
-      <w:r>
-        <w:t>Dado que el método init() del RedDetailsPresenter delega en métodos estáticos para comprobar la conectividad y la ubicación, se especifican a continuación las pruebas unitarias siguiendo técnicas de caja blanca (cobertura de caminos) y aislando sus dependencias estáticas mediante Mocks (Mockito).</w:t>
+        <w:t>(</w:t>
+      </w:r>
+      <w:proofErr w:type="spellStart"/>
+      <w:r>
+        <w:rPr>
+          <w:b/>
+          <w:bCs/>
+          <w:u w:val="single"/>
+        </w:rPr>
+        <w:t>RedDetailsPresenter</w:t>
+      </w:r>
+      <w:proofErr w:type="spellEnd"/>
+      <w:r>
+        <w:rPr>
+          <w:b/>
+          <w:bCs/>
+          <w:u w:val="single"/>
+        </w:rPr>
+        <w:t>)</w:t>
+      </w:r>
+    </w:p>
+    <w:p>
+      <w:pPr>
+        <w:spacing w:after="120"/>
+        <w:jc w:val="both"/>
+      </w:pPr>
+      <w:r>
+        <w:t xml:space="preserve">Dado que el método </w:t>
+      </w:r>
+      <w:proofErr w:type="spellStart"/>
+      <w:r>
+        <w:t>init</w:t>
+      </w:r>
+      <w:proofErr w:type="spellEnd"/>
+      <w:r>
+        <w:t xml:space="preserve">() del </w:t>
+      </w:r>
+      <w:proofErr w:type="spellStart"/>
+      <w:r>
+        <w:t>RedDetailsPresenter</w:t>
+      </w:r>
+      <w:proofErr w:type="spellEnd"/>
+      <w:r>
+        <w:t xml:space="preserve"> delega en métodos estáticos para comprobar la conectividad y la ubicación, se especifican a continuación las pruebas unitarias siguiendo técnicas de caja blanca (cobertura de caminos) y aislando sus dependencias estáticas mediante </w:t>
+      </w:r>
+      <w:proofErr w:type="spellStart"/>
+      <w:r>
+        <w:t>Mocks</w:t>
+      </w:r>
+      <w:proofErr w:type="spellEnd"/>
+      <w:r>
+        <w:t xml:space="preserve"> (</w:t>
+      </w:r>
+      <w:proofErr w:type="spellStart"/>
+      <w:r>
+        <w:t>Mockito</w:t>
+      </w:r>
+      <w:proofErr w:type="spellEnd"/>
+      <w:r>
+        <w:t>).</w:t>
       </w:r>
     </w:p>
     <w:p>
@@ -2404,7 +2141,23 @@
           <w:b/>
           <w:bCs/>
         </w:rPr>
-        <w:t>Conexión a Red (Utils.isNetworkAvailable):</w:t>
+        <w:t>Conexión a Red (</w:t>
+      </w:r>
+      <w:proofErr w:type="spellStart"/>
+      <w:r>
+        <w:rPr>
+          <w:b/>
+          <w:bCs/>
+        </w:rPr>
+        <w:t>Utils.isNetworkAvailable</w:t>
+      </w:r>
+      <w:proofErr w:type="spellEnd"/>
+      <w:r>
+        <w:rPr>
+          <w:b/>
+          <w:bCs/>
+        </w:rPr>
+        <w:t>):</w:t>
       </w:r>
     </w:p>
     <w:p>
@@ -2461,8 +2214,23 @@
           <w:b/>
           <w:bCs/>
         </w:rPr>
-        <w:lastRenderedPageBreak/>
-        <w:t>Ubicación (Utils.isLocationEnabled):</w:t>
+        <w:t>Ubicación (</w:t>
+      </w:r>
+      <w:proofErr w:type="spellStart"/>
+      <w:r>
+        <w:rPr>
+          <w:b/>
+          <w:bCs/>
+        </w:rPr>
+        <w:t>Utils.isLocationEnabled</w:t>
+      </w:r>
+      <w:proofErr w:type="spellEnd"/>
+      <w:r>
+        <w:rPr>
+          <w:b/>
+          <w:bCs/>
+        </w:rPr>
+        <w:t>):</w:t>
       </w:r>
     </w:p>
     <w:p>
@@ -2593,8 +2361,13 @@
               <w:spacing w:after="120"/>
               <w:jc w:val="both"/>
             </w:pPr>
-            <w:r>
-              <w:t>NetworkAvailable = true</w:t>
+            <w:proofErr w:type="spellStart"/>
+            <w:r>
+              <w:t>NetworkAvailable</w:t>
+            </w:r>
+            <w:proofErr w:type="spellEnd"/>
+            <w:r>
+              <w:t xml:space="preserve"> = true</w:t>
             </w:r>
           </w:p>
           <w:p>
@@ -2602,8 +2375,13 @@
               <w:spacing w:after="120"/>
               <w:jc w:val="both"/>
             </w:pPr>
-            <w:r>
-              <w:t>LocationAvailable = true</w:t>
+            <w:proofErr w:type="spellStart"/>
+            <w:r>
+              <w:t>LocationAvailable</w:t>
+            </w:r>
+            <w:proofErr w:type="spellEnd"/>
+            <w:r>
+              <w:t xml:space="preserve"> = true</w:t>
             </w:r>
           </w:p>
         </w:tc>
@@ -2617,10 +2395,27 @@
               <w:jc w:val="both"/>
             </w:pPr>
             <w:r>
-              <w:t>Se debe invocar view.init() y ejecutar el método interno de carga llamando a repository.requestNetwork(). No se debe invocar ningún mensaje de erro</w:t>
-            </w:r>
-            <w:r>
-              <w:t>r.</w:t>
+              <w:t xml:space="preserve">Se debe invocar </w:t>
+            </w:r>
+            <w:proofErr w:type="spellStart"/>
+            <w:r>
+              <w:t>view.init</w:t>
+            </w:r>
+            <w:proofErr w:type="spellEnd"/>
+            <w:r>
+              <w:t xml:space="preserve">() y ejecutar el método interno de carga llamando a </w:t>
+            </w:r>
+            <w:proofErr w:type="spellStart"/>
+            <w:r>
+              <w:t>repository.requestNetwork</w:t>
+            </w:r>
+            <w:proofErr w:type="spellEnd"/>
+            <w:r>
+              <w:t xml:space="preserve">(). </w:t>
+            </w:r>
+            <w:r>
+              <w:lastRenderedPageBreak/>
+              <w:t>No se debe invocar ningún mensaje de erro</w:t>
             </w:r>
           </w:p>
         </w:tc>
@@ -2636,6 +2431,7 @@
               <w:jc w:val="both"/>
             </w:pPr>
             <w:r>
+              <w:lastRenderedPageBreak/>
               <w:t>UT-02</w:t>
             </w:r>
           </w:p>
@@ -2649,8 +2445,13 @@
               <w:spacing w:after="120"/>
               <w:jc w:val="both"/>
             </w:pPr>
-            <w:r>
-              <w:t>NetworkAvailable = true</w:t>
+            <w:proofErr w:type="spellStart"/>
+            <w:r>
+              <w:t>NetworkAvailable</w:t>
+            </w:r>
+            <w:proofErr w:type="spellEnd"/>
+            <w:r>
+              <w:t xml:space="preserve"> = true</w:t>
             </w:r>
           </w:p>
           <w:p>
@@ -2658,8 +2459,13 @@
               <w:spacing w:after="120"/>
               <w:jc w:val="both"/>
             </w:pPr>
-            <w:r>
-              <w:t xml:space="preserve">LocationAvailable = </w:t>
+            <w:proofErr w:type="spellStart"/>
+            <w:r>
+              <w:t>LocationAvailable</w:t>
+            </w:r>
+            <w:proofErr w:type="spellEnd"/>
+            <w:r>
+              <w:t xml:space="preserve"> = </w:t>
             </w:r>
             <w:r>
               <w:t>false</w:t>
@@ -2676,10 +2482,34 @@
               <w:jc w:val="both"/>
             </w:pPr>
             <w:r>
-              <w:t xml:space="preserve">Se invoca view.init() y detecta la falta de GPS invocando view.showLocationError().  </w:t>
-            </w:r>
-            <w:r>
-              <w:t>Posteriormente, continúa el flujo y ejecuta repository.requestNetwork().</w:t>
+              <w:t xml:space="preserve">Se invoca </w:t>
+            </w:r>
+            <w:proofErr w:type="spellStart"/>
+            <w:r>
+              <w:t>view.init</w:t>
+            </w:r>
+            <w:proofErr w:type="spellEnd"/>
+            <w:r>
+              <w:t xml:space="preserve">() y detecta la falta de GPS invocando </w:t>
+            </w:r>
+            <w:proofErr w:type="spellStart"/>
+            <w:r>
+              <w:t>view.showLocationError</w:t>
+            </w:r>
+            <w:proofErr w:type="spellEnd"/>
+            <w:r>
+              <w:t xml:space="preserve">().  </w:t>
+            </w:r>
+            <w:r>
+              <w:t xml:space="preserve">Posteriormente, continúa el flujo y ejecuta </w:t>
+            </w:r>
+            <w:proofErr w:type="spellStart"/>
+            <w:r>
+              <w:t>repository.requestNetwork</w:t>
+            </w:r>
+            <w:proofErr w:type="spellEnd"/>
+            <w:r>
+              <w:t>().</w:t>
             </w:r>
           </w:p>
         </w:tc>
@@ -2708,8 +2538,13 @@
               <w:spacing w:after="120"/>
               <w:jc w:val="both"/>
             </w:pPr>
-            <w:r>
-              <w:t>NetworkAvailable = false</w:t>
+            <w:proofErr w:type="spellStart"/>
+            <w:r>
+              <w:t>NetworkAvailable</w:t>
+            </w:r>
+            <w:proofErr w:type="spellEnd"/>
+            <w:r>
+              <w:t xml:space="preserve"> = false</w:t>
             </w:r>
           </w:p>
           <w:p>
@@ -2717,8 +2552,13 @@
               <w:spacing w:after="120"/>
               <w:jc w:val="both"/>
             </w:pPr>
-            <w:r>
-              <w:t>LocationEnabled = (No se evalúa)</w:t>
+            <w:proofErr w:type="spellStart"/>
+            <w:r>
+              <w:t>LocationEnabled</w:t>
+            </w:r>
+            <w:proofErr w:type="spellEnd"/>
+            <w:r>
+              <w:t xml:space="preserve"> = (No se evalúa)</w:t>
             </w:r>
           </w:p>
           <w:p>
@@ -2738,7 +2578,23 @@
               <w:jc w:val="both"/>
             </w:pPr>
             <w:r>
-              <w:t xml:space="preserve">La lógica invoca view.init() y detecta la falta de conexión, invocando view.showRedError(). La ejecución se detiene y </w:t>
+              <w:t xml:space="preserve">La lógica invoca </w:t>
+            </w:r>
+            <w:proofErr w:type="spellStart"/>
+            <w:r>
+              <w:t>view.init</w:t>
+            </w:r>
+            <w:proofErr w:type="spellEnd"/>
+            <w:r>
+              <w:t xml:space="preserve">() y detecta la falta de conexión, invocando </w:t>
+            </w:r>
+            <w:proofErr w:type="spellStart"/>
+            <w:r>
+              <w:t>view.showRedError</w:t>
+            </w:r>
+            <w:proofErr w:type="spellEnd"/>
+            <w:r>
+              <w:t xml:space="preserve">(). La ejecución se detiene y </w:t>
             </w:r>
             <w:r>
               <w:rPr>
@@ -2748,7 +2604,15 @@
               <w:t>nunca</w:t>
             </w:r>
             <w:r>
-              <w:t xml:space="preserve"> se llama a repository.requestNetwork().</w:t>
+              <w:t xml:space="preserve"> se llama a </w:t>
+            </w:r>
+            <w:proofErr w:type="spellStart"/>
+            <w:r>
+              <w:t>repository.requestNetwork</w:t>
+            </w:r>
+            <w:proofErr w:type="spellEnd"/>
+            <w:r>
+              <w:t>().</w:t>
             </w:r>
           </w:p>
         </w:tc>
@@ -4491,119 +4355,6 @@
     </w:lvl>
   </w:abstractNum>
   <w:abstractNum w:abstractNumId="11" w15:restartNumberingAfterBreak="0">
-    <w:nsid w:val="3B555AFA"/>
-    <w:multiLevelType w:val="multilevel"/>
-    <w:tmpl w:val="E6DADBDE"/>
-    <w:lvl w:ilvl="0">
-      <w:start w:val="1"/>
-      <w:numFmt w:val="decimal"/>
-      <w:lvlText w:val="%1."/>
-      <w:lvlJc w:val="left"/>
-      <w:pPr>
-        <w:tabs>
-          <w:tab w:val="num" w:pos="720"/>
-        </w:tabs>
-        <w:ind w:left="720" w:hanging="360"/>
-      </w:pPr>
-    </w:lvl>
-    <w:lvl w:ilvl="1" w:tentative="1">
-      <w:start w:val="1"/>
-      <w:numFmt w:val="decimal"/>
-      <w:lvlText w:val="%2."/>
-      <w:lvlJc w:val="left"/>
-      <w:pPr>
-        <w:tabs>
-          <w:tab w:val="num" w:pos="1440"/>
-        </w:tabs>
-        <w:ind w:left="1440" w:hanging="360"/>
-      </w:pPr>
-    </w:lvl>
-    <w:lvl w:ilvl="2" w:tentative="1">
-      <w:start w:val="1"/>
-      <w:numFmt w:val="decimal"/>
-      <w:lvlText w:val="%3."/>
-      <w:lvlJc w:val="left"/>
-      <w:pPr>
-        <w:tabs>
-          <w:tab w:val="num" w:pos="2160"/>
-        </w:tabs>
-        <w:ind w:left="2160" w:hanging="360"/>
-      </w:pPr>
-    </w:lvl>
-    <w:lvl w:ilvl="3" w:tentative="1">
-      <w:start w:val="1"/>
-      <w:numFmt w:val="decimal"/>
-      <w:lvlText w:val="%4."/>
-      <w:lvlJc w:val="left"/>
-      <w:pPr>
-        <w:tabs>
-          <w:tab w:val="num" w:pos="2880"/>
-        </w:tabs>
-        <w:ind w:left="2880" w:hanging="360"/>
-      </w:pPr>
-    </w:lvl>
-    <w:lvl w:ilvl="4" w:tentative="1">
-      <w:start w:val="1"/>
-      <w:numFmt w:val="decimal"/>
-      <w:lvlText w:val="%5."/>
-      <w:lvlJc w:val="left"/>
-      <w:pPr>
-        <w:tabs>
-          <w:tab w:val="num" w:pos="3600"/>
-        </w:tabs>
-        <w:ind w:left="3600" w:hanging="360"/>
-      </w:pPr>
-    </w:lvl>
-    <w:lvl w:ilvl="5" w:tentative="1">
-      <w:start w:val="1"/>
-      <w:numFmt w:val="decimal"/>
-      <w:lvlText w:val="%6."/>
-      <w:lvlJc w:val="left"/>
-      <w:pPr>
-        <w:tabs>
-          <w:tab w:val="num" w:pos="4320"/>
-        </w:tabs>
-        <w:ind w:left="4320" w:hanging="360"/>
-      </w:pPr>
-    </w:lvl>
-    <w:lvl w:ilvl="6" w:tentative="1">
-      <w:start w:val="1"/>
-      <w:numFmt w:val="decimal"/>
-      <w:lvlText w:val="%7."/>
-      <w:lvlJc w:val="left"/>
-      <w:pPr>
-        <w:tabs>
-          <w:tab w:val="num" w:pos="5040"/>
-        </w:tabs>
-        <w:ind w:left="5040" w:hanging="360"/>
-      </w:pPr>
-    </w:lvl>
-    <w:lvl w:ilvl="7" w:tentative="1">
-      <w:start w:val="1"/>
-      <w:numFmt w:val="decimal"/>
-      <w:lvlText w:val="%8."/>
-      <w:lvlJc w:val="left"/>
-      <w:pPr>
-        <w:tabs>
-          <w:tab w:val="num" w:pos="5760"/>
-        </w:tabs>
-        <w:ind w:left="5760" w:hanging="360"/>
-      </w:pPr>
-    </w:lvl>
-    <w:lvl w:ilvl="8" w:tentative="1">
-      <w:start w:val="1"/>
-      <w:numFmt w:val="decimal"/>
-      <w:lvlText w:val="%9."/>
-      <w:lvlJc w:val="left"/>
-      <w:pPr>
-        <w:tabs>
-          <w:tab w:val="num" w:pos="6480"/>
-        </w:tabs>
-        <w:ind w:left="6480" w:hanging="360"/>
-      </w:pPr>
-    </w:lvl>
-  </w:abstractNum>
-  <w:abstractNum w:abstractNumId="12" w15:restartNumberingAfterBreak="0">
     <w:nsid w:val="3D44168C"/>
     <w:multiLevelType w:val="hybridMultilevel"/>
     <w:tmpl w:val="E938914C"/>
@@ -4692,7 +4443,7 @@
       </w:pPr>
     </w:lvl>
   </w:abstractNum>
-  <w:abstractNum w:abstractNumId="13" w15:restartNumberingAfterBreak="0">
+  <w:abstractNum w:abstractNumId="12" w15:restartNumberingAfterBreak="0">
     <w:nsid w:val="3E050527"/>
     <w:multiLevelType w:val="multilevel"/>
     <w:tmpl w:val="A4D867E4"/>
@@ -4805,156 +4556,7 @@
       </w:pPr>
     </w:lvl>
   </w:abstractNum>
-  <w:abstractNum w:abstractNumId="14" w15:restartNumberingAfterBreak="0">
-    <w:nsid w:val="40123CF5"/>
-    <w:multiLevelType w:val="multilevel"/>
-    <w:tmpl w:val="981ABCF6"/>
-    <w:lvl w:ilvl="0">
-      <w:start w:val="1"/>
-      <w:numFmt w:val="bullet"/>
-      <w:lvlText w:val=""/>
-      <w:lvlJc w:val="left"/>
-      <w:pPr>
-        <w:tabs>
-          <w:tab w:val="num" w:pos="720"/>
-        </w:tabs>
-        <w:ind w:left="720" w:hanging="360"/>
-      </w:pPr>
-      <w:rPr>
-        <w:rFonts w:ascii="Symbol" w:hAnsi="Symbol" w:hint="default"/>
-        <w:sz w:val="20"/>
-      </w:rPr>
-    </w:lvl>
-    <w:lvl w:ilvl="1" w:tentative="1">
-      <w:start w:val="1"/>
-      <w:numFmt w:val="bullet"/>
-      <w:lvlText w:val="o"/>
-      <w:lvlJc w:val="left"/>
-      <w:pPr>
-        <w:tabs>
-          <w:tab w:val="num" w:pos="1440"/>
-        </w:tabs>
-        <w:ind w:left="1440" w:hanging="360"/>
-      </w:pPr>
-      <w:rPr>
-        <w:rFonts w:ascii="Courier New" w:hAnsi="Courier New" w:hint="default"/>
-        <w:sz w:val="20"/>
-      </w:rPr>
-    </w:lvl>
-    <w:lvl w:ilvl="2" w:tentative="1">
-      <w:start w:val="1"/>
-      <w:numFmt w:val="bullet"/>
-      <w:lvlText w:val=""/>
-      <w:lvlJc w:val="left"/>
-      <w:pPr>
-        <w:tabs>
-          <w:tab w:val="num" w:pos="2160"/>
-        </w:tabs>
-        <w:ind w:left="2160" w:hanging="360"/>
-      </w:pPr>
-      <w:rPr>
-        <w:rFonts w:ascii="Wingdings" w:hAnsi="Wingdings" w:hint="default"/>
-        <w:sz w:val="20"/>
-      </w:rPr>
-    </w:lvl>
-    <w:lvl w:ilvl="3" w:tentative="1">
-      <w:start w:val="1"/>
-      <w:numFmt w:val="bullet"/>
-      <w:lvlText w:val=""/>
-      <w:lvlJc w:val="left"/>
-      <w:pPr>
-        <w:tabs>
-          <w:tab w:val="num" w:pos="2880"/>
-        </w:tabs>
-        <w:ind w:left="2880" w:hanging="360"/>
-      </w:pPr>
-      <w:rPr>
-        <w:rFonts w:ascii="Wingdings" w:hAnsi="Wingdings" w:hint="default"/>
-        <w:sz w:val="20"/>
-      </w:rPr>
-    </w:lvl>
-    <w:lvl w:ilvl="4" w:tentative="1">
-      <w:start w:val="1"/>
-      <w:numFmt w:val="bullet"/>
-      <w:lvlText w:val=""/>
-      <w:lvlJc w:val="left"/>
-      <w:pPr>
-        <w:tabs>
-          <w:tab w:val="num" w:pos="3600"/>
-        </w:tabs>
-        <w:ind w:left="3600" w:hanging="360"/>
-      </w:pPr>
-      <w:rPr>
-        <w:rFonts w:ascii="Wingdings" w:hAnsi="Wingdings" w:hint="default"/>
-        <w:sz w:val="20"/>
-      </w:rPr>
-    </w:lvl>
-    <w:lvl w:ilvl="5" w:tentative="1">
-      <w:start w:val="1"/>
-      <w:numFmt w:val="bullet"/>
-      <w:lvlText w:val=""/>
-      <w:lvlJc w:val="left"/>
-      <w:pPr>
-        <w:tabs>
-          <w:tab w:val="num" w:pos="4320"/>
-        </w:tabs>
-        <w:ind w:left="4320" w:hanging="360"/>
-      </w:pPr>
-      <w:rPr>
-        <w:rFonts w:ascii="Wingdings" w:hAnsi="Wingdings" w:hint="default"/>
-        <w:sz w:val="20"/>
-      </w:rPr>
-    </w:lvl>
-    <w:lvl w:ilvl="6" w:tentative="1">
-      <w:start w:val="1"/>
-      <w:numFmt w:val="bullet"/>
-      <w:lvlText w:val=""/>
-      <w:lvlJc w:val="left"/>
-      <w:pPr>
-        <w:tabs>
-          <w:tab w:val="num" w:pos="5040"/>
-        </w:tabs>
-        <w:ind w:left="5040" w:hanging="360"/>
-      </w:pPr>
-      <w:rPr>
-        <w:rFonts w:ascii="Wingdings" w:hAnsi="Wingdings" w:hint="default"/>
-        <w:sz w:val="20"/>
-      </w:rPr>
-    </w:lvl>
-    <w:lvl w:ilvl="7" w:tentative="1">
-      <w:start w:val="1"/>
-      <w:numFmt w:val="bullet"/>
-      <w:lvlText w:val=""/>
-      <w:lvlJc w:val="left"/>
-      <w:pPr>
-        <w:tabs>
-          <w:tab w:val="num" w:pos="5760"/>
-        </w:tabs>
-        <w:ind w:left="5760" w:hanging="360"/>
-      </w:pPr>
-      <w:rPr>
-        <w:rFonts w:ascii="Wingdings" w:hAnsi="Wingdings" w:hint="default"/>
-        <w:sz w:val="20"/>
-      </w:rPr>
-    </w:lvl>
-    <w:lvl w:ilvl="8" w:tentative="1">
-      <w:start w:val="1"/>
-      <w:numFmt w:val="bullet"/>
-      <w:lvlText w:val=""/>
-      <w:lvlJc w:val="left"/>
-      <w:pPr>
-        <w:tabs>
-          <w:tab w:val="num" w:pos="6480"/>
-        </w:tabs>
-        <w:ind w:left="6480" w:hanging="360"/>
-      </w:pPr>
-      <w:rPr>
-        <w:rFonts w:ascii="Wingdings" w:hAnsi="Wingdings" w:hint="default"/>
-        <w:sz w:val="20"/>
-      </w:rPr>
-    </w:lvl>
-  </w:abstractNum>
-  <w:abstractNum w:abstractNumId="15" w15:restartNumberingAfterBreak="0">
+  <w:abstractNum w:abstractNumId="13" w15:restartNumberingAfterBreak="0">
     <w:nsid w:val="42F27314"/>
     <w:multiLevelType w:val="multilevel"/>
     <w:tmpl w:val="9A925B30"/>
@@ -5067,7 +4669,7 @@
       </w:pPr>
     </w:lvl>
   </w:abstractNum>
-  <w:abstractNum w:abstractNumId="16" w15:restartNumberingAfterBreak="0">
+  <w:abstractNum w:abstractNumId="14" w15:restartNumberingAfterBreak="0">
     <w:nsid w:val="4554665C"/>
     <w:multiLevelType w:val="hybridMultilevel"/>
     <w:tmpl w:val="9530D958"/>
@@ -5156,7 +4758,7 @@
       </w:pPr>
     </w:lvl>
   </w:abstractNum>
-  <w:abstractNum w:abstractNumId="17" w15:restartNumberingAfterBreak="0">
+  <w:abstractNum w:abstractNumId="15" w15:restartNumberingAfterBreak="0">
     <w:nsid w:val="46F27228"/>
     <w:multiLevelType w:val="multilevel"/>
     <w:tmpl w:val="DA080848"/>
@@ -5269,7 +4871,7 @@
       </w:pPr>
     </w:lvl>
   </w:abstractNum>
-  <w:abstractNum w:abstractNumId="18" w15:restartNumberingAfterBreak="0">
+  <w:abstractNum w:abstractNumId="16" w15:restartNumberingAfterBreak="0">
     <w:nsid w:val="4AF72EF0"/>
     <w:multiLevelType w:val="multilevel"/>
     <w:tmpl w:val="BF1C2792"/>
@@ -5382,7 +4984,7 @@
       </w:pPr>
     </w:lvl>
   </w:abstractNum>
-  <w:abstractNum w:abstractNumId="19" w15:restartNumberingAfterBreak="0">
+  <w:abstractNum w:abstractNumId="17" w15:restartNumberingAfterBreak="0">
     <w:nsid w:val="57356332"/>
     <w:multiLevelType w:val="multilevel"/>
     <w:tmpl w:val="809C590E"/>
@@ -5531,7 +5133,7 @@
       </w:rPr>
     </w:lvl>
   </w:abstractNum>
-  <w:abstractNum w:abstractNumId="20" w15:restartNumberingAfterBreak="0">
+  <w:abstractNum w:abstractNumId="18" w15:restartNumberingAfterBreak="0">
     <w:nsid w:val="5A5C530C"/>
     <w:multiLevelType w:val="multilevel"/>
     <w:tmpl w:val="725A7746"/>
@@ -5644,7 +5246,7 @@
       </w:pPr>
     </w:lvl>
   </w:abstractNum>
-  <w:abstractNum w:abstractNumId="21" w15:restartNumberingAfterBreak="0">
+  <w:abstractNum w:abstractNumId="19" w15:restartNumberingAfterBreak="0">
     <w:nsid w:val="657F0833"/>
     <w:multiLevelType w:val="multilevel"/>
     <w:tmpl w:val="812E69B8"/>
@@ -5793,7 +5395,7 @@
       </w:rPr>
     </w:lvl>
   </w:abstractNum>
-  <w:abstractNum w:abstractNumId="22" w15:restartNumberingAfterBreak="0">
+  <w:abstractNum w:abstractNumId="20" w15:restartNumberingAfterBreak="0">
     <w:nsid w:val="682240AC"/>
     <w:multiLevelType w:val="multilevel"/>
     <w:tmpl w:val="9A925B30"/>
@@ -5906,7 +5508,7 @@
       </w:pPr>
     </w:lvl>
   </w:abstractNum>
-  <w:abstractNum w:abstractNumId="23" w15:restartNumberingAfterBreak="0">
+  <w:abstractNum w:abstractNumId="21" w15:restartNumberingAfterBreak="0">
     <w:nsid w:val="74DF63E0"/>
     <w:multiLevelType w:val="multilevel"/>
     <w:tmpl w:val="A11AF2EE"/>
@@ -6019,7 +5621,7 @@
       </w:pPr>
     </w:lvl>
   </w:abstractNum>
-  <w:abstractNum w:abstractNumId="24" w15:restartNumberingAfterBreak="0">
+  <w:abstractNum w:abstractNumId="22" w15:restartNumberingAfterBreak="0">
     <w:nsid w:val="75A50A45"/>
     <w:multiLevelType w:val="multilevel"/>
     <w:tmpl w:val="66D8D8FC"/>
@@ -6168,7 +5770,7 @@
       </w:rPr>
     </w:lvl>
   </w:abstractNum>
-  <w:abstractNum w:abstractNumId="25" w15:restartNumberingAfterBreak="0">
+  <w:abstractNum w:abstractNumId="23" w15:restartNumberingAfterBreak="0">
     <w:nsid w:val="77A67E4B"/>
     <w:multiLevelType w:val="hybridMultilevel"/>
     <w:tmpl w:val="7E388D94"/>
@@ -6281,7 +5883,7 @@
       </w:rPr>
     </w:lvl>
   </w:abstractNum>
-  <w:abstractNum w:abstractNumId="26" w15:restartNumberingAfterBreak="0">
+  <w:abstractNum w:abstractNumId="24" w15:restartNumberingAfterBreak="0">
     <w:nsid w:val="797F59BE"/>
     <w:multiLevelType w:val="multilevel"/>
     <w:tmpl w:val="BF1C2792"/>
@@ -6395,13 +5997,13 @@
     </w:lvl>
   </w:abstractNum>
   <w:num w:numId="1" w16cid:durableId="101069171">
-    <w:abstractNumId w:val="25"/>
+    <w:abstractNumId w:val="23"/>
   </w:num>
   <w:num w:numId="2" w16cid:durableId="1786266961">
-    <w:abstractNumId w:val="12"/>
+    <w:abstractNumId w:val="11"/>
   </w:num>
   <w:num w:numId="3" w16cid:durableId="149911408">
-    <w:abstractNumId w:val="16"/>
+    <w:abstractNumId w:val="14"/>
   </w:num>
   <w:num w:numId="4" w16cid:durableId="1362392822">
     <w:abstractNumId w:val="2"/>
@@ -6413,7 +6015,7 @@
     <w:abstractNumId w:val="9"/>
   </w:num>
   <w:num w:numId="7" w16cid:durableId="179005006">
-    <w:abstractNumId w:val="20"/>
+    <w:abstractNumId w:val="18"/>
   </w:num>
   <w:num w:numId="8" w16cid:durableId="192427632">
     <w:abstractNumId w:val="0"/>
@@ -6422,58 +6024,52 @@
     <w:abstractNumId w:val="3"/>
   </w:num>
   <w:num w:numId="10" w16cid:durableId="1473521700">
-    <w:abstractNumId w:val="22"/>
+    <w:abstractNumId w:val="20"/>
   </w:num>
   <w:num w:numId="11" w16cid:durableId="2043509950">
     <w:abstractNumId w:val="7"/>
   </w:num>
   <w:num w:numId="12" w16cid:durableId="1002396041">
-    <w:abstractNumId w:val="18"/>
+    <w:abstractNumId w:val="16"/>
   </w:num>
   <w:num w:numId="13" w16cid:durableId="1718354045">
     <w:abstractNumId w:val="10"/>
   </w:num>
   <w:num w:numId="14" w16cid:durableId="1499031107">
-    <w:abstractNumId w:val="23"/>
+    <w:abstractNumId w:val="21"/>
   </w:num>
   <w:num w:numId="15" w16cid:durableId="1244684611">
+    <w:abstractNumId w:val="12"/>
+  </w:num>
+  <w:num w:numId="16" w16cid:durableId="337344084">
     <w:abstractNumId w:val="13"/>
   </w:num>
-  <w:num w:numId="16" w16cid:durableId="337344084">
+  <w:num w:numId="17" w16cid:durableId="663365070">
     <w:abstractNumId w:val="15"/>
-  </w:num>
-  <w:num w:numId="17" w16cid:durableId="663365070">
-    <w:abstractNumId w:val="17"/>
   </w:num>
   <w:num w:numId="18" w16cid:durableId="1671444411">
     <w:abstractNumId w:val="8"/>
   </w:num>
   <w:num w:numId="19" w16cid:durableId="314184064">
-    <w:abstractNumId w:val="26"/>
+    <w:abstractNumId w:val="24"/>
   </w:num>
   <w:num w:numId="20" w16cid:durableId="519975828">
     <w:abstractNumId w:val="6"/>
   </w:num>
   <w:num w:numId="21" w16cid:durableId="1765613013">
-    <w:abstractNumId w:val="24"/>
+    <w:abstractNumId w:val="22"/>
   </w:num>
   <w:num w:numId="22" w16cid:durableId="1177501438">
     <w:abstractNumId w:val="4"/>
   </w:num>
   <w:num w:numId="23" w16cid:durableId="654530660">
-    <w:abstractNumId w:val="21"/>
+    <w:abstractNumId w:val="19"/>
   </w:num>
   <w:num w:numId="24" w16cid:durableId="1952206721">
-    <w:abstractNumId w:val="19"/>
+    <w:abstractNumId w:val="17"/>
   </w:num>
   <w:num w:numId="25" w16cid:durableId="146554995">
     <w:abstractNumId w:val="5"/>
-  </w:num>
-  <w:num w:numId="26" w16cid:durableId="904530387">
-    <w:abstractNumId w:val="11"/>
-  </w:num>
-  <w:num w:numId="27" w16cid:durableId="1780025232">
-    <w:abstractNumId w:val="14"/>
   </w:num>
   <w:numIdMacAtCleanup w:val="5"/>
 </w:numbering>

</xml_diff>